<commit_message>
Update strength report: 還魂師 ghost-revival round avoids poison and hunger
Co-Authored-By: Claude Sonnet 5.5 <noreply@anthropic.com>
</commit_message>
<xml_diff>
--- a/禁閉逃殺_實體模式16職業強度分析.docx
+++ b/禁閉逃殺_實體模式16職業強度分析.docx
@@ -5729,7 +5729,7 @@
           <w:rFonts w:ascii="微軟正黑體" w:hAnsi="微軟正黑體" w:eastAsia="微軟正黑體"/>
           <w:b/>
         </w:rPr>
-        <w:t>強度 5.5 分（C 級）　生存 4.5／資源 1.5／戰鬥 2／機動 2.5／穩定 3</w:t>
+        <w:t>強度 5.75 分（C 級）　生存 5／資源 1.5／戰鬥 2／機動 2.5／穩定 3</w:t>
       </w:r>
     </w:p>
     <w:p>
@@ -5941,6 +5941,17 @@
         <w:rPr>
           <w:rFonts w:ascii="微軟正黑體" w:hAnsi="微軟正黑體" w:eastAsia="微軟正黑體"/>
         </w:rPr>
+        <w:t>暗影階段不受傷害：暗影不是存活玩家，毒氣、飢餓、戰鬥、火箭筒都不會對他生效；而暗影吸血與復活排在結算的毒氣、飢餓之後，所以「暗影復活的那一輪」他不用繳水糧、也不怕毒氣，復活後直接帶著 3 血進入下一輪（第6輪復活則以 3 血計入最終排名，完全避開第6輪最高的毒氣4點與飢餓2點）。這與安魂儀式不同：安魂儀式是在戰鬥中途復活，之後的毒氣與飢餓仍然生效。</w:t>
+      </w:r>
+    </w:p>
+    <w:p>
+      <w:pPr>
+        <w:pStyle w:val="ListBullet"/>
+      </w:pPr>
+      <w:r>
+        <w:rPr>
+          <w:rFonts w:ascii="微軟正黑體" w:hAnsi="微軟正黑體" w:eastAsia="微軟正黑體"/>
+        </w:rPr>
         <w:t>最多 3 次復活機會：1次安魂（5血）＋2次祝禱（3血）；第6輪死亡不會觸發安魂，但暗影吸血仍可在第6輪結算時復活。</w:t>
       </w:r>
     </w:p>
@@ -5982,7 +5993,7 @@
         <w:rPr>
           <w:rFonts w:ascii="微軟正黑體" w:hAnsi="微軟正黑體" w:eastAsia="微軟正黑體"/>
         </w:rPr>
-        <w:t>全是被動，不需要任何宣告就能在致命時刻救回；在毒氣與飢餓使死亡集中於中後期時最能發揮。</w:t>
+        <w:t>暗影復活當輪完全不吃毒氣與飢餓（暗影階段不受任何傷害），是整局最安全的回血方式之一；全是被動，不需要任何宣告就能在致命時刻救回；在毒氣與飢餓使死亡集中於中後期時最能發揮。</w:t>
       </w:r>
     </w:p>
     <w:p>
@@ -9989,7 +10000,7 @@
                 <w:rFonts w:ascii="微軟正黑體" w:hAnsi="微軟正黑體" w:eastAsia="微軟正黑體"/>
                 <w:sz w:val="18"/>
               </w:rPr>
-              <w:t>4.5</w:t>
+              <w:t>5</w:t>
             </w:r>
           </w:p>
         </w:tc>
@@ -10064,7 +10075,7 @@
                 <w:rFonts w:ascii="微軟正黑體" w:hAnsi="微軟正黑體" w:eastAsia="微軟正黑體"/>
                 <w:sz w:val="18"/>
               </w:rPr>
-              <w:t>5.5</w:t>
+              <w:t>5.75</w:t>
             </w:r>
           </w:p>
         </w:tc>
@@ -11109,7 +11120,7 @@
           <w:rFonts w:ascii="微軟正黑體" w:hAnsi="微軟正黑體" w:eastAsia="微軟正黑體"/>
           <w:b w:val="0"/>
         </w:rPr>
-        <w:t>16 位平均 5.79 分，最高與最低相差 2.50 分。</w:t>
+        <w:t>16 位平均 5.81 分，最高與最低相差 2.50 分。</w:t>
       </w:r>
     </w:p>
     <w:p>

</xml_diff>

<commit_message>
雇傭兵: knife counts as gun (武器精通 2nd sentence); 飲品師: wine exclusion optional; update report
Co-Authored-By: Claude Sonnet 5.5 <noreply@anthropic.com>
</commit_message>
<xml_diff>
--- a/禁閉逃殺_實體模式16職業強度分析.docx
+++ b/禁閉逃殺_實體模式16職業強度分析.docx
@@ -2524,7 +2524,7 @@
           <w:rFonts w:ascii="微軟正黑體" w:hAnsi="微軟正黑體" w:eastAsia="微軟正黑體"/>
           <w:b/>
         </w:rPr>
-        <w:t>強度 7.3 分（A 級）　生存 3.5／資源 3.5／戰鬥 5／機動 2／穩定 3.5</w:t>
+        <w:t>強度 7.75 分（A 級）　生存 4／資源 3.5／戰鬥 5／機動 2／穩定 4</w:t>
       </w:r>
     </w:p>
     <w:p>
@@ -2644,7 +2644,7 @@
                 <w:rFonts w:ascii="微軟正黑體" w:hAnsi="微軟正黑體" w:eastAsia="微軟正黑體"/>
                 <w:sz w:val="18"/>
               </w:rPr>
-              <w:t>所有武器（刀/雙刀/手槍/霰彈槍）不佔負重；火箭筒不算武器，仍佔負重。</w:t>
+              <w:t>所有武器（刀/雙刀/手槍/霰彈槍）不佔負重；火箭筒不算武器，仍佔負重。你的刀與手槍效果相同，武力數值不變。</w:t>
             </w:r>
           </w:p>
         </w:tc>
@@ -2667,7 +2667,7 @@
         <w:rPr>
           <w:rFonts w:ascii="微軟正黑體" w:hAnsi="微軟正黑體" w:eastAsia="微軟正黑體"/>
         </w:rPr>
-        <w:t>戰鬥武力＝基礎武力＋背包內「每一件」武器的加成（刀+2、雙刀+4、手槍+2、霰彈槍+4），沒有數量上限；一般玩家的每件武器都佔 1 格負重，雇傭兵全部不佔。</w:t>
+        <w:t>戰鬥武力＝基礎武力＋背包內「每一件」武器的加成（刀+2、雙刀+4、手槍+2、霰彈槍+4），沒有數量上限；一般玩家的每件武器都佔 1 格負重，雇傭兵全部不佔（武器精通）。</w:t>
       </w:r>
     </w:p>
     <w:p>
@@ -2678,7 +2678,7 @@
         <w:rPr>
           <w:rFonts w:ascii="微軟正黑體" w:hAnsi="微軟正黑體" w:eastAsia="微軟正黑體"/>
         </w:rPr>
-        <w:t>一方持槍（手槍／霰彈槍）、另一方沒槍時，持槍者以自己的「全部武力」扣對方血，自己不受傷（resolveCombat）。三人以上同房時，目標是房內武力最高的持槍者，其餘人各自只和他單獨結算，其他人彼此不互打。</w:t>
+        <w:t>武器精通的第二句「刀與手槍效果相同」：只要背包有「刀」就視同持槍（hasGun），武力數值不變（刀仍是+2）。雙刀不在這條內。持槍者對無槍者以「全部武力」扣血、自己不受傷；雙方都持槍則比武力差。三人以上同房時，目標是房內武力最高的持槍者，其餘人各自只和他單獨結算，其他人彼此不互打。</w:t>
       </w:r>
     </w:p>
     <w:p>
@@ -2689,7 +2689,7 @@
         <w:rPr>
           <w:rFonts w:ascii="微軟正黑體" w:hAnsi="微軟正黑體" w:eastAsia="微軟正黑體"/>
         </w:rPr>
-        <w:t>例：基礎武力3＋霰彈槍4＋手槍2＋刀2＝11，≥10（開局生命），同房的無槍玩家只要沒有腎上腺素、橡膠人等減免，一次戰鬥就會死亡。</w:t>
+        <w:t>所以他不必搶手槍或霰彈槍：全場刀有8把（武器庫5＋大倉庫3），武器庫首位進入者（抽2，刀／手槍／霰彈槍均等）至少拿到 1 把刀的機率約 56%，拿到刀或槍的機率 100%；大倉庫（9種、抽3）拿到刀或槍的機率約 70%。</w:t>
       </w:r>
     </w:p>
     <w:p>
@@ -2700,7 +2700,7 @@
         <w:rPr>
           <w:rFonts w:ascii="微軟正黑體" w:hAnsi="微軟正黑體" w:eastAsia="微軟正黑體"/>
         </w:rPr>
-        <w:t>全場槍只有 6 把（手槍4：武器庫2／大倉庫1／第4輪空投1；霰彈槍2：武器庫1／大倉庫1）。每次抽取是在「庫存還有的道具種類」中均等抽一種，所以武器庫（刀5／手槍2／霰彈槍1，每次抽2）首位進入者至少抽到 1 把槍的機率約 89%（程式邏輯 20 萬次模擬）；大倉庫（9種，抽3）約 54%。</w:t>
+        <w:t>例：基礎武力3＋刀2＋刀2＋霰彈槍4＝11，≥10（開局生命），同房的無槍玩家只要沒有腎上腺素、橡膠人等減免，一次戰鬥就會死亡；單把刀就已經是持槍狀態，基礎武力3＋刀2＝5也能單方面傷害所有無槍者。</w:t>
       </w:r>
     </w:p>
     <w:p>
@@ -2711,7 +2711,7 @@
         <w:rPr>
           <w:rFonts w:ascii="微軟正黑體" w:hAnsi="微軟正黑體" w:eastAsia="微軟正黑體"/>
         </w:rPr>
-        <w:t>武器庫B107與停機坪202（第1輪空投雙刀+4）都離出生點103只有2步。雙刀不算槍。</w:t>
+        <w:t>武器庫B107與停機坪202（第1輪空投雙刀+4）都離出生點103只有2步。</w:t>
       </w:r>
     </w:p>
     <w:p>
@@ -2730,7 +2730,7 @@
         <w:rPr>
           <w:rFonts w:ascii="微軟正黑體" w:hAnsi="微軟正黑體" w:eastAsia="微軟正黑體"/>
         </w:rPr>
-        <w:t>全場唯一能把所有武器零負重帶在身上的職業，背包格可全部留給水、糧、藥片，同時武力堆到別人需要犧牲補給才能達到的高度。</w:t>
+        <w:t>全場唯一能把所有武器零負重帶在身上的職業，背包格可全部留給水、糧、藥片；同時只要有一把刀就能享有「持槍」的單方面輸出，不必和別人搶只有 6 把的真槍。</w:t>
       </w:r>
     </w:p>
     <w:p>
@@ -2752,7 +2752,7 @@
         <w:rPr>
           <w:rFonts w:ascii="微軟正黑體" w:hAnsi="微軟正黑體" w:eastAsia="微軟正黑體"/>
         </w:rPr>
-        <w:t>被動技能，不占用「每輪只能用一次主動技能」的額度，也沒有使用次數。</w:t>
+        <w:t>技能是被動，不占用「每輪只能用一次主動技能」的額度，也沒有使用次數。</w:t>
       </w:r>
     </w:p>
     <w:p>
@@ -2782,7 +2782,7 @@
         <w:rPr>
           <w:rFonts w:ascii="微軟正黑體" w:hAnsi="微軟正黑體" w:eastAsia="微軟正黑體"/>
         </w:rPr>
-        <w:t>槍械對槍械只比武力差（雙方持槍→比差值），而且玩家所在房間預設不公開，他得靠猜測與功能房間（水塔、糧倉、大倉庫）找到對手。</w:t>
+        <w:t>對手若也持槍（含別的雇傭兵持刀），雙方只比武力差；玩家所在房間預設不公開，他得靠猜測與功能房間（水塔、糧倉、大倉庫）找到對手。</w:t>
       </w:r>
     </w:p>
     <w:p>
@@ -2793,7 +2793,7 @@
         <w:rPr>
           <w:rFonts w:ascii="微軟正黑體" w:hAnsi="微軟正黑體" w:eastAsia="微軟正黑體"/>
         </w:rPr>
-        <w:t>武器是共用有限庫存：若出生點被別人先搶到武器庫的槍，他就只剩刀與雙刀（不算槍），遇到持槍者反而是被單方面壓制的一方。</w:t>
+        <w:t>若背包被清空（例如飲品師的酒）就失去持槍狀態，需要重新取得至少一把刀。</w:t>
       </w:r>
     </w:p>
     <w:p>
@@ -2812,7 +2812,7 @@
         <w:rPr>
           <w:rFonts w:ascii="微軟正黑體" w:hAnsi="微軟正黑體" w:eastAsia="微軟正黑體"/>
         </w:rPr>
-        <w:t>橡膠人：槍械傷害永久-4，且不受火箭筒影響。</w:t>
+        <w:t>橡膠人：槍械傷害永久-4（包含雇傭兵持刀視同持槍的狀態），且不受火箭筒影響。</w:t>
       </w:r>
     </w:p>
     <w:p>
@@ -2861,7 +2861,7 @@
         <w:rPr>
           <w:rFonts w:ascii="微軟正黑體" w:hAnsi="微軟正黑體" w:eastAsia="微軟正黑體"/>
         </w:rPr>
-        <w:t>人數越多，同房的無槍者越多、他在混戰中當目標的收益越大；但搶武器庫的人也變多，同出生點會在第1輪開局先戰鬥（出生點結算）。</w:t>
+        <w:t>人數越多，同房的無槍者越多、他在混戰中當目標的收益越大；同出生點的玩家會在第1輪開局前先戰鬥（出生點結算），而此時還沒有武器。</w:t>
       </w:r>
     </w:p>
     <w:p>
@@ -2877,7 +2877,7 @@
         <w:rPr>
           <w:rFonts w:ascii="微軟正黑體" w:hAnsi="微軟正黑體" w:eastAsia="微軟正黑體"/>
         </w:rPr>
-        <w:t>配點建議：武力2~3／速度4~5／負重3~4（武力靠武器補；速度用來搶B107）。出生點103（到武器庫B107、停機坪202皆2步）。第1輪搶武器庫，優先槍；第2~3輪補大倉庫B501（103→B501 6步，建議中途停留）；之後守在功能房間（水塔101、糧倉B505、大倉庫B501）收割無槍者，第4輪起注意毒氣樓層。</w:t>
+        <w:t>配點建議：武力2~3／速度4~5／負重3~4（武力靠武器補；速度用來搶B107）。出生點103（到武器庫B107、停機坪202皆2步）。第1輪搶武器庫，刀、槍都有用；第2~3輪補大倉庫B501（103→B501 6步，建議中途停留）；之後守在功能房間（水塔101、糧倉B505、大倉庫B501）收割無槍者，第4輪起注意毒氣樓層。</w:t>
       </w:r>
     </w:p>
     <w:p>
@@ -3084,7 +3084,7 @@
         <w:rPr>
           <w:rFonts w:ascii="微軟正黑體" w:hAnsi="微軟正黑體" w:eastAsia="微軟正黑體"/>
         </w:rPr>
-        <w:t>酒的6種結果：1＝丟棄所有道具、2＝無事、3＝武力永久+1、4＝速度永久+1、5＝負重永久+1、6＝生命+2（不超過上限）。每瓶都必須「剛好剔除4種」，再在剩下2種中均等隨機（openBartenderWineModal）。</w:t>
+        <w:t>酒的6種結果：1＝丟棄所有道具、2＝無事、3＝武力永久+1、4＝速度永久+1、5＝負重永久+1、6＝生命+2（不超過上限）。他可以選擇剔除或不剔除：要剔除就必須「剛好剔除4種」，再在剩下2種中均等隨機；不剔除則6種均等隨機（openBartenderWineModal）。</w:t>
       </w:r>
     </w:p>
     <w:p>
@@ -8497,6 +8497,21 @@
                 <w:rFonts w:ascii="微軟正黑體" w:hAnsi="微軟正黑體" w:eastAsia="微軟正黑體"/>
                 <w:sz w:val="18"/>
               </w:rPr>
+              <w:t>4</w:t>
+            </w:r>
+          </w:p>
+        </w:tc>
+        <w:tc>
+          <w:tcPr>
+            <w:tcW w:type="dxa" w:w="567"/>
+          </w:tcPr>
+          <w:p>
+            <w:r/>
+            <w:r>
+              <w:rPr>
+                <w:rFonts w:ascii="微軟正黑體" w:hAnsi="微軟正黑體" w:eastAsia="微軟正黑體"/>
+                <w:sz w:val="18"/>
+              </w:rPr>
               <w:t>3.5</w:t>
             </w:r>
           </w:p>
@@ -8512,7 +8527,7 @@
                 <w:rFonts w:ascii="微軟正黑體" w:hAnsi="微軟正黑體" w:eastAsia="微軟正黑體"/>
                 <w:sz w:val="18"/>
               </w:rPr>
-              <w:t>3.5</w:t>
+              <w:t>5</w:t>
             </w:r>
           </w:p>
         </w:tc>
@@ -8527,7 +8542,7 @@
                 <w:rFonts w:ascii="微軟正黑體" w:hAnsi="微軟正黑體" w:eastAsia="微軟正黑體"/>
                 <w:sz w:val="18"/>
               </w:rPr>
-              <w:t>5</w:t>
+              <w:t>2</w:t>
             </w:r>
           </w:p>
         </w:tc>
@@ -8542,22 +8557,7 @@
                 <w:rFonts w:ascii="微軟正黑體" w:hAnsi="微軟正黑體" w:eastAsia="微軟正黑體"/>
                 <w:sz w:val="18"/>
               </w:rPr>
-              <w:t>2</w:t>
-            </w:r>
-          </w:p>
-        </w:tc>
-        <w:tc>
-          <w:tcPr>
-            <w:tcW w:type="dxa" w:w="567"/>
-          </w:tcPr>
-          <w:p>
-            <w:r/>
-            <w:r>
-              <w:rPr>
-                <w:rFonts w:ascii="微軟正黑體" w:hAnsi="微軟正黑體" w:eastAsia="微軟正黑體"/>
-                <w:sz w:val="18"/>
-              </w:rPr>
-              <w:t>3.5</w:t>
+              <w:t>4</w:t>
             </w:r>
           </w:p>
         </w:tc>
@@ -8572,7 +8572,7 @@
                 <w:rFonts w:ascii="微軟正黑體" w:hAnsi="微軟正黑體" w:eastAsia="微軟正黑體"/>
                 <w:sz w:val="18"/>
               </w:rPr>
-              <w:t>7.3</w:t>
+              <w:t>7.75</w:t>
             </w:r>
           </w:p>
         </w:tc>
@@ -8602,7 +8602,7 @@
                 <w:rFonts w:ascii="微軟正黑體" w:hAnsi="微軟正黑體" w:eastAsia="微軟正黑體"/>
                 <w:sz w:val="18"/>
               </w:rPr>
-              <w:t>■■■■■■■□□□</w:t>
+              <w:t>■■■■■■■■□□</w:t>
             </w:r>
           </w:p>
         </w:tc>
@@ -11120,7 +11120,7 @@
           <w:rFonts w:ascii="微軟正黑體" w:hAnsi="微軟正黑體" w:eastAsia="微軟正黑體"/>
           <w:b w:val="0"/>
         </w:rPr>
-        <w:t>16 位平均 5.81 分，最高與最低相差 2.50 分。</w:t>
+        <w:t>16 位平均 5.84 分，最高與最低相差 2.95 分。</w:t>
       </w:r>
     </w:p>
     <w:p>
@@ -11139,7 +11139,7 @@
         <w:rPr>
           <w:rFonts w:ascii="微軟正黑體" w:hAnsi="微軟正黑體" w:eastAsia="微軟正黑體"/>
         </w:rPr>
-        <w:t>A 級（雇傭兵、飲品師）：能把「負重」或「屬性」轉成不對稱優勢（零負重武器堆武力；零負重的酒換永久屬性與清空對手背包）。</w:t>
+        <w:t>A 級（雇傭兵、飲品師）：能把「負重」或「屬性」轉成不對稱優勢（零負重武器堆武力、一把刀就等於持槍；零負重的酒換永久屬性與清空對手背包）。</w:t>
       </w:r>
     </w:p>
     <w:p>

</xml_diff>

<commit_message>
Ghost revival by drain: next round skips hunger and poison (basic rule); update report
Co-Authored-By: Claude Sonnet 5.5 <noreply@anthropic.com>
</commit_message>
<xml_diff>
--- a/禁閉逃殺_實體模式16職業強度分析.docx
+++ b/禁閉逃殺_實體模式16職業強度分析.docx
@@ -1041,7 +1041,7 @@
         <w:rPr>
           <w:rFonts w:ascii="微軟正黑體" w:hAnsi="微軟正黑體" w:eastAsia="微軟正黑體"/>
         </w:rPr>
-        <w:t>暗影可穿牆移動（每步到實體相鄰的房間），每輪步數＝死前的移動速度（不含腎上腺素），結算時對同房每個活人各吸1點；累積吸滿2點就復活（血量 max(3, 吸取數)）。暗影使者免疫吸血。</w:t>
+        <w:t>暗影可穿牆移動（每步到實體相鄰的房間），每輪步數＝死前的移動速度（不含腎上腺素），暗影階段不受任何傷害；靠暗影吸血復活的玩家，復活後的下一輪結算時免繳水糧、不受毒氣傷害（戰鬥仍有效）。結算時暗影對同房每個活人各吸1點；累積吸滿2點就復活（血量 max(3, 吸取數)）。暗影使者免疫吸血。</w:t>
       </w:r>
     </w:p>
     <w:p>
@@ -5007,7 +5007,7 @@
         <w:pStyle w:val="Heading2"/>
       </w:pPr>
       <w:r>
-        <w:t>8. 🧬 基因怪人　｜　彈性成長</w:t>
+        <w:t>8. 🕯️ 還魂師　｜　復活續命</w:t>
       </w:r>
     </w:p>
     <w:p>
@@ -5016,7 +5016,7 @@
           <w:rFonts w:ascii="微軟正黑體" w:hAnsi="微軟正黑體" w:eastAsia="微軟正黑體"/>
           <w:b/>
         </w:rPr>
-        <w:t>強度 5.9 分（B 級）　生存 2／資源 3／戰鬥 3／機動 3／穩定 4</w:t>
+        <w:t>強度 5.95 分（B 級）　生存 5／資源 1.5／戰鬥 2／機動 2.5／穩定 3.5</w:t>
       </w:r>
     </w:p>
     <w:p>
@@ -5106,7 +5106,7 @@
                 <w:rFonts w:ascii="微軟正黑體" w:hAnsi="微軟正黑體" w:eastAsia="微軟正黑體"/>
                 <w:sz w:val="18"/>
               </w:rPr>
-              <w:t>先天優勢</w:t>
+              <w:t>臨終祝禱</w:t>
             </w:r>
           </w:p>
         </w:tc>
@@ -5136,7 +5136,7 @@
                 <w:rFonts w:ascii="微軟正黑體" w:hAnsi="微軟正黑體" w:eastAsia="微軟正黑體"/>
                 <w:sz w:val="18"/>
               </w:rPr>
-              <w:t>初始可分配基因點數12點，武力上限5點。</w:t>
+              <w:t>死亡成為暗影時，吸血所需總量降為1點即可復活（整局可發動兩次，復活後血量為3）。</w:t>
             </w:r>
           </w:p>
         </w:tc>
@@ -5153,7 +5153,7 @@
                 <w:rFonts w:ascii="微軟正黑體" w:hAnsi="微軟正黑體" w:eastAsia="微軟正黑體"/>
                 <w:sz w:val="18"/>
               </w:rPr>
-              <w:t>基因重組</w:t>
+              <w:t>安魂儀式</w:t>
             </w:r>
           </w:p>
         </w:tc>
@@ -5168,7 +5168,7 @@
                 <w:rFonts w:ascii="微軟正黑體" w:hAnsi="微軟正黑體" w:eastAsia="微軟正黑體"/>
                 <w:sz w:val="18"/>
               </w:rPr>
-              <w:t>主動</w:t>
+              <w:t>被動</w:t>
             </w:r>
           </w:p>
         </w:tc>
@@ -5183,7 +5183,7 @@
                 <w:rFonts w:ascii="微軟正黑體" w:hAnsi="微軟正黑體" w:eastAsia="微軟正黑體"/>
                 <w:sz w:val="18"/>
               </w:rPr>
-              <w:t>技能使用階段可重新分配點數。整局限用2次。</w:t>
+              <w:t>死亡瞬間自動發動：立刻復活並恢復至5血。整局限用1次，第6輪（最後一輪）死亡不觸發。</w:t>
             </w:r>
           </w:p>
         </w:tc>
@@ -5206,7 +5206,7 @@
         <w:rPr>
           <w:rFonts w:ascii="微軟正黑體" w:hAnsi="微軟正黑體" w:eastAsia="微軟正黑體"/>
         </w:rPr>
-        <w:t>開局可分配12點（一般玩家10點），武力上限5。基因庫（每次三項各+1）與操作室B304（重新分配）是所有人都能用的功能房間，沒有使用次數限制。</w:t>
+        <w:t>安魂儀式：第1~5輪死亡的瞬間，立刻以 5 血復活（killPlayer→exorcistAutoRevive）。此時背包已被清空並掉入停屍間B701，他本人也被移到B701；同一次結算後面的毒氣、飢餓仍會對他生效（已宣告的水糧仍算數）。</w:t>
       </w:r>
     </w:p>
     <w:p>
@@ -5217,7 +5217,7 @@
         <w:rPr>
           <w:rFonts w:ascii="微軟正黑體" w:hAnsi="微軟正黑體" w:eastAsia="微軟正黑體"/>
         </w:rPr>
-        <w:t>基因重組：可在技能階段隨時把「目前實際擁有的總點數」重新分配（包含基因庫、酒的加成）；速度會以不含腎上腺素加成的基礎速度計算，武力仍不能超過5。</w:t>
+        <w:t>臨終祝禱：成為暗影後，只要吸到 1 點生命就復活（一般暗影需2點），復活血量為 max(3, 吸取總量)＝3；整局可用2次。暗影可穿牆移動（每步到實體相鄰的房間），每輪步數＝死前的移動速度（不含腎上腺素加成）；以死亡位置B701起算，速度5時約可到達24間房。結算時對同房的每個活人各吸1點，所以要在步數內找到有活人的房間。</w:t>
       </w:r>
     </w:p>
     <w:p>
@@ -5228,15 +5228,7 @@
         <w:rPr>
           <w:rFonts w:ascii="微軟正黑體" w:hAnsi="微軟正黑體" w:eastAsia="微軟正黑體"/>
         </w:rPr>
-        <w:t>他的獨特價值＝多出 2 點屬性＋2 次不必跑去操作室B304的重新分配；但基因庫一次使用就是+3點，是所有人都有的更大成長來源。</w:t>
-      </w:r>
-    </w:p>
-    <w:p>
-      <w:pPr>
-        <w:pStyle w:val="Heading3"/>
-      </w:pPr>
-      <w:r>
-        <w:t>優勢</w:t>
+        <w:t>基本規則（所有玩家都適用，不是還魂師專屬）：暗影階段不受任何傷害；暗影吸血與復活排在結算的毒氣、飢餓之後，所以暗影復活的那一輪不用繳水糧、也不怕毒氣；而靠吸血復活的玩家，在「復活後的下一輪」結算時同樣免繳水糧、不受毒氣傷害（戰鬥仍有效）。例：第1輪結算復活，第2輪結算不用繳水糧、也不怕毒氣。還魂師的獨特處是復活只需吸1點（一般2點）且最多可復活兩次，再加上安魂儀式的5血；安魂儀式（戰鬥中途復活）不屬於吸血復活，之後的毒氣與飢餓仍然生效。</w:t>
       </w:r>
     </w:p>
     <w:p>
@@ -5247,7 +5239,7 @@
         <w:rPr>
           <w:rFonts w:ascii="微軟正黑體" w:hAnsi="微軟正黑體" w:eastAsia="微軟正黑體"/>
         </w:rPr>
-        <w:t>多 2 點永久屬性，沒有任何觸發條件。</w:t>
+        <w:t>最多 3 次復活機會：1次安魂（5血）＋2次祝禱（3血）；第6輪死亡不會觸發安魂，但暗影吸血仍可在第6輪結算時復活。</w:t>
       </w:r>
     </w:p>
     <w:p>
@@ -5258,15 +5250,7 @@
         <w:rPr>
           <w:rFonts w:ascii="微軟正黑體" w:hAnsi="微軟正黑體" w:eastAsia="微軟正黑體"/>
         </w:rPr>
-        <w:t>可根據局勢把點數轉成速度（搶補給或逃毒氣）或負重（帶水糧）。</w:t>
-      </w:r>
-    </w:p>
-    <w:p>
-      <w:pPr>
-        <w:pStyle w:val="Heading3"/>
-      </w:pPr>
-      <w:r>
-        <w:t>弱點與風險</w:t>
+        <w:t>期末排名看最終血量：第6輪結算時復活的暗影以 3 血計算，高於一般死者的 0。</w:t>
       </w:r>
     </w:p>
     <w:p>
@@ -5277,7 +5261,15 @@
         <w:rPr>
           <w:rFonts w:ascii="微軟正黑體" w:hAnsi="微軟正黑體" w:eastAsia="微軟正黑體"/>
         </w:rPr>
-        <w:t>沒有回復、防禦、補給或位移加成；武力上限5。</w:t>
+        <w:t>復活後回到B701（最底層深處），背包全空，要從B701庫存（3張/次）重新取回自己的遺物。</w:t>
+      </w:r>
+    </w:p>
+    <w:p>
+      <w:pPr>
+        <w:pStyle w:val="Heading3"/>
+      </w:pPr>
+      <w:r>
+        <w:t>優勢</w:t>
       </w:r>
     </w:p>
     <w:p>
@@ -5288,15 +5280,7 @@
         <w:rPr>
           <w:rFonts w:ascii="微軟正黑體" w:hAnsi="微軟正黑體" w:eastAsia="微軟正黑體"/>
         </w:rPr>
-        <w:t>整體收益只是「2點＋2次重組」，不如基因庫或戰鬥類技能的爆發力。</w:t>
-      </w:r>
-    </w:p>
-    <w:p>
-      <w:pPr>
-        <w:pStyle w:val="Heading3"/>
-      </w:pPr>
-      <w:r>
-        <w:t>規則內的反制</w:t>
+        <w:t>復活條件比別人低（吸1點即可，一般暗影需2點；可復活兩次），所以能比別人更常、更快地享有「暗影階段與復活後下一輪免繳水糧、免毒氣」這個基本規則——保護人人都有，但他最容易觸發；全是被動，不需要任何宣告就能在致命時刻救回；在毒氣與飢餓使死亡集中於中後期時最能發揮。</w:t>
       </w:r>
     </w:p>
     <w:p>
@@ -5307,7 +5291,78 @@
         <w:rPr>
           <w:rFonts w:ascii="微軟正黑體" w:hAnsi="微軟正黑體" w:eastAsia="微軟正黑體"/>
         </w:rPr>
-        <w:t>無。</w:t>
+        <w:t>死後是暗影，仍可穿牆走位（不受梯子與走廊限制），但步數只有死前的移動速度。</w:t>
+      </w:r>
+    </w:p>
+    <w:p>
+      <w:pPr>
+        <w:pStyle w:val="Heading3"/>
+      </w:pPr>
+      <w:r>
+        <w:t>弱點與風險</w:t>
+      </w:r>
+    </w:p>
+    <w:p>
+      <w:pPr>
+        <w:pStyle w:val="ListBullet"/>
+      </w:pPr>
+      <w:r>
+        <w:rPr>
+          <w:rFonts w:ascii="微軟正黑體" w:hAnsi="微軟正黑體" w:eastAsia="微軟正黑體"/>
+        </w:rPr>
+        <w:t>沒有死就沒有任何收益；復活後只有 5 或 3 血，且要立刻面對毒氣與飢餓。</w:t>
+      </w:r>
+    </w:p>
+    <w:p>
+      <w:pPr>
+        <w:pStyle w:val="ListBullet"/>
+      </w:pPr>
+      <w:r>
+        <w:rPr>
+          <w:rFonts w:ascii="微軟正黑體" w:hAnsi="微軟正黑體" w:eastAsia="微軟正黑體"/>
+        </w:rPr>
+        <w:t>復活後背包全空、人在B701，要花一輪以上的時間回到功能房間。</w:t>
+      </w:r>
+    </w:p>
+    <w:p>
+      <w:pPr>
+        <w:pStyle w:val="ListBullet"/>
+      </w:pPr>
+      <w:r>
+        <w:rPr>
+          <w:rFonts w:ascii="微軟正黑體" w:hAnsi="微軟正黑體" w:eastAsia="微軟正黑體"/>
+        </w:rPr>
+        <w:t>暗影吸血要有活人在同一房間；第6輪死亡幾乎無救。</w:t>
+      </w:r>
+    </w:p>
+    <w:p>
+      <w:pPr>
+        <w:pStyle w:val="ListBullet"/>
+      </w:pPr>
+      <w:r>
+        <w:rPr>
+          <w:rFonts w:ascii="微軟正黑體" w:hAnsi="微軟正黑體" w:eastAsia="微軟正黑體"/>
+        </w:rPr>
+        <w:t>入殮師若同局，會在他死亡時拿走他一張道具並加負重。</w:t>
+      </w:r>
+    </w:p>
+    <w:p>
+      <w:pPr>
+        <w:pStyle w:val="Heading3"/>
+      </w:pPr>
+      <w:r>
+        <w:t>規則內的反制</w:t>
+      </w:r>
+    </w:p>
+    <w:p>
+      <w:pPr>
+        <w:pStyle w:val="ListBullet"/>
+      </w:pPr>
+      <w:r>
+        <w:rPr>
+          <w:rFonts w:ascii="微軟正黑體" w:hAnsi="微軟正黑體" w:eastAsia="微軟正黑體"/>
+        </w:rPr>
+        <w:t>第6輪被擊殺時安魂儀式不觸發；入殮師同局時，他死亡會被取走1張道具。</w:t>
       </w:r>
     </w:p>
     <w:p>
@@ -5323,7 +5378,7 @@
         <w:rPr>
           <w:rFonts w:ascii="微軟正黑體" w:hAnsi="微軟正黑體" w:eastAsia="微軟正黑體"/>
         </w:rPr>
-        <w:t>人數對他影響小，屬於人數中立的職業。</w:t>
+        <w:t>人數越多死亡越多，保險價值越高。</w:t>
       </w:r>
     </w:p>
     <w:p>
@@ -5339,7 +5394,7 @@
         <w:rPr>
           <w:rFonts w:ascii="微軟正黑體" w:hAnsi="微軟正黑體" w:eastAsia="微軟正黑體"/>
         </w:rPr>
-        <w:t>配點建議：武力3／速度5／負重4。第1輪以速度搶補給；有槍或要打架時第3輪前後重組成武力4~5；毒氣擴大時轉速度。</w:t>
+        <w:t>配點建議：武力3／速度4／負重3。出生點B603（到B701 2步、到酒窖2步）。第1~3輪可以較冒險；安魂用掉後馬上到B701取回遺物，補水糧；暗影階段在步數內優先走進水塔、糧倉、大倉庫這類有人的房間（步數＝死前速度，所以配點時速度太低會讓暗影難以找人）。</w:t>
       </w:r>
     </w:p>
     <w:p>
@@ -5347,7 +5402,7 @@
         <w:pStyle w:val="Heading2"/>
       </w:pPr>
       <w:r>
-        <w:t>9. ♻️ 拾荒者　｜　資源轉換</w:t>
+        <w:t>9. 🧬 基因怪人　｜　彈性成長</w:t>
       </w:r>
     </w:p>
     <w:p>
@@ -5356,7 +5411,7 @@
           <w:rFonts w:ascii="微軟正黑體" w:hAnsi="微軟正黑體" w:eastAsia="微軟正黑體"/>
           <w:b/>
         </w:rPr>
-        <w:t>強度 5.75 分（C 級）　生存 2／資源 4.5／戰鬥 1.5／機動 2.5／穩定 3.5</w:t>
+        <w:t>強度 5.9 分（B 級）　生存 2／資源 3／戰鬥 3／機動 3／穩定 4</w:t>
       </w:r>
     </w:p>
     <w:p>
@@ -5446,7 +5501,7 @@
                 <w:rFonts w:ascii="微軟正黑體" w:hAnsi="微軟正黑體" w:eastAsia="微軟正黑體"/>
                 <w:sz w:val="18"/>
               </w:rPr>
-              <w:t>拾荒嗅覺</w:t>
+              <w:t>先天優勢</w:t>
             </w:r>
           </w:p>
         </w:tc>
@@ -5476,7 +5531,7 @@
                 <w:rFonts w:ascii="微軟正黑體" w:hAnsi="微軟正黑體" w:eastAsia="微軟正黑體"/>
                 <w:sz w:val="18"/>
               </w:rPr>
-              <w:t>垃圾不佔負重；在房間抽取物品時，50%機率額外獲得1個垃圾（由垃圾場扣除）。</w:t>
+              <w:t>初始可分配基因點數12點，武力上限5點。</w:t>
             </w:r>
           </w:p>
         </w:tc>
@@ -5493,7 +5548,7 @@
                 <w:rFonts w:ascii="微軟正黑體" w:hAnsi="微軟正黑體" w:eastAsia="微軟正黑體"/>
                 <w:sz w:val="18"/>
               </w:rPr>
-              <w:t>變廢為寶</w:t>
+              <w:t>基因重組</w:t>
             </w:r>
           </w:p>
         </w:tc>
@@ -5523,7 +5578,7 @@
                 <w:rFonts w:ascii="微軟正黑體" w:hAnsi="微軟正黑體" w:eastAsia="微軟正黑體"/>
                 <w:sz w:val="18"/>
               </w:rPr>
-              <w:t>行動階段可使用：將背包內任意數量（自選）的垃圾隨機轉為水或糧。整局限用2次。</w:t>
+              <w:t>技能使用階段可重新分配點數。整局限用2次。</w:t>
             </w:r>
           </w:p>
         </w:tc>
@@ -5546,7 +5601,7 @@
         <w:rPr>
           <w:rFonts w:ascii="微軟正黑體" w:hAnsi="微軟正黑體" w:eastAsia="微軟正黑體"/>
         </w:rPr>
-        <w:t>拾荒嗅覺是「每抽到1件物品就擲一次50%」（含之後因負重放回的那些），所以水塔抽4瓶水約得2個垃圾、垃圾場抽一次約得1.3個；垃圾庫存20，全部由垃圾場B503扣除。</w:t>
+        <w:t>開局可分配12點（一般玩家10點），武力上限5。基因庫（每次三項各+1）與操作室B304（重新分配）是所有人都能用的功能房間，沒有使用次數限制。</w:t>
       </w:r>
     </w:p>
     <w:p>
@@ -5557,7 +5612,7 @@
         <w:rPr>
           <w:rFonts w:ascii="微軟正黑體" w:hAnsi="微軟正黑體" w:eastAsia="微軟正黑體"/>
         </w:rPr>
-        <w:t>變廢為寶：每個垃圾轉成水或糧各50%，轉換出來的水糧要有背包空位（addItem 檢查），所以每次轉換的上限＝min(垃圾數, 剩餘負重)。整局2次。</w:t>
+        <w:t>基因重組：可在技能階段隨時把「目前實際擁有的總點數」重新分配（包含基因庫、酒的加成）；速度會以不含腎上腺素加成的基礎速度計算，武力仍不能超過5。</w:t>
       </w:r>
     </w:p>
     <w:p>
@@ -5568,7 +5623,15 @@
         <w:rPr>
           <w:rFonts w:ascii="微軟正黑體" w:hAnsi="微軟正黑體" w:eastAsia="微軟正黑體"/>
         </w:rPr>
-        <w:t>垃圾場每次抽5，但非垃圾道具最多拿2件（dumpCap），且每次抽取是在垃圾／繩索／防毒面具／火箭筒／次元口袋／循環回收裝置 6 種中均等挑種類，所以每次進入約抽到 1.1 個垃圾。</w:t>
+        <w:t>他的獨特價值＝多出 2 點屬性＋2 次不必跑去操作室B304的重新分配；但基因庫一次使用就是+3點，是所有人都有的更大成長來源。</w:t>
+      </w:r>
+    </w:p>
+    <w:p>
+      <w:pPr>
+        <w:pStyle w:val="Heading3"/>
+      </w:pPr>
+      <w:r>
+        <w:t>優勢</w:t>
       </w:r>
     </w:p>
     <w:p>
@@ -5579,15 +5642,7 @@
         <w:rPr>
           <w:rFonts w:ascii="微軟正黑體" w:hAnsi="微軟正黑體" w:eastAsia="微軟正黑體"/>
         </w:rPr>
-        <w:t>水糧是全場最稀缺資源：水15＋糧15＋水糧包1，需求是每人每輪各1（第2~6輪共 5水5糧），8人需要80份，12人需要120份。拾荒者轉換出來的水糧是額外「憑空產生」的，不會從水塔／糧倉扣庫存。</w:t>
-      </w:r>
-    </w:p>
-    <w:p>
-      <w:pPr>
-        <w:pStyle w:val="Heading3"/>
-      </w:pPr>
-      <w:r>
-        <w:t>優勢</w:t>
+        <w:t>多 2 點永久屬性，沒有任何觸發條件。</w:t>
       </w:r>
     </w:p>
     <w:p>
@@ -5598,7 +5653,15 @@
         <w:rPr>
           <w:rFonts w:ascii="微軟正黑體" w:hAnsi="微軟正黑體" w:eastAsia="微軟正黑體"/>
         </w:rPr>
-        <w:t>兩次轉換在負重允許下可各補 3~4 份水糧，等於減少約 6~8 點飢餓損失，且完全不占別人的庫存。</w:t>
+        <w:t>可根據局勢把點數轉成速度（搶補給或逃毒氣）或負重（帶水糧）。</w:t>
+      </w:r>
+    </w:p>
+    <w:p>
+      <w:pPr>
+        <w:pStyle w:val="Heading3"/>
+      </w:pPr>
+      <w:r>
+        <w:t>弱點與風險</w:t>
       </w:r>
     </w:p>
     <w:p>
@@ -5609,7 +5672,7 @@
         <w:rPr>
           <w:rFonts w:ascii="微軟正黑體" w:hAnsi="微軟正黑體" w:eastAsia="微軟正黑體"/>
         </w:rPr>
-        <w:t>垃圾不佔負重，累積成本低；每次搜索都在累積。</w:t>
+        <w:t>沒有回復、防禦、補給或位移加成；武力上限5。</w:t>
       </w:r>
     </w:p>
     <w:p>
@@ -5620,7 +5683,7 @@
         <w:rPr>
           <w:rFonts w:ascii="微軟正黑體" w:hAnsi="微軟正黑體" w:eastAsia="微軟正黑體"/>
         </w:rPr>
-        <w:t>轉換不限房間、不需要移動。</w:t>
+        <w:t>整體收益只是「2點＋2次重組」，不如基因庫或戰鬥類技能的爆發力。</w:t>
       </w:r>
     </w:p>
     <w:p>
@@ -5628,7 +5691,7 @@
         <w:pStyle w:val="Heading3"/>
       </w:pPr>
       <w:r>
-        <w:t>弱點與風險</w:t>
+        <w:t>規則內的反制</w:t>
       </w:r>
     </w:p>
     <w:p>
@@ -5639,48 +5702,7 @@
         <w:rPr>
           <w:rFonts w:ascii="微軟正黑體" w:hAnsi="微軟正黑體" w:eastAsia="微軟正黑體"/>
         </w:rPr>
-        <w:t>轉換結果隨機（水或糧），可能偏向某一種，而每輪兩種都要付；</w:t>
-      </w:r>
-    </w:p>
-    <w:p>
-      <w:pPr>
-        <w:pStyle w:val="ListBullet"/>
-      </w:pPr>
-      <w:r>
-        <w:rPr>
-          <w:rFonts w:ascii="微軟正黑體" w:hAnsi="微軟正黑體" w:eastAsia="微軟正黑體"/>
-        </w:rPr>
-        <w:t>轉換上限被負重卡住；只有2次，且每次占用當輪的主動技能額度。</w:t>
-      </w:r>
-    </w:p>
-    <w:p>
-      <w:pPr>
-        <w:pStyle w:val="ListBullet"/>
-      </w:pPr>
-      <w:r>
-        <w:rPr>
-          <w:rFonts w:ascii="微軟正黑體" w:hAnsi="微軟正黑體" w:eastAsia="微軟正黑體"/>
-        </w:rPr>
-        <w:t>沒有任何戰鬥、防禦或機動加成。</w:t>
-      </w:r>
-    </w:p>
-    <w:p>
-      <w:pPr>
-        <w:pStyle w:val="Heading3"/>
-      </w:pPr>
-      <w:r>
-        <w:t>規則內的反制</w:t>
-      </w:r>
-    </w:p>
-    <w:p>
-      <w:pPr>
-        <w:pStyle w:val="ListBullet"/>
-      </w:pPr>
-      <w:r>
-        <w:rPr>
-          <w:rFonts w:ascii="微軟正黑體" w:hAnsi="微軟正黑體" w:eastAsia="微軟正黑體"/>
-        </w:rPr>
-        <w:t>同樣會餓死：垃圾來得慢時（早期搜索次數少）轉換量少。</w:t>
+        <w:t>無。</w:t>
       </w:r>
     </w:p>
     <w:p>
@@ -5696,7 +5718,7 @@
         <w:rPr>
           <w:rFonts w:ascii="微軟正黑體" w:hAnsi="微軟正黑體" w:eastAsia="微軟正黑體"/>
         </w:rPr>
-        <w:t>人數越多水糧越缺，轉換價值越高。</w:t>
+        <w:t>人數對他影響小，屬於人數中立的職業。</w:t>
       </w:r>
     </w:p>
     <w:p>
@@ -5712,7 +5734,7 @@
         <w:rPr>
           <w:rFonts w:ascii="微軟正黑體" w:hAnsi="微軟正黑體" w:eastAsia="微軟正黑體"/>
         </w:rPr>
-        <w:t>配點建議：武力2／速度4／負重4。出生點B402（到垃圾場B503只要1步）。第1輪在垃圾場搜索並一路在水塔、糧倉等多抽的房間累積垃圾；第3輪累積約6~8個後第一次轉換；第2次轉換留到第5輪。</w:t>
+        <w:t>配點建議：武力3／速度5／負重4。第1輪以速度搶補給；有槍或要打架時第3輪前後重組成武力4~5；毒氣擴大時轉速度。</w:t>
       </w:r>
     </w:p>
     <w:p>
@@ -5720,7 +5742,7 @@
         <w:pStyle w:val="Heading2"/>
       </w:pPr>
       <w:r>
-        <w:t>10. 🕯️ 還魂師　｜　復活續命</w:t>
+        <w:t>10. ♻️ 拾荒者　｜　資源轉換</w:t>
       </w:r>
     </w:p>
     <w:p>
@@ -5729,7 +5751,7 @@
           <w:rFonts w:ascii="微軟正黑體" w:hAnsi="微軟正黑體" w:eastAsia="微軟正黑體"/>
           <w:b/>
         </w:rPr>
-        <w:t>強度 5.75 分（C 級）　生存 5／資源 1.5／戰鬥 2／機動 2.5／穩定 3</w:t>
+        <w:t>強度 5.75 分（C 級）　生存 2／資源 4.5／戰鬥 1.5／機動 2.5／穩定 3.5</w:t>
       </w:r>
     </w:p>
     <w:p>
@@ -5819,7 +5841,7 @@
                 <w:rFonts w:ascii="微軟正黑體" w:hAnsi="微軟正黑體" w:eastAsia="微軟正黑體"/>
                 <w:sz w:val="18"/>
               </w:rPr>
-              <w:t>臨終祝禱</w:t>
+              <w:t>拾荒嗅覺</w:t>
             </w:r>
           </w:p>
         </w:tc>
@@ -5849,7 +5871,7 @@
                 <w:rFonts w:ascii="微軟正黑體" w:hAnsi="微軟正黑體" w:eastAsia="微軟正黑體"/>
                 <w:sz w:val="18"/>
               </w:rPr>
-              <w:t>死亡成為暗影時，吸血所需總量降為1點即可復活（整局可發動兩次，復活後血量為3）。</w:t>
+              <w:t>垃圾不佔負重；在房間抽取物品時，50%機率額外獲得1個垃圾（由垃圾場扣除）。</w:t>
             </w:r>
           </w:p>
         </w:tc>
@@ -5866,7 +5888,7 @@
                 <w:rFonts w:ascii="微軟正黑體" w:hAnsi="微軟正黑體" w:eastAsia="微軟正黑體"/>
                 <w:sz w:val="18"/>
               </w:rPr>
-              <w:t>安魂儀式</w:t>
+              <w:t>變廢為寶</w:t>
             </w:r>
           </w:p>
         </w:tc>
@@ -5881,7 +5903,7 @@
                 <w:rFonts w:ascii="微軟正黑體" w:hAnsi="微軟正黑體" w:eastAsia="微軟正黑體"/>
                 <w:sz w:val="18"/>
               </w:rPr>
-              <w:t>被動</w:t>
+              <w:t>主動</w:t>
             </w:r>
           </w:p>
         </w:tc>
@@ -5896,7 +5918,7 @@
                 <w:rFonts w:ascii="微軟正黑體" w:hAnsi="微軟正黑體" w:eastAsia="微軟正黑體"/>
                 <w:sz w:val="18"/>
               </w:rPr>
-              <w:t>死亡瞬間自動發動：立刻復活並恢復至5血。整局限用1次，第6輪（最後一輪）死亡不觸發。</w:t>
+              <w:t>行動階段可使用：將背包內任意數量（自選）的垃圾隨機轉為水或糧。整局限用2次。</w:t>
             </w:r>
           </w:p>
         </w:tc>
@@ -5919,7 +5941,7 @@
         <w:rPr>
           <w:rFonts w:ascii="微軟正黑體" w:hAnsi="微軟正黑體" w:eastAsia="微軟正黑體"/>
         </w:rPr>
-        <w:t>安魂儀式：第1~5輪死亡的瞬間，立刻以 5 血復活（killPlayer→exorcistAutoRevive）。此時背包已被清空並掉入停屍間B701，他本人也被移到B701；同一次結算後面的毒氣、飢餓仍會對他生效（已宣告的水糧仍算數）。</w:t>
+        <w:t>拾荒嗅覺是「每抽到1件物品就擲一次50%」（含之後因負重放回的那些），所以水塔抽4瓶水約得2個垃圾、垃圾場抽一次約得1.3個；垃圾庫存20，全部由垃圾場B503扣除。</w:t>
       </w:r>
     </w:p>
     <w:p>
@@ -5930,7 +5952,7 @@
         <w:rPr>
           <w:rFonts w:ascii="微軟正黑體" w:hAnsi="微軟正黑體" w:eastAsia="微軟正黑體"/>
         </w:rPr>
-        <w:t>臨終祝禱：成為暗影後，只要吸到 1 點生命就復活（一般暗影需2點），復活血量為 max(3, 吸取總量)＝3；整局可用2次。暗影可穿牆移動（每步到實體相鄰的房間），每輪步數＝死前的移動速度（不含腎上腺素加成）；以死亡位置B701起算，速度5時約可到達24間房。結算時對同房的每個活人各吸1點，所以要在步數內找到有活人的房間。</w:t>
+        <w:t>變廢為寶：每個垃圾轉成水或糧各50%，轉換出來的水糧要有背包空位（addItem 檢查），所以每次轉換的上限＝min(垃圾數, 剩餘負重)。整局2次。</w:t>
       </w:r>
     </w:p>
     <w:p>
@@ -5941,7 +5963,7 @@
         <w:rPr>
           <w:rFonts w:ascii="微軟正黑體" w:hAnsi="微軟正黑體" w:eastAsia="微軟正黑體"/>
         </w:rPr>
-        <w:t>暗影階段不受傷害：暗影不是存活玩家，毒氣、飢餓、戰鬥、火箭筒都不會對他生效；而暗影吸血與復活排在結算的毒氣、飢餓之後，所以「暗影復活的那一輪」他不用繳水糧、也不怕毒氣，復活後直接帶著 3 血進入下一輪（第6輪復活則以 3 血計入最終排名，完全避開第6輪最高的毒氣4點與飢餓2點）。這與安魂儀式不同：安魂儀式是在戰鬥中途復活，之後的毒氣與飢餓仍然生效。</w:t>
+        <w:t>垃圾場每次抽5，但非垃圾道具最多拿2件（dumpCap），且每次抽取是在垃圾／繩索／防毒面具／火箭筒／次元口袋／循環回收裝置 6 種中均等挑種類，所以每次進入約抽到 1.1 個垃圾。</w:t>
       </w:r>
     </w:p>
     <w:p>
@@ -5952,7 +5974,15 @@
         <w:rPr>
           <w:rFonts w:ascii="微軟正黑體" w:hAnsi="微軟正黑體" w:eastAsia="微軟正黑體"/>
         </w:rPr>
-        <w:t>最多 3 次復活機會：1次安魂（5血）＋2次祝禱（3血）；第6輪死亡不會觸發安魂，但暗影吸血仍可在第6輪結算時復活。</w:t>
+        <w:t>水糧是全場最稀缺資源：水15＋糧15＋水糧包1，需求是每人每輪各1（第2~6輪共 5水5糧），8人需要80份，12人需要120份。拾荒者轉換出來的水糧是額外「憑空產生」的，不會從水塔／糧倉扣庫存。</w:t>
+      </w:r>
+    </w:p>
+    <w:p>
+      <w:pPr>
+        <w:pStyle w:val="Heading3"/>
+      </w:pPr>
+      <w:r>
+        <w:t>優勢</w:t>
       </w:r>
     </w:p>
     <w:p>
@@ -5963,7 +5993,7 @@
         <w:rPr>
           <w:rFonts w:ascii="微軟正黑體" w:hAnsi="微軟正黑體" w:eastAsia="微軟正黑體"/>
         </w:rPr>
-        <w:t>期末排名看最終血量：第6輪結算時復活的暗影以 3 血計算，高於一般死者的 0。</w:t>
+        <w:t>兩次轉換在負重允許下可各補 3~4 份水糧，等於減少約 6~8 點飢餓損失，且完全不占別人的庫存。</w:t>
       </w:r>
     </w:p>
     <w:p>
@@ -5974,15 +6004,7 @@
         <w:rPr>
           <w:rFonts w:ascii="微軟正黑體" w:hAnsi="微軟正黑體" w:eastAsia="微軟正黑體"/>
         </w:rPr>
-        <w:t>復活後回到B701（最底層深處），背包全空，要從B701庫存（3張/次）重新取回自己的遺物。</w:t>
-      </w:r>
-    </w:p>
-    <w:p>
-      <w:pPr>
-        <w:pStyle w:val="Heading3"/>
-      </w:pPr>
-      <w:r>
-        <w:t>優勢</w:t>
+        <w:t>垃圾不佔負重，累積成本低；每次搜索都在累積。</w:t>
       </w:r>
     </w:p>
     <w:p>
@@ -5993,7 +6015,15 @@
         <w:rPr>
           <w:rFonts w:ascii="微軟正黑體" w:hAnsi="微軟正黑體" w:eastAsia="微軟正黑體"/>
         </w:rPr>
-        <w:t>暗影復活當輪完全不吃毒氣與飢餓（暗影階段不受任何傷害），是整局最安全的回血方式之一；全是被動，不需要任何宣告就能在致命時刻救回；在毒氣與飢餓使死亡集中於中後期時最能發揮。</w:t>
+        <w:t>轉換不限房間、不需要移動。</w:t>
+      </w:r>
+    </w:p>
+    <w:p>
+      <w:pPr>
+        <w:pStyle w:val="Heading3"/>
+      </w:pPr>
+      <w:r>
+        <w:t>弱點與風險</w:t>
       </w:r>
     </w:p>
     <w:p>
@@ -6004,15 +6034,7 @@
         <w:rPr>
           <w:rFonts w:ascii="微軟正黑體" w:hAnsi="微軟正黑體" w:eastAsia="微軟正黑體"/>
         </w:rPr>
-        <w:t>死後是暗影，仍可穿牆走位（不受梯子與走廊限制），但步數只有死前的移動速度。</w:t>
-      </w:r>
-    </w:p>
-    <w:p>
-      <w:pPr>
-        <w:pStyle w:val="Heading3"/>
-      </w:pPr>
-      <w:r>
-        <w:t>弱點與風險</w:t>
+        <w:t>轉換結果隨機（水或糧），可能偏向某一種，而每輪兩種都要付；</w:t>
       </w:r>
     </w:p>
     <w:p>
@@ -6023,7 +6045,7 @@
         <w:rPr>
           <w:rFonts w:ascii="微軟正黑體" w:hAnsi="微軟正黑體" w:eastAsia="微軟正黑體"/>
         </w:rPr>
-        <w:t>沒有死就沒有任何收益；復活後只有 5 或 3 血，且要立刻面對毒氣與飢餓。</w:t>
+        <w:t>轉換上限被負重卡住；只有2次，且每次占用當輪的主動技能額度。</w:t>
       </w:r>
     </w:p>
     <w:p>
@@ -6034,7 +6056,15 @@
         <w:rPr>
           <w:rFonts w:ascii="微軟正黑體" w:hAnsi="微軟正黑體" w:eastAsia="微軟正黑體"/>
         </w:rPr>
-        <w:t>復活後背包全空、人在B701，要花一輪以上的時間回到功能房間。</w:t>
+        <w:t>沒有任何戰鬥、防禦或機動加成。</w:t>
+      </w:r>
+    </w:p>
+    <w:p>
+      <w:pPr>
+        <w:pStyle w:val="Heading3"/>
+      </w:pPr>
+      <w:r>
+        <w:t>規則內的反制</w:t>
       </w:r>
     </w:p>
     <w:p>
@@ -6045,37 +6075,7 @@
         <w:rPr>
           <w:rFonts w:ascii="微軟正黑體" w:hAnsi="微軟正黑體" w:eastAsia="微軟正黑體"/>
         </w:rPr>
-        <w:t>暗影吸血要有活人在同一房間；第6輪死亡幾乎無救。</w:t>
-      </w:r>
-    </w:p>
-    <w:p>
-      <w:pPr>
-        <w:pStyle w:val="ListBullet"/>
-      </w:pPr>
-      <w:r>
-        <w:rPr>
-          <w:rFonts w:ascii="微軟正黑體" w:hAnsi="微軟正黑體" w:eastAsia="微軟正黑體"/>
-        </w:rPr>
-        <w:t>入殮師若同局，會在他死亡時拿走他一張道具並加負重。</w:t>
-      </w:r>
-    </w:p>
-    <w:p>
-      <w:pPr>
-        <w:pStyle w:val="Heading3"/>
-      </w:pPr>
-      <w:r>
-        <w:t>規則內的反制</w:t>
-      </w:r>
-    </w:p>
-    <w:p>
-      <w:pPr>
-        <w:pStyle w:val="ListBullet"/>
-      </w:pPr>
-      <w:r>
-        <w:rPr>
-          <w:rFonts w:ascii="微軟正黑體" w:hAnsi="微軟正黑體" w:eastAsia="微軟正黑體"/>
-        </w:rPr>
-        <w:t>第6輪被擊殺時安魂儀式不觸發；入殮師同局時，他死亡會被取走1張道具。</w:t>
+        <w:t>同樣會餓死：垃圾來得慢時（早期搜索次數少）轉換量少。</w:t>
       </w:r>
     </w:p>
     <w:p>
@@ -6091,7 +6091,7 @@
         <w:rPr>
           <w:rFonts w:ascii="微軟正黑體" w:hAnsi="微軟正黑體" w:eastAsia="微軟正黑體"/>
         </w:rPr>
-        <w:t>人數越多死亡越多，保險價值越高。</w:t>
+        <w:t>人數越多水糧越缺，轉換價值越高。</w:t>
       </w:r>
     </w:p>
     <w:p>
@@ -6107,7 +6107,7 @@
         <w:rPr>
           <w:rFonts w:ascii="微軟正黑體" w:hAnsi="微軟正黑體" w:eastAsia="微軟正黑體"/>
         </w:rPr>
-        <w:t>配點建議：武力3／速度4／負重3。出生點B603（到B701 2步、到酒窖2步）。第1~3輪可以較冒險；安魂用掉後馬上到B701取回遺物，補水糧；暗影階段在步數內優先走進水塔、糧倉、大倉庫這類有人的房間（步數＝死前速度，所以配點時速度太低會讓暗影難以找人）。</w:t>
+        <w:t>配點建議：武力2／速度4／負重4。出生點B402（到垃圾場B503只要1步）。第1輪在垃圾場搜索並一路在水塔、糧倉等多抽的房間累積垃圾；第3輪累積約6~8個後第一次轉換；第2次轉換留到第5輪。</w:t>
       </w:r>
     </w:p>
     <w:p>
@@ -9636,7 +9636,7 @@
                 <w:rFonts w:ascii="微軟正黑體" w:hAnsi="微軟正黑體" w:eastAsia="微軟正黑體"/>
                 <w:sz w:val="18"/>
               </w:rPr>
-              <w:t>🧬 基因怪人</w:t>
+              <w:t>🕯️ 還魂師</w:t>
             </w:r>
           </w:p>
         </w:tc>
@@ -9651,7 +9651,7 @@
                 <w:rFonts w:ascii="微軟正黑體" w:hAnsi="微軟正黑體" w:eastAsia="微軟正黑體"/>
                 <w:sz w:val="18"/>
               </w:rPr>
-              <w:t>彈性成長</w:t>
+              <w:t>復活續命</w:t>
             </w:r>
           </w:p>
         </w:tc>
@@ -9666,6 +9666,36 @@
                 <w:rFonts w:ascii="微軟正黑體" w:hAnsi="微軟正黑體" w:eastAsia="微軟正黑體"/>
                 <w:sz w:val="18"/>
               </w:rPr>
+              <w:t>5</w:t>
+            </w:r>
+          </w:p>
+        </w:tc>
+        <w:tc>
+          <w:tcPr>
+            <w:tcW w:type="dxa" w:w="567"/>
+          </w:tcPr>
+          <w:p>
+            <w:r/>
+            <w:r>
+              <w:rPr>
+                <w:rFonts w:ascii="微軟正黑體" w:hAnsi="微軟正黑體" w:eastAsia="微軟正黑體"/>
+                <w:sz w:val="18"/>
+              </w:rPr>
+              <w:t>1.5</w:t>
+            </w:r>
+          </w:p>
+        </w:tc>
+        <w:tc>
+          <w:tcPr>
+            <w:tcW w:type="dxa" w:w="567"/>
+          </w:tcPr>
+          <w:p>
+            <w:r/>
+            <w:r>
+              <w:rPr>
+                <w:rFonts w:ascii="微軟正黑體" w:hAnsi="微軟正黑體" w:eastAsia="微軟正黑體"/>
+                <w:sz w:val="18"/>
+              </w:rPr>
               <w:t>2</w:t>
             </w:r>
           </w:p>
@@ -9681,7 +9711,7 @@
                 <w:rFonts w:ascii="微軟正黑體" w:hAnsi="微軟正黑體" w:eastAsia="微軟正黑體"/>
                 <w:sz w:val="18"/>
               </w:rPr>
-              <w:t>3</w:t>
+              <w:t>2.5</w:t>
             </w:r>
           </w:p>
         </w:tc>
@@ -9696,37 +9726,7 @@
                 <w:rFonts w:ascii="微軟正黑體" w:hAnsi="微軟正黑體" w:eastAsia="微軟正黑體"/>
                 <w:sz w:val="18"/>
               </w:rPr>
-              <w:t>3</w:t>
-            </w:r>
-          </w:p>
-        </w:tc>
-        <w:tc>
-          <w:tcPr>
-            <w:tcW w:type="dxa" w:w="567"/>
-          </w:tcPr>
-          <w:p>
-            <w:r/>
-            <w:r>
-              <w:rPr>
-                <w:rFonts w:ascii="微軟正黑體" w:hAnsi="微軟正黑體" w:eastAsia="微軟正黑體"/>
-                <w:sz w:val="18"/>
-              </w:rPr>
-              <w:t>3</w:t>
-            </w:r>
-          </w:p>
-        </w:tc>
-        <w:tc>
-          <w:tcPr>
-            <w:tcW w:type="dxa" w:w="567"/>
-          </w:tcPr>
-          <w:p>
-            <w:r/>
-            <w:r>
-              <w:rPr>
-                <w:rFonts w:ascii="微軟正黑體" w:hAnsi="微軟正黑體" w:eastAsia="微軟正黑體"/>
-                <w:sz w:val="18"/>
-              </w:rPr>
-              <w:t>4</w:t>
+              <w:t>3.5</w:t>
             </w:r>
           </w:p>
         </w:tc>
@@ -9741,7 +9741,7 @@
                 <w:rFonts w:ascii="微軟正黑體" w:hAnsi="微軟正黑體" w:eastAsia="微軟正黑體"/>
                 <w:sz w:val="18"/>
               </w:rPr>
-              <w:t>5.9</w:t>
+              <w:t>5.95</w:t>
             </w:r>
           </w:p>
         </w:tc>
@@ -9803,7 +9803,7 @@
                 <w:rFonts w:ascii="微軟正黑體" w:hAnsi="微軟正黑體" w:eastAsia="微軟正黑體"/>
                 <w:sz w:val="18"/>
               </w:rPr>
-              <w:t>♻️ 拾荒者</w:t>
+              <w:t>🧬 基因怪人</w:t>
             </w:r>
           </w:p>
         </w:tc>
@@ -9818,7 +9818,7 @@
                 <w:rFonts w:ascii="微軟正黑體" w:hAnsi="微軟正黑體" w:eastAsia="微軟正黑體"/>
                 <w:sz w:val="18"/>
               </w:rPr>
-              <w:t>資源轉換</w:t>
+              <w:t>彈性成長</w:t>
             </w:r>
           </w:p>
         </w:tc>
@@ -9848,7 +9848,7 @@
                 <w:rFonts w:ascii="微軟正黑體" w:hAnsi="微軟正黑體" w:eastAsia="微軟正黑體"/>
                 <w:sz w:val="18"/>
               </w:rPr>
-              <w:t>4.5</w:t>
+              <w:t>3</w:t>
             </w:r>
           </w:p>
         </w:tc>
@@ -9863,7 +9863,7 @@
                 <w:rFonts w:ascii="微軟正黑體" w:hAnsi="微軟正黑體" w:eastAsia="微軟正黑體"/>
                 <w:sz w:val="18"/>
               </w:rPr>
-              <w:t>1.5</w:t>
+              <w:t>3</w:t>
             </w:r>
           </w:p>
         </w:tc>
@@ -9878,7 +9878,7 @@
                 <w:rFonts w:ascii="微軟正黑體" w:hAnsi="微軟正黑體" w:eastAsia="微軟正黑體"/>
                 <w:sz w:val="18"/>
               </w:rPr>
-              <w:t>2.5</w:t>
+              <w:t>3</w:t>
             </w:r>
           </w:p>
         </w:tc>
@@ -9893,7 +9893,7 @@
                 <w:rFonts w:ascii="微軟正黑體" w:hAnsi="微軟正黑體" w:eastAsia="微軟正黑體"/>
                 <w:sz w:val="18"/>
               </w:rPr>
-              <w:t>3.5</w:t>
+              <w:t>4</w:t>
             </w:r>
           </w:p>
         </w:tc>
@@ -9908,7 +9908,7 @@
                 <w:rFonts w:ascii="微軟正黑體" w:hAnsi="微軟正黑體" w:eastAsia="微軟正黑體"/>
                 <w:sz w:val="18"/>
               </w:rPr>
-              <w:t>5.75</w:t>
+              <w:t>5.9</w:t>
             </w:r>
           </w:p>
         </w:tc>
@@ -9923,7 +9923,7 @@
                 <w:rFonts w:ascii="微軟正黑體" w:hAnsi="微軟正黑體" w:eastAsia="微軟正黑體"/>
                 <w:sz w:val="18"/>
               </w:rPr>
-              <w:t>C</w:t>
+              <w:t>B</w:t>
             </w:r>
           </w:p>
         </w:tc>
@@ -9970,7 +9970,7 @@
                 <w:rFonts w:ascii="微軟正黑體" w:hAnsi="微軟正黑體" w:eastAsia="微軟正黑體"/>
                 <w:sz w:val="18"/>
               </w:rPr>
-              <w:t>🕯️ 還魂師</w:t>
+              <w:t>♻️ 拾荒者</w:t>
             </w:r>
           </w:p>
         </w:tc>
@@ -9985,7 +9985,7 @@
                 <w:rFonts w:ascii="微軟正黑體" w:hAnsi="微軟正黑體" w:eastAsia="微軟正黑體"/>
                 <w:sz w:val="18"/>
               </w:rPr>
-              <w:t>復活續命</w:t>
+              <w:t>資源轉換</w:t>
             </w:r>
           </w:p>
         </w:tc>
@@ -10000,7 +10000,7 @@
                 <w:rFonts w:ascii="微軟正黑體" w:hAnsi="微軟正黑體" w:eastAsia="微軟正黑體"/>
                 <w:sz w:val="18"/>
               </w:rPr>
-              <w:t>5</w:t>
+              <w:t>2</w:t>
             </w:r>
           </w:p>
         </w:tc>
@@ -10015,6 +10015,21 @@
                 <w:rFonts w:ascii="微軟正黑體" w:hAnsi="微軟正黑體" w:eastAsia="微軟正黑體"/>
                 <w:sz w:val="18"/>
               </w:rPr>
+              <w:t>4.5</w:t>
+            </w:r>
+          </w:p>
+        </w:tc>
+        <w:tc>
+          <w:tcPr>
+            <w:tcW w:type="dxa" w:w="567"/>
+          </w:tcPr>
+          <w:p>
+            <w:r/>
+            <w:r>
+              <w:rPr>
+                <w:rFonts w:ascii="微軟正黑體" w:hAnsi="微軟正黑體" w:eastAsia="微軟正黑體"/>
+                <w:sz w:val="18"/>
+              </w:rPr>
               <w:t>1.5</w:t>
             </w:r>
           </w:p>
@@ -10030,7 +10045,7 @@
                 <w:rFonts w:ascii="微軟正黑體" w:hAnsi="微軟正黑體" w:eastAsia="微軟正黑體"/>
                 <w:sz w:val="18"/>
               </w:rPr>
-              <w:t>2</w:t>
+              <w:t>2.5</w:t>
             </w:r>
           </w:p>
         </w:tc>
@@ -10045,22 +10060,7 @@
                 <w:rFonts w:ascii="微軟正黑體" w:hAnsi="微軟正黑體" w:eastAsia="微軟正黑體"/>
                 <w:sz w:val="18"/>
               </w:rPr>
-              <w:t>2.5</w:t>
-            </w:r>
-          </w:p>
-        </w:tc>
-        <w:tc>
-          <w:tcPr>
-            <w:tcW w:type="dxa" w:w="567"/>
-          </w:tcPr>
-          <w:p>
-            <w:r/>
-            <w:r>
-              <w:rPr>
-                <w:rFonts w:ascii="微軟正黑體" w:hAnsi="微軟正黑體" w:eastAsia="微軟正黑體"/>
-                <w:sz w:val="18"/>
-              </w:rPr>
-              <w:t>3</w:t>
+              <w:t>3.5</w:t>
             </w:r>
           </w:p>
         </w:tc>
@@ -11120,7 +11120,7 @@
           <w:rFonts w:ascii="微軟正黑體" w:hAnsi="微軟正黑體" w:eastAsia="微軟正黑體"/>
           <w:b w:val="0"/>
         </w:rPr>
-        <w:t>16 位平均 5.84 分，最高與最低相差 2.95 分。</w:t>
+        <w:t>16 位平均 5.85 分，最高與最低相差 2.95 分。</w:t>
       </w:r>
     </w:p>
     <w:p>

</xml_diff>

<commit_message>
還魂師 安魂儀式: permanent +1 speed after revival; update report
Co-Authored-By: Claude Sonnet 5.5 <noreply@anthropic.com>
</commit_message>
<xml_diff>
--- a/禁閉逃殺_實體模式16職業強度分析.docx
+++ b/禁閉逃殺_實體模式16職業強度分析.docx
@@ -4656,7 +4656,7 @@
         <w:pStyle w:val="Heading2"/>
       </w:pPr>
       <w:r>
-        <w:t>7. 🏀 橡膠人　｜　抗槍抗火箭</w:t>
+        <w:t>7. 🕯️ 還魂師　｜　復活續命</w:t>
       </w:r>
     </w:p>
     <w:p>
@@ -4665,7 +4665,7 @@
           <w:rFonts w:ascii="微軟正黑體" w:hAnsi="微軟正黑體" w:eastAsia="微軟正黑體"/>
           <w:b/>
         </w:rPr>
-        <w:t>強度 6.0 分（B 級）　生存 4／資源 2／戰鬥 3／機動 2／穩定 3.5</w:t>
+        <w:t>強度 6.05 分（B 級）　生存 5／資源 1.5／戰鬥 2／機動 3／穩定 3.5</w:t>
       </w:r>
     </w:p>
     <w:p>
@@ -4755,7 +4755,7 @@
                 <w:rFonts w:ascii="微軟正黑體" w:hAnsi="微軟正黑體" w:eastAsia="微軟正黑體"/>
                 <w:sz w:val="18"/>
               </w:rPr>
-              <w:t>橡膠身軀</w:t>
+              <w:t>臨終祝禱</w:t>
             </w:r>
           </w:p>
         </w:tc>
@@ -4785,7 +4785,7 @@
                 <w:rFonts w:ascii="微軟正黑體" w:hAnsi="微軟正黑體" w:eastAsia="微軟正黑體"/>
                 <w:sz w:val="18"/>
               </w:rPr>
-              <w:t>槍械傷害永久-4；但你無法持有槍（手槍／霰彈槍）：抽到槍時放回房間，並補抽一張（不可獲得槍）。</w:t>
+              <w:t>死亡成為暗影時，吸血所需總量降為1點即可復活（整局可發動兩次，復活後血量為3）。</w:t>
             </w:r>
           </w:p>
         </w:tc>
@@ -4802,7 +4802,7 @@
                 <w:rFonts w:ascii="微軟正黑體" w:hAnsi="微軟正黑體" w:eastAsia="微軟正黑體"/>
                 <w:sz w:val="18"/>
               </w:rPr>
-              <w:t>彈力緩衝</w:t>
+              <w:t>安魂儀式</w:t>
             </w:r>
           </w:p>
         </w:tc>
@@ -4832,7 +4832,7 @@
                 <w:rFonts w:ascii="微軟正黑體" w:hAnsi="微軟正黑體" w:eastAsia="微軟正黑體"/>
                 <w:sz w:val="18"/>
               </w:rPr>
-              <w:t>無視火箭筒傷害。</w:t>
+              <w:t>死亡瞬間自動發動：立刻復活並恢復至5血，復活後速度永久+1。整局限用1次，第6輪（最後一輪）死亡不觸發。</w:t>
             </w:r>
           </w:p>
         </w:tc>
@@ -4855,7 +4855,7 @@
         <w:rPr>
           <w:rFonts w:ascii="微軟正黑體" w:hAnsi="微軟正黑體" w:eastAsia="微軟正黑體"/>
         </w:rPr>
-        <w:t>槍械傷害-4：只在「對手持槍」的戰鬥中扣減（reduce：d−4，最低0）；對手的武力若≤4，戰鬥傷害完全歸零。</w:t>
+        <w:t>安魂儀式：第1~5輪死亡的瞬間，立刻以 5 血復活（killPlayer→exorcistAutoRevive）。此時背包已被清空並掉入停屍間B701，他本人也被移到B701；同一次結算後面的毒氣、飢餓仍會對他生效（已宣告的水糧仍算數）。</w:t>
       </w:r>
     </w:p>
     <w:p>
@@ -4866,7 +4866,7 @@
         <w:rPr>
           <w:rFonts w:ascii="微軟正黑體" w:hAnsi="微軟正黑體" w:eastAsia="微軟正黑體"/>
         </w:rPr>
-        <w:t>無視火箭筒：火箭筒的4點傷害對他為0（全場只有1把，位於垃圾場B503，首位進入者約 40% 抽到）。</w:t>
+        <w:t>安魂儀式復活後速度永久+1，之後每輪步數與暗影階段的步數（死前速度）都多1，也有助於從B701走回功能房間。</w:t>
       </w:r>
     </w:p>
     <w:p>
@@ -4877,7 +4877,7 @@
         <w:rPr>
           <w:rFonts w:ascii="微軟正黑體" w:hAnsi="微軟正黑體" w:eastAsia="微軟正黑體"/>
         </w:rPr>
-        <w:t>抽到槍時放回並補抽非槍：武器庫只有刀／手槍／霰彈槍三種，他每次抽取實際上都得到刀（因為槍會被替換成非槍種類，也就是刀），所以每次進武器庫最多拿 2 把刀。</w:t>
+        <w:t>臨終祝禱：成為暗影後，只要吸到 1 點生命就復活（一般暗影需2點），復活血量為 max(3, 吸取總量)＝3；整局可用2次。暗影可穿牆移動（每步到實體相鄰的房間），每輪步數＝死前的移動速度（不含腎上腺素加成）；以死亡位置B701起算，速度5時約可到達24間房。結算時對同房的每個活人各吸1點，所以要在步數內找到有活人的房間。</w:t>
       </w:r>
     </w:p>
     <w:p>
@@ -4888,15 +4888,7 @@
         <w:rPr>
           <w:rFonts w:ascii="微軟正黑體" w:hAnsi="微軟正黑體" w:eastAsia="微軟正黑體"/>
         </w:rPr>
-        <w:t>他永遠不持槍：面對持槍者永遠是被單方面壓制（受到對方全武力再減4），無法反擊。</w:t>
-      </w:r>
-    </w:p>
-    <w:p>
-      <w:pPr>
-        <w:pStyle w:val="Heading3"/>
-      </w:pPr>
-      <w:r>
-        <w:t>優勢</w:t>
+        <w:t>基本規則（所有玩家都適用，不是還魂師專屬）：暗影階段不受任何傷害；暗影吸血與復活排在結算的毒氣、飢餓之後，所以暗影復活的那一輪不用繳水糧、也不怕毒氣；而靠吸血復活的玩家，在「復活後的下一輪」結算時同樣免繳水糧、不受毒氣傷害（戰鬥仍有效）。例：第1輪結算復活，第2輪結算不用繳水糧、也不怕毒氣。還魂師的獨特處是復活只需吸1點（一般2點）且最多可復活兩次，再加上安魂儀式的5血；安魂儀式（戰鬥中途復活）不屬於吸血復活，之後的毒氣與飢餓仍然生效。</w:t>
       </w:r>
     </w:p>
     <w:p>
@@ -4907,7 +4899,7 @@
         <w:rPr>
           <w:rFonts w:ascii="微軟正黑體" w:hAnsi="微軟正黑體" w:eastAsia="微軟正黑體"/>
         </w:rPr>
-        <w:t>對最大傷害來源（槍械）與最大範圍傷害（火箭筒）有硬減免；越到後期槍越多、火箭筒越可能被使用，價值越高。</w:t>
+        <w:t>最多 3 次復活機會：1次安魂（5血）＋2次祝禱（3血）；第6輪死亡不會觸發安魂，但暗影吸血仍可在第6輪結算時復活。</w:t>
       </w:r>
     </w:p>
     <w:p>
@@ -4918,15 +4910,7 @@
         <w:rPr>
           <w:rFonts w:ascii="微軟正黑體" w:hAnsi="微軟正黑體" w:eastAsia="微軟正黑體"/>
         </w:rPr>
-        <w:t>被動技能，不占主動技能額度。</w:t>
-      </w:r>
-    </w:p>
-    <w:p>
-      <w:pPr>
-        <w:pStyle w:val="Heading3"/>
-      </w:pPr>
-      <w:r>
-        <w:t>弱點與風險</w:t>
+        <w:t>期末排名看最終血量：第6輪結算時復活的暗影以 3 血計算，高於一般死者的 0。</w:t>
       </w:r>
     </w:p>
     <w:p>
@@ -4937,7 +4921,15 @@
         <w:rPr>
           <w:rFonts w:ascii="微軟正黑體" w:hAnsi="微軟正黑體" w:eastAsia="微軟正黑體"/>
         </w:rPr>
-        <w:t>完全沒有補給、回復或機動；對毒氣、飢餓、無槍戰鬥沒有任何增益。</w:t>
+        <w:t>復活後回到B701（最底層深處），背包全空，要從B701庫存（3張/次）重新取回自己的遺物。</w:t>
+      </w:r>
+    </w:p>
+    <w:p>
+      <w:pPr>
+        <w:pStyle w:val="Heading3"/>
+      </w:pPr>
+      <w:r>
+        <w:t>優勢</w:t>
       </w:r>
     </w:p>
     <w:p>
@@ -4948,15 +4940,7 @@
         <w:rPr>
           <w:rFonts w:ascii="微軟正黑體" w:hAnsi="微軟正黑體" w:eastAsia="微軟正黑體"/>
         </w:rPr>
-        <w:t>無法持槍，輸出上限被刀與雙刀限制，也無法利用槍的單方面優勢。</w:t>
-      </w:r>
-    </w:p>
-    <w:p>
-      <w:pPr>
-        <w:pStyle w:val="Heading3"/>
-      </w:pPr>
-      <w:r>
-        <w:t>規則內的反制</w:t>
+        <w:t>復活條件比別人低（吸1點即可，一般暗影需2點；可復活兩次），所以能比別人更常、更快地享有「暗影階段與復活後下一輪免繳水糧、免毒氣」這個基本規則——保護人人都有，但他最容易觸發；全是被動，不需要任何宣告就能在致命時刻救回；在毒氣與飢餓使死亡集中於中後期時最能發揮。</w:t>
       </w:r>
     </w:p>
     <w:p>
@@ -4967,7 +4951,78 @@
         <w:rPr>
           <w:rFonts w:ascii="微軟正黑體" w:hAnsi="微軟正黑體" w:eastAsia="微軟正黑體"/>
         </w:rPr>
-        <w:t>無槍的高武力玩家（刀＋高基礎武力）：槍械減傷對他無效。</w:t>
+        <w:t>死後是暗影，仍可穿牆走位（不受梯子與走廊限制），但步數只有死前的移動速度。</w:t>
+      </w:r>
+    </w:p>
+    <w:p>
+      <w:pPr>
+        <w:pStyle w:val="Heading3"/>
+      </w:pPr>
+      <w:r>
+        <w:t>弱點與風險</w:t>
+      </w:r>
+    </w:p>
+    <w:p>
+      <w:pPr>
+        <w:pStyle w:val="ListBullet"/>
+      </w:pPr>
+      <w:r>
+        <w:rPr>
+          <w:rFonts w:ascii="微軟正黑體" w:hAnsi="微軟正黑體" w:eastAsia="微軟正黑體"/>
+        </w:rPr>
+        <w:t>沒有死就沒有任何收益；復活後只有 5 或 3 血，且要立刻面對毒氣與飢餓。</w:t>
+      </w:r>
+    </w:p>
+    <w:p>
+      <w:pPr>
+        <w:pStyle w:val="ListBullet"/>
+      </w:pPr>
+      <w:r>
+        <w:rPr>
+          <w:rFonts w:ascii="微軟正黑體" w:hAnsi="微軟正黑體" w:eastAsia="微軟正黑體"/>
+        </w:rPr>
+        <w:t>復活後背包全空、人在B701，要花一輪以上的時間回到功能房間。</w:t>
+      </w:r>
+    </w:p>
+    <w:p>
+      <w:pPr>
+        <w:pStyle w:val="ListBullet"/>
+      </w:pPr>
+      <w:r>
+        <w:rPr>
+          <w:rFonts w:ascii="微軟正黑體" w:hAnsi="微軟正黑體" w:eastAsia="微軟正黑體"/>
+        </w:rPr>
+        <w:t>暗影吸血要有活人在同一房間；第6輪死亡幾乎無救。</w:t>
+      </w:r>
+    </w:p>
+    <w:p>
+      <w:pPr>
+        <w:pStyle w:val="ListBullet"/>
+      </w:pPr>
+      <w:r>
+        <w:rPr>
+          <w:rFonts w:ascii="微軟正黑體" w:hAnsi="微軟正黑體" w:eastAsia="微軟正黑體"/>
+        </w:rPr>
+        <w:t>入殮師若同局，會在他死亡時拿走他一張道具並加負重。</w:t>
+      </w:r>
+    </w:p>
+    <w:p>
+      <w:pPr>
+        <w:pStyle w:val="Heading3"/>
+      </w:pPr>
+      <w:r>
+        <w:t>規則內的反制</w:t>
+      </w:r>
+    </w:p>
+    <w:p>
+      <w:pPr>
+        <w:pStyle w:val="ListBullet"/>
+      </w:pPr>
+      <w:r>
+        <w:rPr>
+          <w:rFonts w:ascii="微軟正黑體" w:hAnsi="微軟正黑體" w:eastAsia="微軟正黑體"/>
+        </w:rPr>
+        <w:t>第6輪被擊殺時安魂儀式不觸發；入殮師同局時，他死亡會被取走1張道具。</w:t>
       </w:r>
     </w:p>
     <w:p>
@@ -4983,7 +5038,7 @@
         <w:rPr>
           <w:rFonts w:ascii="微軟正黑體" w:hAnsi="微軟正黑體" w:eastAsia="微軟正黑體"/>
         </w:rPr>
-        <w:t>人數越多、槍械被使用的機會越多（全場6把槍），減傷價值越高；5人以下價值明顯下降。</w:t>
+        <w:t>人數越多死亡越多，保險價值越高。</w:t>
       </w:r>
     </w:p>
     <w:p>
@@ -4999,7 +5054,7 @@
         <w:rPr>
           <w:rFonts w:ascii="微軟正黑體" w:hAnsi="微軟正黑體" w:eastAsia="微軟正黑體"/>
         </w:rPr>
-        <w:t>配點建議：武力3／速度4／負重3。出生點依補給考慮。第1輪可進武器庫拿2把刀；之後避免被持槍者堵在功能房間，但遇到持槍者不必逃：傷害＝其武力−4。</w:t>
+        <w:t>配點建議：武力3／速度4／負重3。出生點B603（到B701 2步、到酒窖2步）。第1~3輪可以較冒險；安魂用掉後馬上到B701取回遺物，補水糧；暗影階段在步數內優先走進水塔、糧倉、大倉庫這類有人的房間（步數＝死前速度，所以配點時速度太低會讓暗影難以找人）。</w:t>
       </w:r>
     </w:p>
     <w:p>
@@ -5007,7 +5062,7 @@
         <w:pStyle w:val="Heading2"/>
       </w:pPr>
       <w:r>
-        <w:t>8. 🕯️ 還魂師　｜　復活續命</w:t>
+        <w:t>8. 🏀 橡膠人　｜　抗槍抗火箭</w:t>
       </w:r>
     </w:p>
     <w:p>
@@ -5016,7 +5071,7 @@
           <w:rFonts w:ascii="微軟正黑體" w:hAnsi="微軟正黑體" w:eastAsia="微軟正黑體"/>
           <w:b/>
         </w:rPr>
-        <w:t>強度 5.95 分（B 級）　生存 5／資源 1.5／戰鬥 2／機動 2.5／穩定 3.5</w:t>
+        <w:t>強度 6.0 分（B 級）　生存 4／資源 2／戰鬥 3／機動 2／穩定 3.5</w:t>
       </w:r>
     </w:p>
     <w:p>
@@ -5106,7 +5161,7 @@
                 <w:rFonts w:ascii="微軟正黑體" w:hAnsi="微軟正黑體" w:eastAsia="微軟正黑體"/>
                 <w:sz w:val="18"/>
               </w:rPr>
-              <w:t>臨終祝禱</w:t>
+              <w:t>橡膠身軀</w:t>
             </w:r>
           </w:p>
         </w:tc>
@@ -5136,7 +5191,7 @@
                 <w:rFonts w:ascii="微軟正黑體" w:hAnsi="微軟正黑體" w:eastAsia="微軟正黑體"/>
                 <w:sz w:val="18"/>
               </w:rPr>
-              <w:t>死亡成為暗影時，吸血所需總量降為1點即可復活（整局可發動兩次，復活後血量為3）。</w:t>
+              <w:t>槍械傷害永久-4；但你無法持有槍（手槍／霰彈槍）：抽到槍時放回房間，並補抽一張（不可獲得槍）。</w:t>
             </w:r>
           </w:p>
         </w:tc>
@@ -5153,7 +5208,7 @@
                 <w:rFonts w:ascii="微軟正黑體" w:hAnsi="微軟正黑體" w:eastAsia="微軟正黑體"/>
                 <w:sz w:val="18"/>
               </w:rPr>
-              <w:t>安魂儀式</w:t>
+              <w:t>彈力緩衝</w:t>
             </w:r>
           </w:p>
         </w:tc>
@@ -5183,7 +5238,7 @@
                 <w:rFonts w:ascii="微軟正黑體" w:hAnsi="微軟正黑體" w:eastAsia="微軟正黑體"/>
                 <w:sz w:val="18"/>
               </w:rPr>
-              <w:t>死亡瞬間自動發動：立刻復活並恢復至5血。整局限用1次，第6輪（最後一輪）死亡不觸發。</w:t>
+              <w:t>無視火箭筒傷害。</w:t>
             </w:r>
           </w:p>
         </w:tc>
@@ -5206,7 +5261,7 @@
         <w:rPr>
           <w:rFonts w:ascii="微軟正黑體" w:hAnsi="微軟正黑體" w:eastAsia="微軟正黑體"/>
         </w:rPr>
-        <w:t>安魂儀式：第1~5輪死亡的瞬間，立刻以 5 血復活（killPlayer→exorcistAutoRevive）。此時背包已被清空並掉入停屍間B701，他本人也被移到B701；同一次結算後面的毒氣、飢餓仍會對他生效（已宣告的水糧仍算數）。</w:t>
+        <w:t>槍械傷害-4：只在「對手持槍」的戰鬥中扣減（reduce：d−4，最低0）；對手的武力若≤4，戰鬥傷害完全歸零。</w:t>
       </w:r>
     </w:p>
     <w:p>
@@ -5217,7 +5272,7 @@
         <w:rPr>
           <w:rFonts w:ascii="微軟正黑體" w:hAnsi="微軟正黑體" w:eastAsia="微軟正黑體"/>
         </w:rPr>
-        <w:t>臨終祝禱：成為暗影後，只要吸到 1 點生命就復活（一般暗影需2點），復活血量為 max(3, 吸取總量)＝3；整局可用2次。暗影可穿牆移動（每步到實體相鄰的房間），每輪步數＝死前的移動速度（不含腎上腺素加成）；以死亡位置B701起算，速度5時約可到達24間房。結算時對同房的每個活人各吸1點，所以要在步數內找到有活人的房間。</w:t>
+        <w:t>無視火箭筒：火箭筒的4點傷害對他為0（全場只有1把，位於垃圾場B503，首位進入者約 40% 抽到）。</w:t>
       </w:r>
     </w:p>
     <w:p>
@@ -5228,7 +5283,7 @@
         <w:rPr>
           <w:rFonts w:ascii="微軟正黑體" w:hAnsi="微軟正黑體" w:eastAsia="微軟正黑體"/>
         </w:rPr>
-        <w:t>基本規則（所有玩家都適用，不是還魂師專屬）：暗影階段不受任何傷害；暗影吸血與復活排在結算的毒氣、飢餓之後，所以暗影復活的那一輪不用繳水糧、也不怕毒氣；而靠吸血復活的玩家，在「復活後的下一輪」結算時同樣免繳水糧、不受毒氣傷害（戰鬥仍有效）。例：第1輪結算復活，第2輪結算不用繳水糧、也不怕毒氣。還魂師的獨特處是復活只需吸1點（一般2點）且最多可復活兩次，再加上安魂儀式的5血；安魂儀式（戰鬥中途復活）不屬於吸血復活，之後的毒氣與飢餓仍然生效。</w:t>
+        <w:t>抽到槍時放回並補抽非槍：武器庫只有刀／手槍／霰彈槍三種，他每次抽取實際上都得到刀（因為槍會被替換成非槍種類，也就是刀），所以每次進武器庫最多拿 2 把刀。</w:t>
       </w:r>
     </w:p>
     <w:p>
@@ -5239,7 +5294,15 @@
         <w:rPr>
           <w:rFonts w:ascii="微軟正黑體" w:hAnsi="微軟正黑體" w:eastAsia="微軟正黑體"/>
         </w:rPr>
-        <w:t>最多 3 次復活機會：1次安魂（5血）＋2次祝禱（3血）；第6輪死亡不會觸發安魂，但暗影吸血仍可在第6輪結算時復活。</w:t>
+        <w:t>他永遠不持槍：面對持槍者永遠是被單方面壓制（受到對方全武力再減4），無法反擊。</w:t>
+      </w:r>
+    </w:p>
+    <w:p>
+      <w:pPr>
+        <w:pStyle w:val="Heading3"/>
+      </w:pPr>
+      <w:r>
+        <w:t>優勢</w:t>
       </w:r>
     </w:p>
     <w:p>
@@ -5250,7 +5313,7 @@
         <w:rPr>
           <w:rFonts w:ascii="微軟正黑體" w:hAnsi="微軟正黑體" w:eastAsia="微軟正黑體"/>
         </w:rPr>
-        <w:t>期末排名看最終血量：第6輪結算時復活的暗影以 3 血計算，高於一般死者的 0。</w:t>
+        <w:t>對最大傷害來源（槍械）與最大範圍傷害（火箭筒）有硬減免；越到後期槍越多、火箭筒越可能被使用，價值越高。</w:t>
       </w:r>
     </w:p>
     <w:p>
@@ -5261,7 +5324,7 @@
         <w:rPr>
           <w:rFonts w:ascii="微軟正黑體" w:hAnsi="微軟正黑體" w:eastAsia="微軟正黑體"/>
         </w:rPr>
-        <w:t>復活後回到B701（最底層深處），背包全空，要從B701庫存（3張/次）重新取回自己的遺物。</w:t>
+        <w:t>被動技能，不占主動技能額度。</w:t>
       </w:r>
     </w:p>
     <w:p>
@@ -5269,7 +5332,7 @@
         <w:pStyle w:val="Heading3"/>
       </w:pPr>
       <w:r>
-        <w:t>優勢</w:t>
+        <w:t>弱點與風險</w:t>
       </w:r>
     </w:p>
     <w:p>
@@ -5280,7 +5343,7 @@
         <w:rPr>
           <w:rFonts w:ascii="微軟正黑體" w:hAnsi="微軟正黑體" w:eastAsia="微軟正黑體"/>
         </w:rPr>
-        <w:t>復活條件比別人低（吸1點即可，一般暗影需2點；可復活兩次），所以能比別人更常、更快地享有「暗影階段與復活後下一輪免繳水糧、免毒氣」這個基本規則——保護人人都有，但他最容易觸發；全是被動，不需要任何宣告就能在致命時刻救回；在毒氣與飢餓使死亡集中於中後期時最能發揮。</w:t>
+        <w:t>完全沒有補給、回復或機動；對毒氣、飢餓、無槍戰鬥沒有任何增益。</w:t>
       </w:r>
     </w:p>
     <w:p>
@@ -5291,7 +5354,7 @@
         <w:rPr>
           <w:rFonts w:ascii="微軟正黑體" w:hAnsi="微軟正黑體" w:eastAsia="微軟正黑體"/>
         </w:rPr>
-        <w:t>死後是暗影，仍可穿牆走位（不受梯子與走廊限制），但步數只有死前的移動速度。</w:t>
+        <w:t>無法持槍，輸出上限被刀與雙刀限制，也無法利用槍的單方面優勢。</w:t>
       </w:r>
     </w:p>
     <w:p>
@@ -5299,7 +5362,7 @@
         <w:pStyle w:val="Heading3"/>
       </w:pPr>
       <w:r>
-        <w:t>弱點與風險</w:t>
+        <w:t>規則內的反制</w:t>
       </w:r>
     </w:p>
     <w:p>
@@ -5310,59 +5373,7 @@
         <w:rPr>
           <w:rFonts w:ascii="微軟正黑體" w:hAnsi="微軟正黑體" w:eastAsia="微軟正黑體"/>
         </w:rPr>
-        <w:t>沒有死就沒有任何收益；復活後只有 5 或 3 血，且要立刻面對毒氣與飢餓。</w:t>
-      </w:r>
-    </w:p>
-    <w:p>
-      <w:pPr>
-        <w:pStyle w:val="ListBullet"/>
-      </w:pPr>
-      <w:r>
-        <w:rPr>
-          <w:rFonts w:ascii="微軟正黑體" w:hAnsi="微軟正黑體" w:eastAsia="微軟正黑體"/>
-        </w:rPr>
-        <w:t>復活後背包全空、人在B701，要花一輪以上的時間回到功能房間。</w:t>
-      </w:r>
-    </w:p>
-    <w:p>
-      <w:pPr>
-        <w:pStyle w:val="ListBullet"/>
-      </w:pPr>
-      <w:r>
-        <w:rPr>
-          <w:rFonts w:ascii="微軟正黑體" w:hAnsi="微軟正黑體" w:eastAsia="微軟正黑體"/>
-        </w:rPr>
-        <w:t>暗影吸血要有活人在同一房間；第6輪死亡幾乎無救。</w:t>
-      </w:r>
-    </w:p>
-    <w:p>
-      <w:pPr>
-        <w:pStyle w:val="ListBullet"/>
-      </w:pPr>
-      <w:r>
-        <w:rPr>
-          <w:rFonts w:ascii="微軟正黑體" w:hAnsi="微軟正黑體" w:eastAsia="微軟正黑體"/>
-        </w:rPr>
-        <w:t>入殮師若同局，會在他死亡時拿走他一張道具並加負重。</w:t>
-      </w:r>
-    </w:p>
-    <w:p>
-      <w:pPr>
-        <w:pStyle w:val="Heading3"/>
-      </w:pPr>
-      <w:r>
-        <w:t>規則內的反制</w:t>
-      </w:r>
-    </w:p>
-    <w:p>
-      <w:pPr>
-        <w:pStyle w:val="ListBullet"/>
-      </w:pPr>
-      <w:r>
-        <w:rPr>
-          <w:rFonts w:ascii="微軟正黑體" w:hAnsi="微軟正黑體" w:eastAsia="微軟正黑體"/>
-        </w:rPr>
-        <w:t>第6輪被擊殺時安魂儀式不觸發；入殮師同局時，他死亡會被取走1張道具。</w:t>
+        <w:t>無槍的高武力玩家（刀＋高基礎武力）：槍械減傷對他無效。</w:t>
       </w:r>
     </w:p>
     <w:p>
@@ -5378,7 +5389,7 @@
         <w:rPr>
           <w:rFonts w:ascii="微軟正黑體" w:hAnsi="微軟正黑體" w:eastAsia="微軟正黑體"/>
         </w:rPr>
-        <w:t>人數越多死亡越多，保險價值越高。</w:t>
+        <w:t>人數越多、槍械被使用的機會越多（全場6把槍），減傷價值越高；5人以下價值明顯下降。</w:t>
       </w:r>
     </w:p>
     <w:p>
@@ -5394,7 +5405,7 @@
         <w:rPr>
           <w:rFonts w:ascii="微軟正黑體" w:hAnsi="微軟正黑體" w:eastAsia="微軟正黑體"/>
         </w:rPr>
-        <w:t>配點建議：武力3／速度4／負重3。出生點B603（到B701 2步、到酒窖2步）。第1~3輪可以較冒險；安魂用掉後馬上到B701取回遺物，補水糧；暗影階段在步數內優先走進水塔、糧倉、大倉庫這類有人的房間（步數＝死前速度，所以配點時速度太低會讓暗影難以找人）。</w:t>
+        <w:t>配點建議：武力3／速度4／負重3。出生點依補給考慮。第1輪可進武器庫拿2把刀；之後避免被持槍者堵在功能房間，但遇到持槍者不必逃：傷害＝其武力−4。</w:t>
       </w:r>
     </w:p>
     <w:p>
@@ -9469,7 +9480,7 @@
                 <w:rFonts w:ascii="微軟正黑體" w:hAnsi="微軟正黑體" w:eastAsia="微軟正黑體"/>
                 <w:sz w:val="18"/>
               </w:rPr>
-              <w:t>🏀 橡膠人</w:t>
+              <w:t>🕯️ 還魂師</w:t>
             </w:r>
           </w:p>
         </w:tc>
@@ -9484,7 +9495,7 @@
                 <w:rFonts w:ascii="微軟正黑體" w:hAnsi="微軟正黑體" w:eastAsia="微軟正黑體"/>
                 <w:sz w:val="18"/>
               </w:rPr>
-              <w:t>抗槍抗火箭</w:t>
+              <w:t>復活續命</w:t>
             </w:r>
           </w:p>
         </w:tc>
@@ -9499,7 +9510,7 @@
                 <w:rFonts w:ascii="微軟正黑體" w:hAnsi="微軟正黑體" w:eastAsia="微軟正黑體"/>
                 <w:sz w:val="18"/>
               </w:rPr>
-              <w:t>4</w:t>
+              <w:t>5</w:t>
             </w:r>
           </w:p>
         </w:tc>
@@ -9514,6 +9525,21 @@
                 <w:rFonts w:ascii="微軟正黑體" w:hAnsi="微軟正黑體" w:eastAsia="微軟正黑體"/>
                 <w:sz w:val="18"/>
               </w:rPr>
+              <w:t>1.5</w:t>
+            </w:r>
+          </w:p>
+        </w:tc>
+        <w:tc>
+          <w:tcPr>
+            <w:tcW w:type="dxa" w:w="567"/>
+          </w:tcPr>
+          <w:p>
+            <w:r/>
+            <w:r>
+              <w:rPr>
+                <w:rFonts w:ascii="微軟正黑體" w:hAnsi="微軟正黑體" w:eastAsia="微軟正黑體"/>
+                <w:sz w:val="18"/>
+              </w:rPr>
               <w:t>2</w:t>
             </w:r>
           </w:p>
@@ -9544,21 +9570,6 @@
                 <w:rFonts w:ascii="微軟正黑體" w:hAnsi="微軟正黑體" w:eastAsia="微軟正黑體"/>
                 <w:sz w:val="18"/>
               </w:rPr>
-              <w:t>2</w:t>
-            </w:r>
-          </w:p>
-        </w:tc>
-        <w:tc>
-          <w:tcPr>
-            <w:tcW w:type="dxa" w:w="567"/>
-          </w:tcPr>
-          <w:p>
-            <w:r/>
-            <w:r>
-              <w:rPr>
-                <w:rFonts w:ascii="微軟正黑體" w:hAnsi="微軟正黑體" w:eastAsia="微軟正黑體"/>
-                <w:sz w:val="18"/>
-              </w:rPr>
               <w:t>3.5</w:t>
             </w:r>
           </w:p>
@@ -9574,7 +9585,7 @@
                 <w:rFonts w:ascii="微軟正黑體" w:hAnsi="微軟正黑體" w:eastAsia="微軟正黑體"/>
                 <w:sz w:val="18"/>
               </w:rPr>
-              <w:t>6.0</w:t>
+              <w:t>6.05</w:t>
             </w:r>
           </w:p>
         </w:tc>
@@ -9636,7 +9647,7 @@
                 <w:rFonts w:ascii="微軟正黑體" w:hAnsi="微軟正黑體" w:eastAsia="微軟正黑體"/>
                 <w:sz w:val="18"/>
               </w:rPr>
-              <w:t>🕯️ 還魂師</w:t>
+              <w:t>🏀 橡膠人</w:t>
             </w:r>
           </w:p>
         </w:tc>
@@ -9651,7 +9662,7 @@
                 <w:rFonts w:ascii="微軟正黑體" w:hAnsi="微軟正黑體" w:eastAsia="微軟正黑體"/>
                 <w:sz w:val="18"/>
               </w:rPr>
-              <w:t>復活續命</w:t>
+              <w:t>抗槍抗火箭</w:t>
             </w:r>
           </w:p>
         </w:tc>
@@ -9666,7 +9677,7 @@
                 <w:rFonts w:ascii="微軟正黑體" w:hAnsi="微軟正黑體" w:eastAsia="微軟正黑體"/>
                 <w:sz w:val="18"/>
               </w:rPr>
-              <w:t>5</w:t>
+              <w:t>4</w:t>
             </w:r>
           </w:p>
         </w:tc>
@@ -9681,7 +9692,7 @@
                 <w:rFonts w:ascii="微軟正黑體" w:hAnsi="微軟正黑體" w:eastAsia="微軟正黑體"/>
                 <w:sz w:val="18"/>
               </w:rPr>
-              <w:t>1.5</w:t>
+              <w:t>2</w:t>
             </w:r>
           </w:p>
         </w:tc>
@@ -9696,6 +9707,21 @@
                 <w:rFonts w:ascii="微軟正黑體" w:hAnsi="微軟正黑體" w:eastAsia="微軟正黑體"/>
                 <w:sz w:val="18"/>
               </w:rPr>
+              <w:t>3</w:t>
+            </w:r>
+          </w:p>
+        </w:tc>
+        <w:tc>
+          <w:tcPr>
+            <w:tcW w:type="dxa" w:w="567"/>
+          </w:tcPr>
+          <w:p>
+            <w:r/>
+            <w:r>
+              <w:rPr>
+                <w:rFonts w:ascii="微軟正黑體" w:hAnsi="微軟正黑體" w:eastAsia="微軟正黑體"/>
+                <w:sz w:val="18"/>
+              </w:rPr>
               <w:t>2</w:t>
             </w:r>
           </w:p>
@@ -9711,21 +9737,6 @@
                 <w:rFonts w:ascii="微軟正黑體" w:hAnsi="微軟正黑體" w:eastAsia="微軟正黑體"/>
                 <w:sz w:val="18"/>
               </w:rPr>
-              <w:t>2.5</w:t>
-            </w:r>
-          </w:p>
-        </w:tc>
-        <w:tc>
-          <w:tcPr>
-            <w:tcW w:type="dxa" w:w="567"/>
-          </w:tcPr>
-          <w:p>
-            <w:r/>
-            <w:r>
-              <w:rPr>
-                <w:rFonts w:ascii="微軟正黑體" w:hAnsi="微軟正黑體" w:eastAsia="微軟正黑體"/>
-                <w:sz w:val="18"/>
-              </w:rPr>
               <w:t>3.5</w:t>
             </w:r>
           </w:p>
@@ -9741,7 +9752,7 @@
                 <w:rFonts w:ascii="微軟正黑體" w:hAnsi="微軟正黑體" w:eastAsia="微軟正黑體"/>
                 <w:sz w:val="18"/>
               </w:rPr>
-              <w:t>5.95</w:t>
+              <w:t>6.0</w:t>
             </w:r>
           </w:p>
         </w:tc>
@@ -11120,7 +11131,7 @@
           <w:rFonts w:ascii="微軟正黑體" w:hAnsi="微軟正黑體" w:eastAsia="微軟正黑體"/>
           <w:b w:val="0"/>
         </w:rPr>
-        <w:t>16 位平均 5.85 分，最高與最低相差 2.95 分。</w:t>
+        <w:t>16 位平均 5.86 分，最高與最低相差 2.95 分。</w:t>
       </w:r>
     </w:p>
     <w:p>

</xml_diff>

<commit_message>
幸運兒: roll 4 = move two extra steps, roll 6 = heal 2, new 幸運重擲 (reroll on 2); update report
Co-Authored-By: Claude Sonnet 5.5 <noreply@anthropic.com>
</commit_message>
<xml_diff>
--- a/禁閉逃殺_實體模式16職業強度分析.docx
+++ b/禁閉逃殺_實體模式16職業強度分析.docx
@@ -6477,7 +6477,7 @@
         <w:pStyle w:val="Heading2"/>
       </w:pPr>
       <w:r>
-        <w:t>12. 🤷 庸才　｜　自救</w:t>
+        <w:t>12. 🍀 幸運兒　｜　運氣</w:t>
       </w:r>
     </w:p>
     <w:p>
@@ -6486,7 +6486,7 @@
           <w:rFonts w:ascii="微軟正黑體" w:hAnsi="微軟正黑體" w:eastAsia="微軟正黑體"/>
           <w:b/>
         </w:rPr>
-        <w:t>強度 5.15 分（C 級）　生存 3.5／資源 2／戰鬥 1.5／機動 2／穩定 3.5</w:t>
+        <w:t>強度 5.4 分（C 級）　生存 3.5／資源 2.5／戰鬥 2.5／機動 3／穩定 2</w:t>
       </w:r>
     </w:p>
     <w:p>
@@ -6576,7 +6576,7 @@
                 <w:rFonts w:ascii="微軟正黑體" w:hAnsi="微軟正黑體" w:eastAsia="微軟正黑體"/>
                 <w:sz w:val="18"/>
               </w:rPr>
-              <w:t>脆弱體質</w:t>
+              <w:t>吉星高照</w:t>
             </w:r>
           </w:p>
         </w:tc>
@@ -6606,7 +6606,7 @@
                 <w:rFonts w:ascii="微軟正黑體" w:hAnsi="微軟正黑體" w:eastAsia="微軟正黑體"/>
                 <w:sz w:val="18"/>
               </w:rPr>
-              <w:t>被火箭筒擊中時，最終傷害+1。</w:t>
+              <w:t>每輪輪到自己行動時，先自動擲骰：擲到1：本回合免疫所有傷害（戰鬥、毒氣、火箭筒等，飢餓仍需繳交水/糧），且本回合在房間抽取道具時多抽1張；擲到4：本回合可以多移動兩步，且本回合在房間抽取道具時多抽1張；擲到6：立即恢復2點生命（不超過上限）；擲到2可重擲（見幸運重擲）；擲到3、5沒有效果。</w:t>
             </w:r>
           </w:p>
         </w:tc>
@@ -6623,7 +6623,7 @@
                 <w:rFonts w:ascii="微軟正黑體" w:hAnsi="微軟正黑體" w:eastAsia="微軟正黑體"/>
                 <w:sz w:val="18"/>
               </w:rPr>
-              <w:t>斷尾求生</w:t>
+              <w:t>幸運重擲</w:t>
             </w:r>
           </w:p>
         </w:tc>
@@ -6638,7 +6638,7 @@
                 <w:rFonts w:ascii="微軟正黑體" w:hAnsi="微軟正黑體" w:eastAsia="微軟正黑體"/>
                 <w:sz w:val="18"/>
               </w:rPr>
-              <w:t>主動</w:t>
+              <w:t>被動</w:t>
             </w:r>
           </w:p>
         </w:tc>
@@ -6653,54 +6653,7 @@
                 <w:rFonts w:ascii="微軟正黑體" w:hAnsi="微軟正黑體" w:eastAsia="微軟正黑體"/>
                 <w:sz w:val="18"/>
               </w:rPr>
-              <w:t>整局限用3次：丟棄背包中1張道具，恢復2點生命。</w:t>
-            </w:r>
-          </w:p>
-        </w:tc>
-      </w:tr>
-      <w:tr>
-        <w:tc>
-          <w:tcPr>
-            <w:tcW w:type="dxa" w:w="1701"/>
-          </w:tcPr>
-          <w:p>
-            <w:r/>
-            <w:r>
-              <w:rPr>
-                <w:rFonts w:ascii="微軟正黑體" w:hAnsi="微軟正黑體" w:eastAsia="微軟正黑體"/>
-                <w:sz w:val="18"/>
-              </w:rPr>
-              <w:t>以命換命</w:t>
-            </w:r>
-          </w:p>
-        </w:tc>
-        <w:tc>
-          <w:tcPr>
-            <w:tcW w:type="dxa" w:w="1134"/>
-          </w:tcPr>
-          <w:p>
-            <w:r/>
-            <w:r>
-              <w:rPr>
-                <w:rFonts w:ascii="微軟正黑體" w:hAnsi="微軟正黑體" w:eastAsia="微軟正黑體"/>
-                <w:sz w:val="18"/>
-              </w:rPr>
-              <w:t>主動</w:t>
-            </w:r>
-          </w:p>
-        </w:tc>
-        <w:tc>
-          <w:tcPr>
-            <w:tcW w:type="dxa" w:w="6520"/>
-          </w:tcPr>
-          <w:p>
-            <w:r/>
-            <w:r>
-              <w:rPr>
-                <w:rFonts w:ascii="微軟正黑體" w:hAnsi="微軟正黑體" w:eastAsia="微軟正黑體"/>
-                <w:sz w:val="18"/>
-              </w:rPr>
-              <w:t>行動階段可使用：花1點生命，二選一：本輪負重+1，或本輪多1次抽卡機會（僅限本輪）。</w:t>
+              <w:t>吉星高照的骰子擲到2時，可以重擲，次數不限，以最後一次的結果為準。</w:t>
             </w:r>
           </w:p>
         </w:tc>
@@ -6723,7 +6676,7 @@
         <w:rPr>
           <w:rFonts w:ascii="微軟正黑體" w:hAnsi="微軟正黑體" w:eastAsia="微軟正黑體"/>
         </w:rPr>
-        <w:t>斷尾求生：丟棄任意1張道具（含垃圾）恢復2血，不超過10；3次共最多 +6 血，且和以命換命共用「每輪只能用一次主動技能」。丟棄的道具進入棄牌堆。</w:t>
+        <w:t>每輪行動「開始時」自動擲骰；擲到2時重擲（次數不限，重擲是沒有代價的選擇，所以程式自動執行），所以最後結果是 1、3、4、5、6 各 20%。</w:t>
       </w:r>
     </w:p>
     <w:p>
@@ -6734,7 +6687,7 @@
         <w:rPr>
           <w:rFonts w:ascii="微軟正黑體" w:hAnsi="微軟正黑體" w:eastAsia="微軟正黑體"/>
         </w:rPr>
-        <w:t>垃圾場每次進入平均只抽到約 1.1 個垃圾（見拾荒者說明），垃圾對他不是免費：庸才的垃圾也佔1格負重；用其他道具（如水、糧）換2血等於把1點飢餓損失換成2點回復（淨+1）。</w:t>
+        <w:t>擲到1（20%）：本輪免疫所有傷害（戰鬥、毒氣、火箭筒、暗影吸血、激光室等，唯一例外是飢餓），且房間搜索多抽1張；擲到4（20%）：本回合可以多移動兩步（步數上限10）且搜索多抽1張；擲到6（20%）：立即恢復2點生命（不超過上限）；擲到3、5（40%）：沒有效果。</w:t>
       </w:r>
     </w:p>
     <w:p>
@@ -6745,7 +6698,7 @@
         <w:rPr>
           <w:rFonts w:ascii="微軟正黑體" w:hAnsi="微軟正黑體" w:eastAsia="微軟正黑體"/>
         </w:rPr>
-        <w:t>以命換命：生命必須大於1；負重+1只限本輪；多1次抽卡＝這次搜索多抽 1 張（keepCap+1）；不是額外的房間行動。生命價值與水糧相同，所以在單一品項房間（水塔、糧倉）換到多1份水糧等於1血換1血，只有藥房等多品項房間可能淨賺。</w:t>
+        <w:t>因為擲骰在移動之前，他可以在擲到1的那一輪主動走進混戰或毒氣房間：自己免傷，但仍能以武力差傷害對手（損失只算在別人身上）。</w:t>
       </w:r>
     </w:p>
     <w:p>
@@ -6756,15 +6709,7 @@
         <w:rPr>
           <w:rFonts w:ascii="微軟正黑體" w:hAnsi="微軟正黑體" w:eastAsia="微軟正黑體"/>
         </w:rPr>
-        <w:t>脆弱體質：火箭筒傷害 4+1＝5（承受火箭筒的機率取決於場上是否有人持有）。</w:t>
-      </w:r>
-    </w:p>
-    <w:p>
-      <w:pPr>
-        <w:pStyle w:val="Heading3"/>
-      </w:pPr>
-      <w:r>
-        <w:t>優勢</w:t>
+        <w:t>回血在擲骰當下立刻生效（結算之前），所以滿血時浪費；第1輪必定滿血，實際有效的回血次數比擲到6的次數少。</w:t>
       </w:r>
     </w:p>
     <w:p>
@@ -6775,7 +6720,7 @@
         <w:rPr>
           <w:rFonts w:ascii="微軟正黑體" w:hAnsi="微軟正黑體" w:eastAsia="微軟正黑體"/>
         </w:rPr>
-        <w:t>3 次保底回復，不需要搶藥片；回復是使用當下立即生效（上限10），所以要在血量≤8時使用才不浪費。</w:t>
+        <w:t>6 輪中至少一輪免疫的機率 1−0.8^6≈73.8%；至少一輪多移動兩步同樣 73.8%；平均每局各約 1.2 輪。</w:t>
       </w:r>
     </w:p>
     <w:p>
@@ -6786,7 +6731,7 @@
         <w:rPr>
           <w:rFonts w:ascii="微軟正黑體" w:hAnsi="微軟正黑體" w:eastAsia="微軟正黑體"/>
         </w:rPr>
-        <w:t>沒有任何位置或房間限制；丟出的道具進入棄牌堆，可被工程師回收。</w:t>
+        <w:t>額外抽1張只適用房間搜索，不適用停機坪空投。免疫從擲骰起持續到當輪結算結束，下一輪開始時重置。</w:t>
       </w:r>
     </w:p>
     <w:p>
@@ -6794,7 +6739,7 @@
         <w:pStyle w:val="Heading3"/>
       </w:pPr>
       <w:r>
-        <w:t>弱點與風險</w:t>
+        <w:t>優勢</w:t>
       </w:r>
     </w:p>
     <w:p>
@@ -6805,7 +6750,7 @@
         <w:rPr>
           <w:rFonts w:ascii="微軟正黑體" w:hAnsi="微軟正黑體" w:eastAsia="微軟正黑體"/>
         </w:rPr>
-        <w:t>要消耗道具才能回血，沒有其他優勢；被火箭筒擊中損失更大。</w:t>
+        <w:t>被動、不占額度；免疫輪可以做出別人不敢做的進攻或搶位。</w:t>
       </w:r>
     </w:p>
     <w:p>
@@ -6816,7 +6761,7 @@
         <w:rPr>
           <w:rFonts w:ascii="微軟正黑體" w:hAnsi="微軟正黑體" w:eastAsia="微軟正黑體"/>
         </w:rPr>
-        <w:t>沒有任何進攻、移動、補給加成。</w:t>
+        <w:t>重擲讓每輪有效率提高到 60%（1、4、6），擲到好結果同時附送額外抽取或回血。</w:t>
       </w:r>
     </w:p>
     <w:p>
@@ -6824,7 +6769,7 @@
         <w:pStyle w:val="Heading3"/>
       </w:pPr>
       <w:r>
-        <w:t>規則內的反制</w:t>
+        <w:t>弱點與風險</w:t>
       </w:r>
     </w:p>
     <w:p>
@@ -6835,7 +6780,37 @@
         <w:rPr>
           <w:rFonts w:ascii="微軟正黑體" w:hAnsi="微軟正黑體" w:eastAsia="微軟正黑體"/>
         </w:rPr>
-        <w:t>火箭筒；無。</w:t>
+        <w:t>仍然有 40%（3、5）的輪次沒有任何加成；沒有任何防禦或補給的固定保障。</w:t>
+      </w:r>
+    </w:p>
+    <w:p>
+      <w:pPr>
+        <w:pStyle w:val="ListBullet"/>
+      </w:pPr>
+      <w:r>
+        <w:rPr>
+          <w:rFonts w:ascii="微軟正黑體" w:hAnsi="微軟正黑體" w:eastAsia="微軟正黑體"/>
+        </w:rPr>
+        <w:t>飢餓傷害不被免疫；回血在滿血時浪費。</w:t>
+      </w:r>
+    </w:p>
+    <w:p>
+      <w:pPr>
+        <w:pStyle w:val="Heading3"/>
+      </w:pPr>
+      <w:r>
+        <w:t>規則內的反制</w:t>
+      </w:r>
+    </w:p>
+    <w:p>
+      <w:pPr>
+        <w:pStyle w:val="ListBullet"/>
+      </w:pPr>
+      <w:r>
+        <w:rPr>
+          <w:rFonts w:ascii="微軟正黑體" w:hAnsi="微軟正黑體" w:eastAsia="微軟正黑體"/>
+        </w:rPr>
+        <w:t>無（免疫輪反而是別人的最大威脅）。</w:t>
       </w:r>
     </w:p>
     <w:p>
@@ -6867,7 +6842,7 @@
         <w:rPr>
           <w:rFonts w:ascii="微軟正黑體" w:hAnsi="微軟正黑體" w:eastAsia="微軟正黑體"/>
         </w:rPr>
-        <w:t>配點建議：武力2／速度4／負重4。出生點B402（垃圾場1步）。第1輪拿垃圾備用；血量≤8時才用斷尾（避免超過上限浪費）；第6輪最後一刻留1次補血。</w:t>
+        <w:t>配點建議：武力3／速度4／負重3。出生點依補給考慮。先看骰結果再決定去向：擲到1去人多、貴重的房間；擲到4搶遠處的功能房間；擲到6記得在受傷後才有回血價值；沒加成時走安全路線。</w:t>
       </w:r>
     </w:p>
     <w:p>
@@ -6875,7 +6850,7 @@
         <w:pStyle w:val="Heading2"/>
       </w:pPr>
       <w:r>
-        <w:t>13. ⚰️ 入殮師　｜　後期收割</w:t>
+        <w:t>13. 🤷 庸才　｜　自救</w:t>
       </w:r>
     </w:p>
     <w:p>
@@ -6884,7 +6859,7 @@
           <w:rFonts w:ascii="微軟正黑體" w:hAnsi="微軟正黑體" w:eastAsia="微軟正黑體"/>
           <w:b/>
         </w:rPr>
-        <w:t>強度 5.0 分（C 級）　生存 2.5／資源 3.5／戰鬥 1.5／機動 2／穩定 2.5</w:t>
+        <w:t>強度 5.15 分（C 級）　生存 3.5／資源 2／戰鬥 1.5／機動 2／穩定 3.5</w:t>
       </w:r>
     </w:p>
     <w:p>
@@ -6974,7 +6949,7 @@
                 <w:rFonts w:ascii="微軟正黑體" w:hAnsi="微軟正黑體" w:eastAsia="微軟正黑體"/>
                 <w:sz w:val="18"/>
               </w:rPr>
-              <w:t>蠱耗感應</w:t>
+              <w:t>脆弱體質</w:t>
             </w:r>
           </w:p>
         </w:tc>
@@ -7004,7 +6979,7 @@
                 <w:rFonts w:ascii="微軟正黑體" w:hAnsi="微軟正黑體" w:eastAsia="微軟正黑體"/>
                 <w:sz w:val="18"/>
               </w:rPr>
-              <w:t>每當有玩家變成暗影，你的負重永久+1。每位玩家死亡，其道具放入停屍間前，你都可隨機取走1張（不限每輪次數）；同一輪多人死亡，就從每位死者身上各取1張，負重也各+1。</w:t>
+              <w:t>被火箭筒擊中時，最終傷害+1。</w:t>
             </w:r>
           </w:p>
         </w:tc>
@@ -7021,7 +6996,7 @@
                 <w:rFonts w:ascii="微軟正黑體" w:hAnsi="微軟正黑體" w:eastAsia="微軟正黑體"/>
                 <w:sz w:val="18"/>
               </w:rPr>
-              <w:t>亡者遺贈</w:t>
+              <w:t>斷尾求生</w:t>
             </w:r>
           </w:p>
         </w:tc>
@@ -7051,7 +7026,54 @@
                 <w:rFonts w:ascii="微軟正黑體" w:hAnsi="微軟正黑體" w:eastAsia="微軟正黑體"/>
                 <w:sz w:val="18"/>
               </w:rPr>
-              <w:t>整局限用1次：道具放入停屍間前，可放棄隨機取得，改為自行指定1張。</w:t>
+              <w:t>整局限用3次：丟棄背包中1張道具，恢復2點生命。</w:t>
+            </w:r>
+          </w:p>
+        </w:tc>
+      </w:tr>
+      <w:tr>
+        <w:tc>
+          <w:tcPr>
+            <w:tcW w:type="dxa" w:w="1701"/>
+          </w:tcPr>
+          <w:p>
+            <w:r/>
+            <w:r>
+              <w:rPr>
+                <w:rFonts w:ascii="微軟正黑體" w:hAnsi="微軟正黑體" w:eastAsia="微軟正黑體"/>
+                <w:sz w:val="18"/>
+              </w:rPr>
+              <w:t>以命換命</w:t>
+            </w:r>
+          </w:p>
+        </w:tc>
+        <w:tc>
+          <w:tcPr>
+            <w:tcW w:type="dxa" w:w="1134"/>
+          </w:tcPr>
+          <w:p>
+            <w:r/>
+            <w:r>
+              <w:rPr>
+                <w:rFonts w:ascii="微軟正黑體" w:hAnsi="微軟正黑體" w:eastAsia="微軟正黑體"/>
+                <w:sz w:val="18"/>
+              </w:rPr>
+              <w:t>主動</w:t>
+            </w:r>
+          </w:p>
+        </w:tc>
+        <w:tc>
+          <w:tcPr>
+            <w:tcW w:type="dxa" w:w="6520"/>
+          </w:tcPr>
+          <w:p>
+            <w:r/>
+            <w:r>
+              <w:rPr>
+                <w:rFonts w:ascii="微軟正黑體" w:hAnsi="微軟正黑體" w:eastAsia="微軟正黑體"/>
+                <w:sz w:val="18"/>
+              </w:rPr>
+              <w:t>行動階段可使用：花1點生命，二選一：本輪負重+1，或本輪多1次抽卡機會（僅限本輪）。</w:t>
             </w:r>
           </w:p>
         </w:tc>
@@ -7074,7 +7096,7 @@
         <w:rPr>
           <w:rFonts w:ascii="微軟正黑體" w:hAnsi="微軟正黑體" w:eastAsia="微軟正黑體"/>
         </w:rPr>
-        <w:t>每次有人死亡（killPlayer，包含被還魂師復活的那次死亡），所有存活的入殮師負重+1，並從死者背包隨機取1件他裝得下的道具；其餘道具進入停屍間B701。死者在哪裡死都一樣，不需要到停屍間。</w:t>
+        <w:t>斷尾求生：丟棄任意1張道具（含垃圾）恢復2血，不超過10；3次共最多 +6 血，且和以命換命共用「每輪只能用一次主動技能」。丟棄的道具進入棄牌堆。</w:t>
       </w:r>
     </w:p>
     <w:p>
@@ -7085,7 +7107,7 @@
         <w:rPr>
           <w:rFonts w:ascii="微軟正黑體" w:hAnsi="微軟正黑體" w:eastAsia="微軟正黑體"/>
         </w:rPr>
-        <w:t>亡者遺贈需「事先」用一次主動技能啟動（占用當輪額度），之後第一個「有道具」的死者，他可改為自行指定1張；死者是空背包不會消耗。</w:t>
+        <w:t>垃圾場每次進入平均只抽到約 1.1 個垃圾（見拾荒者說明），垃圾對他不是免費：庸才的垃圾也佔1格負重；用其他道具（如水、糧）換2血等於把1點飢餓損失換成2點回復（淨+1）。</w:t>
       </w:r>
     </w:p>
     <w:p>
@@ -7096,7 +7118,7 @@
         <w:rPr>
           <w:rFonts w:ascii="微軟正黑體" w:hAnsi="微軟正黑體" w:eastAsia="微軟正黑體"/>
         </w:rPr>
-        <w:t>停屍間B701是功能房間（每次抽3張），庫存是所有死者的遺物，依道具種類均等抽取。</w:t>
+        <w:t>以命換命：生命必須大於1；負重+1只限本輪；多1次抽卡＝這次搜索多抽 1 張（keepCap+1）；不是額外的房間行動。生命價值與水糧相同，所以在單一品項房間（水塔、糧倉）換到多1份水糧等於1血換1血，只有藥房等多品項房間可能淨賺。</w:t>
       </w:r>
     </w:p>
     <w:p>
@@ -7107,7 +7129,7 @@
         <w:rPr>
           <w:rFonts w:ascii="微軟正黑體" w:hAnsi="微軟正黑體" w:eastAsia="微軟正黑體"/>
         </w:rPr>
-        <w:t>結算最後一步（第6輪結束後），金條會換成血；第6輪死者的道具他也能隨機取到，但除了期末可換血的金條，其他道具已來不及使用。</w:t>
+        <w:t>脆弱體質：火箭筒傷害 4+1＝5（承受火箭筒的機率取決於場上是否有人持有）。</w:t>
       </w:r>
     </w:p>
     <w:p>
@@ -7126,7 +7148,7 @@
         <w:rPr>
           <w:rFonts w:ascii="微軟正黑體" w:hAnsi="微軟正黑體" w:eastAsia="微軟正黑體"/>
         </w:rPr>
-        <w:t>每次死亡＝負重+1＋1張道具，後期負重增加讓他能帶更多水糧、藥片、武器。</w:t>
+        <w:t>3 次保底回復，不需要搶藥片；回復是使用當下立即生效（上限10），所以要在血量≤8時使用才不浪費。</w:t>
       </w:r>
     </w:p>
     <w:p>
@@ -7137,7 +7159,7 @@
         <w:rPr>
           <w:rFonts w:ascii="微軟正黑體" w:hAnsi="微軟正黑體" w:eastAsia="微軟正黑體"/>
         </w:rPr>
-        <w:t>可拿到槍械、藥片、金條等稀有道具。</w:t>
+        <w:t>沒有任何位置或房間限制；丟出的道具進入棄牌堆，可被工程師回收。</w:t>
       </w:r>
     </w:p>
     <w:p>
@@ -7156,7 +7178,7 @@
         <w:rPr>
           <w:rFonts w:ascii="微軟正黑體" w:hAnsi="微軟正黑體" w:eastAsia="微軟正黑體"/>
         </w:rPr>
-        <w:t>完全依賴他人死亡，且死亡集中在第4~6輪（毒氣每輪3~4點、飢餓每輪最多2點），早期沒有收益；第6輪死者取得的物品多半無法再使用。</w:t>
+        <w:t>要消耗道具才能回血，沒有其他優勢；被火箭筒擊中損失更大。</w:t>
       </w:r>
     </w:p>
     <w:p>
@@ -7167,7 +7189,15 @@
         <w:rPr>
           <w:rFonts w:ascii="微軟正黑體" w:hAnsi="微軟正黑體" w:eastAsia="微軟正黑體"/>
         </w:rPr>
-        <w:t>取得品項隨機，死者可能是空背包。</w:t>
+        <w:t>沒有任何進攻、移動、補給加成。</w:t>
+      </w:r>
+    </w:p>
+    <w:p>
+      <w:pPr>
+        <w:pStyle w:val="Heading3"/>
+      </w:pPr>
+      <w:r>
+        <w:t>規則內的反制</w:t>
       </w:r>
     </w:p>
     <w:p>
@@ -7178,26 +7208,7 @@
         <w:rPr>
           <w:rFonts w:ascii="微軟正黑體" w:hAnsi="微軟正黑體" w:eastAsia="微軟正黑體"/>
         </w:rPr>
-        <w:t>自己存活才有意義；與還魂師同局時，還魂師的死也會觸發。</w:t>
-      </w:r>
-    </w:p>
-    <w:p>
-      <w:pPr>
-        <w:pStyle w:val="Heading3"/>
-      </w:pPr>
-      <w:r>
-        <w:t>規則內的反制</w:t>
-      </w:r>
-    </w:p>
-    <w:p>
-      <w:pPr>
-        <w:pStyle w:val="ListBullet"/>
-      </w:pPr>
-      <w:r>
-        <w:rPr>
-          <w:rFonts w:ascii="微軟正黑體" w:hAnsi="微軟正黑體" w:eastAsia="微軟正黑體"/>
-        </w:rPr>
-        <w:t>沒有人死亡時沒有任何作用。</w:t>
+        <w:t>火箭筒；無。</w:t>
       </w:r>
     </w:p>
     <w:p>
@@ -7213,7 +7224,7 @@
         <w:rPr>
           <w:rFonts w:ascii="微軟正黑體" w:hAnsi="微軟正黑體" w:eastAsia="微軟正黑體"/>
         </w:rPr>
-        <w:t>人數越多死亡越多、收益越高；5人以下不建議。</w:t>
+        <w:t>人數中立。</w:t>
       </w:r>
     </w:p>
     <w:p>
@@ -7229,7 +7240,7 @@
         <w:rPr>
           <w:rFonts w:ascii="微軟正黑體" w:hAnsi="微軟正黑體" w:eastAsia="微軟正黑體"/>
         </w:rPr>
-        <w:t>配點建議：武力2／速度4／負重4。第1~3輪以生存與補給為主；第4輪起靠近高風險房間；亡者遺贈留給持槍或持有多張藥片的死者；第6輪若有死者持有金條，用亡者遺贈指定金條最有價值（期末換血）。</w:t>
+        <w:t>配點建議：武力2／速度4／負重4。出生點B402（垃圾場1步）。第1輪拿垃圾備用；血量≤8時才用斷尾（避免超過上限浪費）；第6輪最後一刻留1次補血。</w:t>
       </w:r>
     </w:p>
     <w:p>
@@ -7237,7 +7248,7 @@
         <w:pStyle w:val="Heading2"/>
       </w:pPr>
       <w:r>
-        <w:t>14. 🍀 幸運兒　｜　運氣</w:t>
+        <w:t>14. ⚰️ 入殮師　｜　後期收割</w:t>
       </w:r>
     </w:p>
     <w:p>
@@ -7246,7 +7257,7 @@
           <w:rFonts w:ascii="微軟正黑體" w:hAnsi="微軟正黑體" w:eastAsia="微軟正黑體"/>
           <w:b/>
         </w:rPr>
-        <w:t>強度 4.95 分（C 級）　生存 3／資源 2.5／戰鬥 2.5／機動 3／穩定 1.5</w:t>
+        <w:t>強度 5.0 分（C 級）　生存 2.5／資源 3.5／戰鬥 1.5／機動 2／穩定 2.5</w:t>
       </w:r>
     </w:p>
     <w:p>
@@ -7336,7 +7347,7 @@
                 <w:rFonts w:ascii="微軟正黑體" w:hAnsi="微軟正黑體" w:eastAsia="微軟正黑體"/>
                 <w:sz w:val="18"/>
               </w:rPr>
-              <w:t>吉星高照</w:t>
+              <w:t>蠱耗感應</w:t>
             </w:r>
           </w:p>
         </w:tc>
@@ -7366,7 +7377,54 @@
                 <w:rFonts w:ascii="微軟正黑體" w:hAnsi="微軟正黑體" w:eastAsia="微軟正黑體"/>
                 <w:sz w:val="18"/>
               </w:rPr>
-              <w:t>每輪輪到自己行動時，先自動擲骰：擲到1：本回合免疫所有傷害（戰鬥、毒氣、火箭筒等，飢餓仍需繳交水/糧），且本回合在房間抽取道具時多抽1張；擲到4：本回合移動速度+2，且本回合在房間抽取道具時多抽1張；其他點數沒有效果。</w:t>
+              <w:t>每當有玩家變成暗影，你的負重永久+1。每位玩家死亡，其道具放入停屍間前，你都可隨機取走1張（不限每輪次數）；同一輪多人死亡，就從每位死者身上各取1張，負重也各+1。</w:t>
+            </w:r>
+          </w:p>
+        </w:tc>
+      </w:tr>
+      <w:tr>
+        <w:tc>
+          <w:tcPr>
+            <w:tcW w:type="dxa" w:w="1701"/>
+          </w:tcPr>
+          <w:p>
+            <w:r/>
+            <w:r>
+              <w:rPr>
+                <w:rFonts w:ascii="微軟正黑體" w:hAnsi="微軟正黑體" w:eastAsia="微軟正黑體"/>
+                <w:sz w:val="18"/>
+              </w:rPr>
+              <w:t>亡者遺贈</w:t>
+            </w:r>
+          </w:p>
+        </w:tc>
+        <w:tc>
+          <w:tcPr>
+            <w:tcW w:type="dxa" w:w="1134"/>
+          </w:tcPr>
+          <w:p>
+            <w:r/>
+            <w:r>
+              <w:rPr>
+                <w:rFonts w:ascii="微軟正黑體" w:hAnsi="微軟正黑體" w:eastAsia="微軟正黑體"/>
+                <w:sz w:val="18"/>
+              </w:rPr>
+              <w:t>主動</w:t>
+            </w:r>
+          </w:p>
+        </w:tc>
+        <w:tc>
+          <w:tcPr>
+            <w:tcW w:type="dxa" w:w="6520"/>
+          </w:tcPr>
+          <w:p>
+            <w:r/>
+            <w:r>
+              <w:rPr>
+                <w:rFonts w:ascii="微軟正黑體" w:hAnsi="微軟正黑體" w:eastAsia="微軟正黑體"/>
+                <w:sz w:val="18"/>
+              </w:rPr>
+              <w:t>整局限用1次：道具放入停屍間前，可放棄隨機取得，改為自行指定1張。</w:t>
             </w:r>
           </w:p>
         </w:tc>
@@ -7389,7 +7447,7 @@
         <w:rPr>
           <w:rFonts w:ascii="微軟正黑體" w:hAnsi="微軟正黑體" w:eastAsia="微軟正黑體"/>
         </w:rPr>
-        <w:t>每輪行動「開始時」自動擲骰，擲到1（1/6）：本輪免疫所有傷害（戰鬥、毒氣、火箭筒、暗影吸血、激光室等，唯一例外是飢餓），且房間搜索多抽1張；擲到4（1/6）：移動步數+2（上限10）且搜索多抽1張；其他4/6沒有效果。</w:t>
+        <w:t>每次有人死亡（killPlayer，包含被還魂師復活的那次死亡），所有存活的入殮師負重+1，並從死者背包隨機取1件他裝得下的道具；其餘道具進入停屍間B701。死者在哪裡死都一樣，不需要到停屍間。</w:t>
       </w:r>
     </w:p>
     <w:p>
@@ -7400,7 +7458,7 @@
         <w:rPr>
           <w:rFonts w:ascii="微軟正黑體" w:hAnsi="微軟正黑體" w:eastAsia="微軟正黑體"/>
         </w:rPr>
-        <w:t>因為擲骰在移動之前，他可以在擲到1的那一輪主動走進混戰或毒氣房間：自己免傷，但仍能以武力差傷害對手（損失只算在別人身上）。</w:t>
+        <w:t>亡者遺贈需「事先」用一次主動技能啟動（占用當輪額度），之後第一個「有道具」的死者，他可改為自行指定1張；死者是空背包不會消耗。</w:t>
       </w:r>
     </w:p>
     <w:p>
@@ -7411,7 +7469,7 @@
         <w:rPr>
           <w:rFonts w:ascii="微軟正黑體" w:hAnsi="微軟正黑體" w:eastAsia="微軟正黑體"/>
         </w:rPr>
-        <w:t>6 輪中至少一輪免疫的機率 1−(5/6)^6≈66.5%；至少一輪+2速度同樣 66.5%；平均每局各約1輪。</w:t>
+        <w:t>停屍間B701是功能房間（每次抽3張），庫存是所有死者的遺物，依道具種類均等抽取。</w:t>
       </w:r>
     </w:p>
     <w:p>
@@ -7422,7 +7480,15 @@
         <w:rPr>
           <w:rFonts w:ascii="微軟正黑體" w:hAnsi="微軟正黑體" w:eastAsia="微軟正黑體"/>
         </w:rPr>
-        <w:t>額外抽1張只適用房間搜索，不適用停機坪空投。</w:t>
+        <w:t>結算最後一步（第6輪結束後），金條會換成血；第6輪死者的道具他也能隨機取到，但除了期末可換血的金條，其他道具已來不及使用。</w:t>
+      </w:r>
+    </w:p>
+    <w:p>
+      <w:pPr>
+        <w:pStyle w:val="Heading3"/>
+      </w:pPr>
+      <w:r>
+        <w:t>優勢</w:t>
       </w:r>
     </w:p>
     <w:p>
@@ -7433,15 +7499,7 @@
         <w:rPr>
           <w:rFonts w:ascii="微軟正黑體" w:hAnsi="微軟正黑體" w:eastAsia="微軟正黑體"/>
         </w:rPr>
-        <w:t>免疫從擲骰起持續到當輪結算結束，下一輪開始時重置。</w:t>
-      </w:r>
-    </w:p>
-    <w:p>
-      <w:pPr>
-        <w:pStyle w:val="Heading3"/>
-      </w:pPr>
-      <w:r>
-        <w:t>優勢</w:t>
+        <w:t>每次死亡＝負重+1＋1張道具，後期負重增加讓他能帶更多水糧、藥片、武器。</w:t>
       </w:r>
     </w:p>
     <w:p>
@@ -7452,7 +7510,15 @@
         <w:rPr>
           <w:rFonts w:ascii="微軟正黑體" w:hAnsi="微軟正黑體" w:eastAsia="微軟正黑體"/>
         </w:rPr>
-        <w:t>被動、不占額度；免疫輪可以做出別人不敢做的進攻或搶位。</w:t>
+        <w:t>可拿到槍械、藥片、金條等稀有道具。</w:t>
+      </w:r>
+    </w:p>
+    <w:p>
+      <w:pPr>
+        <w:pStyle w:val="Heading3"/>
+      </w:pPr>
+      <w:r>
+        <w:t>弱點與風險</w:t>
       </w:r>
     </w:p>
     <w:p>
@@ -7463,15 +7529,7 @@
         <w:rPr>
           <w:rFonts w:ascii="微軟正黑體" w:hAnsi="微軟正黑體" w:eastAsia="微軟正黑體"/>
         </w:rPr>
-        <w:t>擲到的好結果同時附送額外抽取。</w:t>
-      </w:r>
-    </w:p>
-    <w:p>
-      <w:pPr>
-        <w:pStyle w:val="Heading3"/>
-      </w:pPr>
-      <w:r>
-        <w:t>弱點與風險</w:t>
+        <w:t>完全依賴他人死亡，且死亡集中在第4~6輪（毒氣每輪3~4點、飢餓每輪最多2點），早期沒有收益；第6輪死者取得的物品多半無法再使用。</w:t>
       </w:r>
     </w:p>
     <w:p>
@@ -7482,7 +7540,7 @@
         <w:rPr>
           <w:rFonts w:ascii="微軟正黑體" w:hAnsi="微軟正黑體" w:eastAsia="微軟正黑體"/>
         </w:rPr>
-        <w:t>全靠運氣：每輪約 67% 沒有任何加成；沒有任何防禦或補給的固定保障。</w:t>
+        <w:t>取得品項隨機，死者可能是空背包。</w:t>
       </w:r>
     </w:p>
     <w:p>
@@ -7493,7 +7551,7 @@
         <w:rPr>
           <w:rFonts w:ascii="微軟正黑體" w:hAnsi="微軟正黑體" w:eastAsia="微軟正黑體"/>
         </w:rPr>
-        <w:t>飢餓傷害不被免疫。</w:t>
+        <w:t>自己存活才有意義；與還魂師同局時，還魂師的死也會觸發。</w:t>
       </w:r>
     </w:p>
     <w:p>
@@ -7512,7 +7570,7 @@
         <w:rPr>
           <w:rFonts w:ascii="微軟正黑體" w:hAnsi="微軟正黑體" w:eastAsia="微軟正黑體"/>
         </w:rPr>
-        <w:t>無（免疫輪反而是別人的最大威脅）。</w:t>
+        <w:t>沒有人死亡時沒有任何作用。</w:t>
       </w:r>
     </w:p>
     <w:p>
@@ -7528,7 +7586,7 @@
         <w:rPr>
           <w:rFonts w:ascii="微軟正黑體" w:hAnsi="微軟正黑體" w:eastAsia="微軟正黑體"/>
         </w:rPr>
-        <w:t>人數中立。</w:t>
+        <w:t>人數越多死亡越多、收益越高；5人以下不建議。</w:t>
       </w:r>
     </w:p>
     <w:p>
@@ -7544,7 +7602,7 @@
         <w:rPr>
           <w:rFonts w:ascii="微軟正黑體" w:hAnsi="微軟正黑體" w:eastAsia="微軟正黑體"/>
         </w:rPr>
-        <w:t>配點建議：武力3／速度4／負重3。出生點依補給考慮。先看骰結果再決定去向：擲到1去人多、貴重的房間；擲到4搶遠處的功能房間；沒加成時走安全路線。</w:t>
+        <w:t>配點建議：武力2／速度4／負重4。第1~3輪以生存與補給為主；第4輪起靠近高風險房間；亡者遺贈留給持槍或持有多張藥片的死者；第6輪若有死者持有金條，用亡者遺贈指定金條最有價值（期末換血）。</w:t>
       </w:r>
     </w:p>
     <w:p>
@@ -10315,7 +10373,7 @@
                 <w:rFonts w:ascii="微軟正黑體" w:hAnsi="微軟正黑體" w:eastAsia="微軟正黑體"/>
                 <w:sz w:val="18"/>
               </w:rPr>
-              <w:t>🤷 庸才</w:t>
+              <w:t>🍀 幸運兒</w:t>
             </w:r>
           </w:p>
         </w:tc>
@@ -10330,7 +10388,7 @@
                 <w:rFonts w:ascii="微軟正黑體" w:hAnsi="微軟正黑體" w:eastAsia="微軟正黑體"/>
                 <w:sz w:val="18"/>
               </w:rPr>
-              <w:t>自救</w:t>
+              <w:t>運氣</w:t>
             </w:r>
           </w:p>
         </w:tc>
@@ -10360,57 +10418,57 @@
                 <w:rFonts w:ascii="微軟正黑體" w:hAnsi="微軟正黑體" w:eastAsia="微軟正黑體"/>
                 <w:sz w:val="18"/>
               </w:rPr>
+              <w:t>2.5</w:t>
+            </w:r>
+          </w:p>
+        </w:tc>
+        <w:tc>
+          <w:tcPr>
+            <w:tcW w:type="dxa" w:w="567"/>
+          </w:tcPr>
+          <w:p>
+            <w:r/>
+            <w:r>
+              <w:rPr>
+                <w:rFonts w:ascii="微軟正黑體" w:hAnsi="微軟正黑體" w:eastAsia="微軟正黑體"/>
+                <w:sz w:val="18"/>
+              </w:rPr>
+              <w:t>2.5</w:t>
+            </w:r>
+          </w:p>
+        </w:tc>
+        <w:tc>
+          <w:tcPr>
+            <w:tcW w:type="dxa" w:w="567"/>
+          </w:tcPr>
+          <w:p>
+            <w:r/>
+            <w:r>
+              <w:rPr>
+                <w:rFonts w:ascii="微軟正黑體" w:hAnsi="微軟正黑體" w:eastAsia="微軟正黑體"/>
+                <w:sz w:val="18"/>
+              </w:rPr>
+              <w:t>3</w:t>
+            </w:r>
+          </w:p>
+        </w:tc>
+        <w:tc>
+          <w:tcPr>
+            <w:tcW w:type="dxa" w:w="567"/>
+          </w:tcPr>
+          <w:p>
+            <w:r/>
+            <w:r>
+              <w:rPr>
+                <w:rFonts w:ascii="微軟正黑體" w:hAnsi="微軟正黑體" w:eastAsia="微軟正黑體"/>
+                <w:sz w:val="18"/>
+              </w:rPr>
               <w:t>2</w:t>
             </w:r>
           </w:p>
         </w:tc>
         <w:tc>
           <w:tcPr>
-            <w:tcW w:type="dxa" w:w="567"/>
-          </w:tcPr>
-          <w:p>
-            <w:r/>
-            <w:r>
-              <w:rPr>
-                <w:rFonts w:ascii="微軟正黑體" w:hAnsi="微軟正黑體" w:eastAsia="微軟正黑體"/>
-                <w:sz w:val="18"/>
-              </w:rPr>
-              <w:t>1.5</w:t>
-            </w:r>
-          </w:p>
-        </w:tc>
-        <w:tc>
-          <w:tcPr>
-            <w:tcW w:type="dxa" w:w="567"/>
-          </w:tcPr>
-          <w:p>
-            <w:r/>
-            <w:r>
-              <w:rPr>
-                <w:rFonts w:ascii="微軟正黑體" w:hAnsi="微軟正黑體" w:eastAsia="微軟正黑體"/>
-                <w:sz w:val="18"/>
-              </w:rPr>
-              <w:t>2</w:t>
-            </w:r>
-          </w:p>
-        </w:tc>
-        <w:tc>
-          <w:tcPr>
-            <w:tcW w:type="dxa" w:w="567"/>
-          </w:tcPr>
-          <w:p>
-            <w:r/>
-            <w:r>
-              <w:rPr>
-                <w:rFonts w:ascii="微軟正黑體" w:hAnsi="微軟正黑體" w:eastAsia="微軟正黑體"/>
-                <w:sz w:val="18"/>
-              </w:rPr>
-              <w:t>3.5</w:t>
-            </w:r>
-          </w:p>
-        </w:tc>
-        <w:tc>
-          <w:tcPr>
             <w:tcW w:type="dxa" w:w="680"/>
           </w:tcPr>
           <w:p>
@@ -10420,7 +10478,7 @@
                 <w:rFonts w:ascii="微軟正黑體" w:hAnsi="微軟正黑體" w:eastAsia="微軟正黑體"/>
                 <w:sz w:val="18"/>
               </w:rPr>
-              <w:t>5.15</w:t>
+              <w:t>5.4</w:t>
             </w:r>
           </w:p>
         </w:tc>
@@ -10482,7 +10540,7 @@
                 <w:rFonts w:ascii="微軟正黑體" w:hAnsi="微軟正黑體" w:eastAsia="微軟正黑體"/>
                 <w:sz w:val="18"/>
               </w:rPr>
-              <w:t>⚰️ 入殮師</w:t>
+              <w:t>🤷 庸才</w:t>
             </w:r>
           </w:p>
         </w:tc>
@@ -10497,7 +10555,7 @@
                 <w:rFonts w:ascii="微軟正黑體" w:hAnsi="微軟正黑體" w:eastAsia="微軟正黑體"/>
                 <w:sz w:val="18"/>
               </w:rPr>
-              <w:t>後期收割</w:t>
+              <w:t>自救</w:t>
             </w:r>
           </w:p>
         </w:tc>
@@ -10512,7 +10570,7 @@
                 <w:rFonts w:ascii="微軟正黑體" w:hAnsi="微軟正黑體" w:eastAsia="微軟正黑體"/>
                 <w:sz w:val="18"/>
               </w:rPr>
-              <w:t>2.5</w:t>
+              <w:t>3.5</w:t>
             </w:r>
           </w:p>
         </w:tc>
@@ -10527,57 +10585,57 @@
                 <w:rFonts w:ascii="微軟正黑體" w:hAnsi="微軟正黑體" w:eastAsia="微軟正黑體"/>
                 <w:sz w:val="18"/>
               </w:rPr>
+              <w:t>2</w:t>
+            </w:r>
+          </w:p>
+        </w:tc>
+        <w:tc>
+          <w:tcPr>
+            <w:tcW w:type="dxa" w:w="567"/>
+          </w:tcPr>
+          <w:p>
+            <w:r/>
+            <w:r>
+              <w:rPr>
+                <w:rFonts w:ascii="微軟正黑體" w:hAnsi="微軟正黑體" w:eastAsia="微軟正黑體"/>
+                <w:sz w:val="18"/>
+              </w:rPr>
+              <w:t>1.5</w:t>
+            </w:r>
+          </w:p>
+        </w:tc>
+        <w:tc>
+          <w:tcPr>
+            <w:tcW w:type="dxa" w:w="567"/>
+          </w:tcPr>
+          <w:p>
+            <w:r/>
+            <w:r>
+              <w:rPr>
+                <w:rFonts w:ascii="微軟正黑體" w:hAnsi="微軟正黑體" w:eastAsia="微軟正黑體"/>
+                <w:sz w:val="18"/>
+              </w:rPr>
+              <w:t>2</w:t>
+            </w:r>
+          </w:p>
+        </w:tc>
+        <w:tc>
+          <w:tcPr>
+            <w:tcW w:type="dxa" w:w="567"/>
+          </w:tcPr>
+          <w:p>
+            <w:r/>
+            <w:r>
+              <w:rPr>
+                <w:rFonts w:ascii="微軟正黑體" w:hAnsi="微軟正黑體" w:eastAsia="微軟正黑體"/>
+                <w:sz w:val="18"/>
+              </w:rPr>
               <w:t>3.5</w:t>
             </w:r>
           </w:p>
         </w:tc>
         <w:tc>
           <w:tcPr>
-            <w:tcW w:type="dxa" w:w="567"/>
-          </w:tcPr>
-          <w:p>
-            <w:r/>
-            <w:r>
-              <w:rPr>
-                <w:rFonts w:ascii="微軟正黑體" w:hAnsi="微軟正黑體" w:eastAsia="微軟正黑體"/>
-                <w:sz w:val="18"/>
-              </w:rPr>
-              <w:t>1.5</w:t>
-            </w:r>
-          </w:p>
-        </w:tc>
-        <w:tc>
-          <w:tcPr>
-            <w:tcW w:type="dxa" w:w="567"/>
-          </w:tcPr>
-          <w:p>
-            <w:r/>
-            <w:r>
-              <w:rPr>
-                <w:rFonts w:ascii="微軟正黑體" w:hAnsi="微軟正黑體" w:eastAsia="微軟正黑體"/>
-                <w:sz w:val="18"/>
-              </w:rPr>
-              <w:t>2</w:t>
-            </w:r>
-          </w:p>
-        </w:tc>
-        <w:tc>
-          <w:tcPr>
-            <w:tcW w:type="dxa" w:w="567"/>
-          </w:tcPr>
-          <w:p>
-            <w:r/>
-            <w:r>
-              <w:rPr>
-                <w:rFonts w:ascii="微軟正黑體" w:hAnsi="微軟正黑體" w:eastAsia="微軟正黑體"/>
-                <w:sz w:val="18"/>
-              </w:rPr>
-              <w:t>2.5</w:t>
-            </w:r>
-          </w:p>
-        </w:tc>
-        <w:tc>
-          <w:tcPr>
             <w:tcW w:type="dxa" w:w="680"/>
           </w:tcPr>
           <w:p>
@@ -10587,7 +10645,7 @@
                 <w:rFonts w:ascii="微軟正黑體" w:hAnsi="微軟正黑體" w:eastAsia="微軟正黑體"/>
                 <w:sz w:val="18"/>
               </w:rPr>
-              <w:t>5.0</w:t>
+              <w:t>5.15</w:t>
             </w:r>
           </w:p>
         </w:tc>
@@ -10649,7 +10707,7 @@
                 <w:rFonts w:ascii="微軟正黑體" w:hAnsi="微軟正黑體" w:eastAsia="微軟正黑體"/>
                 <w:sz w:val="18"/>
               </w:rPr>
-              <w:t>🍀 幸運兒</w:t>
+              <w:t>⚰️ 入殮師</w:t>
             </w:r>
           </w:p>
         </w:tc>
@@ -10664,7 +10722,7 @@
                 <w:rFonts w:ascii="微軟正黑體" w:hAnsi="微軟正黑體" w:eastAsia="微軟正黑體"/>
                 <w:sz w:val="18"/>
               </w:rPr>
-              <w:t>運氣</w:t>
+              <w:t>後期收割</w:t>
             </w:r>
           </w:p>
         </w:tc>
@@ -10679,7 +10737,7 @@
                 <w:rFonts w:ascii="微軟正黑體" w:hAnsi="微軟正黑體" w:eastAsia="微軟正黑體"/>
                 <w:sz w:val="18"/>
               </w:rPr>
-              <w:t>3</w:t>
+              <w:t>2.5</w:t>
             </w:r>
           </w:p>
         </w:tc>
@@ -10694,57 +10752,57 @@
                 <w:rFonts w:ascii="微軟正黑體" w:hAnsi="微軟正黑體" w:eastAsia="微軟正黑體"/>
                 <w:sz w:val="18"/>
               </w:rPr>
+              <w:t>3.5</w:t>
+            </w:r>
+          </w:p>
+        </w:tc>
+        <w:tc>
+          <w:tcPr>
+            <w:tcW w:type="dxa" w:w="567"/>
+          </w:tcPr>
+          <w:p>
+            <w:r/>
+            <w:r>
+              <w:rPr>
+                <w:rFonts w:ascii="微軟正黑體" w:hAnsi="微軟正黑體" w:eastAsia="微軟正黑體"/>
+                <w:sz w:val="18"/>
+              </w:rPr>
+              <w:t>1.5</w:t>
+            </w:r>
+          </w:p>
+        </w:tc>
+        <w:tc>
+          <w:tcPr>
+            <w:tcW w:type="dxa" w:w="567"/>
+          </w:tcPr>
+          <w:p>
+            <w:r/>
+            <w:r>
+              <w:rPr>
+                <w:rFonts w:ascii="微軟正黑體" w:hAnsi="微軟正黑體" w:eastAsia="微軟正黑體"/>
+                <w:sz w:val="18"/>
+              </w:rPr>
+              <w:t>2</w:t>
+            </w:r>
+          </w:p>
+        </w:tc>
+        <w:tc>
+          <w:tcPr>
+            <w:tcW w:type="dxa" w:w="567"/>
+          </w:tcPr>
+          <w:p>
+            <w:r/>
+            <w:r>
+              <w:rPr>
+                <w:rFonts w:ascii="微軟正黑體" w:hAnsi="微軟正黑體" w:eastAsia="微軟正黑體"/>
+                <w:sz w:val="18"/>
+              </w:rPr>
               <w:t>2.5</w:t>
             </w:r>
           </w:p>
         </w:tc>
         <w:tc>
           <w:tcPr>
-            <w:tcW w:type="dxa" w:w="567"/>
-          </w:tcPr>
-          <w:p>
-            <w:r/>
-            <w:r>
-              <w:rPr>
-                <w:rFonts w:ascii="微軟正黑體" w:hAnsi="微軟正黑體" w:eastAsia="微軟正黑體"/>
-                <w:sz w:val="18"/>
-              </w:rPr>
-              <w:t>2.5</w:t>
-            </w:r>
-          </w:p>
-        </w:tc>
-        <w:tc>
-          <w:tcPr>
-            <w:tcW w:type="dxa" w:w="567"/>
-          </w:tcPr>
-          <w:p>
-            <w:r/>
-            <w:r>
-              <w:rPr>
-                <w:rFonts w:ascii="微軟正黑體" w:hAnsi="微軟正黑體" w:eastAsia="微軟正黑體"/>
-                <w:sz w:val="18"/>
-              </w:rPr>
-              <w:t>3</w:t>
-            </w:r>
-          </w:p>
-        </w:tc>
-        <w:tc>
-          <w:tcPr>
-            <w:tcW w:type="dxa" w:w="567"/>
-          </w:tcPr>
-          <w:p>
-            <w:r/>
-            <w:r>
-              <w:rPr>
-                <w:rFonts w:ascii="微軟正黑體" w:hAnsi="微軟正黑體" w:eastAsia="微軟正黑體"/>
-                <w:sz w:val="18"/>
-              </w:rPr>
-              <w:t>1.5</w:t>
-            </w:r>
-          </w:p>
-        </w:tc>
-        <w:tc>
-          <w:tcPr>
             <w:tcW w:type="dxa" w:w="680"/>
           </w:tcPr>
           <w:p>
@@ -10754,7 +10812,7 @@
                 <w:rFonts w:ascii="微軟正黑體" w:hAnsi="微軟正黑體" w:eastAsia="微軟正黑體"/>
                 <w:sz w:val="18"/>
               </w:rPr>
-              <w:t>4.95</w:t>
+              <w:t>5.0</w:t>
             </w:r>
           </w:p>
         </w:tc>
@@ -11131,7 +11189,7 @@
           <w:rFonts w:ascii="微軟正黑體" w:hAnsi="微軟正黑體" w:eastAsia="微軟正黑體"/>
           <w:b w:val="0"/>
         </w:rPr>
-        <w:t>16 位平均 5.86 分，最高與最低相差 2.95 分。</w:t>
+        <w:t>16 位平均 5.88 分，最高與最低相差 2.95 分。</w:t>
       </w:r>
     </w:p>
     <w:p>

</xml_diff>

<commit_message>
還魂師 安魂儀式 now only +1 speed after revival; AI picks spawn by profession; add 300-game AI sim section to report
Co-Authored-By: Claude Sonnet 5.5 <noreply@anthropic.com>
</commit_message>
<xml_diff>
--- a/禁閉逃殺_實體模式16職業強度分析.docx
+++ b/禁閉逃殺_實體模式16職業強度分析.docx
@@ -25,7 +25,7 @@
           <w:rFonts w:ascii="微軟正黑體" w:hAnsi="微軟正黑體" w:eastAsia="微軟正黑體"/>
           <w:b w:val="0"/>
         </w:rPr>
-        <w:t>本報告只依據遊戲規則本身推演：每一條「規則解讀」都對應 index.html 內的實際結算邏輯；數字（抽取機率、距離、平均步數）由同一份程式邏輯直接計算；不使用 AI 對戰模擬的勝率（AI 的決策不屬於規則），不評論規則以外的玩法或桌遊實體化細節。</w:t>
+        <w:t>本報告只依據遊戲規則本身推演：每一條「規則解讀」都對應 index.html 內的實際結算邏輯；數字（抽取機率、距離、平均步數）由同一份程式邏輯直接計算；評分以規則推演為準，不使用 AI 對戰勝率（AI 的決策不屬於規則）；第七章另附 300 場 AI 模擬作為參考對照；不評論規則以外的玩法或桌遊實體化細節。</w:t>
       </w:r>
     </w:p>
     <w:p>
@@ -42,7 +42,7 @@
           <w:rFonts w:ascii="微軟正黑體" w:hAnsi="微軟正黑體" w:eastAsia="微軟正黑體"/>
           <w:b w:val="0"/>
         </w:rPr>
-        <w:t>強度分數 1~10（相對評比，16 位平均約 5.7），由五個面向（各 1~5 分）加權換算：分數＝2×（生存×25%＋資源×25%＋戰鬥×20%＋機動×10%＋穩定×20%）。</w:t>
+        <w:t>強度分數 1~10（相對評比，16 位平均約 5.9），由五個面向（各 1~5 分）加權換算：分數＝2×（生存×25%＋資源×25%＋戰鬥×20%＋機動×10%＋穩定×20%）。</w:t>
       </w:r>
     </w:p>
     <w:tbl>
@@ -1041,7 +1041,7 @@
         <w:rPr>
           <w:rFonts w:ascii="微軟正黑體" w:hAnsi="微軟正黑體" w:eastAsia="微軟正黑體"/>
         </w:rPr>
-        <w:t>暗影可穿牆移動（每步到實體相鄰的房間），每輪步數＝死前的移動速度（不含腎上腺素），暗影階段不受任何傷害；靠暗影吸血復活的玩家，復活後的下一輪結算時免繳水糧、不受毒氣傷害（戰鬥仍有效）。結算時暗影對同房每個活人各吸1點；累積吸滿2點就復活（血量 max(3, 吸取數)）。暗影使者免疫吸血。</w:t>
+        <w:t>暗影可穿牆移動（每步到實體相鄰的房間），每輪步數＝死前的移動速度（不含腎上腺素），暗影階段不受任何傷害；靠暗影吸血復活的玩家，復活後的下一輪結算時免繳水糧、不受毒氣傷害（戰鬥仍有效）。結算時暗影對同房每個活人各吸1點；累積吸滿2點就在「吸血的那個房間」原地復活（血量 max(3, 吸取數)）。</w:t>
       </w:r>
     </w:p>
     <w:p>
@@ -3014,7 +3014,7 @@
                 <w:rFonts w:ascii="微軟正黑體" w:hAnsi="微軟正黑體" w:eastAsia="微軟正黑體"/>
                 <w:sz w:val="18"/>
               </w:rPr>
-              <w:t>你的果汁(酒)不佔負重，並初始擁有酒窖的2張果汁。使用前可剔除四種效果，再隨機抽取。</w:t>
+              <w:t>你的果汁(酒)不佔負重，並初始擁有酒窖的2張果汁。使用前可剔除四種效果（也可以不剔除；要剔除就必須剔除剛好四種），再隨機抽取。</w:t>
             </w:r>
           </w:p>
         </w:tc>
@@ -3061,7 +3061,7 @@
                 <w:rFonts w:ascii="微軟正黑體" w:hAnsi="微軟正黑體" w:eastAsia="微軟正黑體"/>
                 <w:sz w:val="18"/>
               </w:rPr>
-              <w:t>道具使用階段，你的果汁可對其他存活玩家使用（同樣可先剔除四種效果）；其他玩家也可把酒交給你，請你代為調製。</w:t>
+              <w:t>道具使用階段，你的果汁可對其他存活玩家使用（同樣可先剔除四種效果，也可不剔除）；其他玩家也可把酒交給你，請你代為調製。</w:t>
             </w:r>
           </w:p>
         </w:tc>
@@ -3147,7 +3147,7 @@
         <w:rPr>
           <w:rFonts w:ascii="微軟正黑體" w:hAnsi="微軟正黑體" w:eastAsia="微軟正黑體"/>
         </w:rPr>
-        <w:t>開局就有 2 瓶，第1輪不需要任何移動即可喝完，換成永久屬性（等同基因怪人多出的 2 點，但可選屬性）。</w:t>
+        <w:t>開局就有 2 瓶，第1輪移動並確定停留的房間後就能喝完（宣告使用需先確定停留），換成永久屬性（等同基因怪人多出的 2 點，但可選屬性）。</w:t>
       </w:r>
     </w:p>
     <w:p>
@@ -4482,7 +4482,7 @@
         <w:rPr>
           <w:rFonts w:ascii="微軟正黑體" w:hAnsi="微軟正黑體" w:eastAsia="微軟正黑體"/>
         </w:rPr>
-        <w:t>進入棄牌堆的來源（程式實際行為）：被使用掉的水、糧、水糧包、腎上腺素、藥片、酒、金條，庸才丟棄的道具，抽取後整理背包時被捨棄的原有道具，郵差超載被強制丟棄的道具等。</w:t>
+        <w:t>進入棄牌堆的來源（程式實際行為）：被使用掉的水、糧、水糧包、腎上腺素、藥片、酒、金條，庸才丟棄的道具，抽取後整理背包時被捨棄的原有道具等。</w:t>
       </w:r>
     </w:p>
     <w:p>
@@ -4656,7 +4656,7 @@
         <w:pStyle w:val="Heading2"/>
       </w:pPr>
       <w:r>
-        <w:t>7. 🕯️ 還魂師　｜　復活續命</w:t>
+        <w:t>7. 🏀 橡膠人　｜　抗槍抗火箭</w:t>
       </w:r>
     </w:p>
     <w:p>
@@ -4665,7 +4665,7 @@
           <w:rFonts w:ascii="微軟正黑體" w:hAnsi="微軟正黑體" w:eastAsia="微軟正黑體"/>
           <w:b/>
         </w:rPr>
-        <w:t>強度 6.05 分（B 級）　生存 5／資源 1.5／戰鬥 2／機動 3／穩定 3.5</w:t>
+        <w:t>強度 6.0 分（B 級）　生存 4／資源 2／戰鬥 3／機動 2／穩定 3.5</w:t>
       </w:r>
     </w:p>
     <w:p>
@@ -4755,7 +4755,7 @@
                 <w:rFonts w:ascii="微軟正黑體" w:hAnsi="微軟正黑體" w:eastAsia="微軟正黑體"/>
                 <w:sz w:val="18"/>
               </w:rPr>
-              <w:t>臨終祝禱</w:t>
+              <w:t>橡膠身軀</w:t>
             </w:r>
           </w:p>
         </w:tc>
@@ -4785,7 +4785,7 @@
                 <w:rFonts w:ascii="微軟正黑體" w:hAnsi="微軟正黑體" w:eastAsia="微軟正黑體"/>
                 <w:sz w:val="18"/>
               </w:rPr>
-              <w:t>死亡成為暗影時，吸血所需總量降為1點即可復活（整局可發動兩次，復活後血量為3）。</w:t>
+              <w:t>槍械傷害永久-4；但你無法持有槍（手槍／霰彈槍）：抽到槍時放回房間，並補抽一張（不可獲得槍）。</w:t>
             </w:r>
           </w:p>
         </w:tc>
@@ -4802,7 +4802,7 @@
                 <w:rFonts w:ascii="微軟正黑體" w:hAnsi="微軟正黑體" w:eastAsia="微軟正黑體"/>
                 <w:sz w:val="18"/>
               </w:rPr>
-              <w:t>安魂儀式</w:t>
+              <w:t>彈力緩衝</w:t>
             </w:r>
           </w:p>
         </w:tc>
@@ -4832,7 +4832,7 @@
                 <w:rFonts w:ascii="微軟正黑體" w:hAnsi="微軟正黑體" w:eastAsia="微軟正黑體"/>
                 <w:sz w:val="18"/>
               </w:rPr>
-              <w:t>死亡瞬間自動發動：立刻復活並恢復至5血，復活後速度永久+1。整局限用1次，第6輪（最後一輪）死亡不觸發。</w:t>
+              <w:t>無視火箭筒傷害。</w:t>
             </w:r>
           </w:p>
         </w:tc>
@@ -4855,7 +4855,7 @@
         <w:rPr>
           <w:rFonts w:ascii="微軟正黑體" w:hAnsi="微軟正黑體" w:eastAsia="微軟正黑體"/>
         </w:rPr>
-        <w:t>安魂儀式：第1~5輪死亡的瞬間，立刻以 5 血復活（killPlayer→exorcistAutoRevive）。此時背包已被清空並掉入停屍間B701，他本人也被移到B701；同一次結算後面的毒氣、飢餓仍會對他生效（已宣告的水糧仍算數）。</w:t>
+        <w:t>槍械傷害-4：只在「對手持槍」的戰鬥中扣減（reduce：d−4，最低0）；對手的武力若≤4，戰鬥傷害完全歸零。</w:t>
       </w:r>
     </w:p>
     <w:p>
@@ -4866,7 +4866,7 @@
         <w:rPr>
           <w:rFonts w:ascii="微軟正黑體" w:hAnsi="微軟正黑體" w:eastAsia="微軟正黑體"/>
         </w:rPr>
-        <w:t>安魂儀式復活後速度永久+1，之後每輪步數與暗影階段的步數（死前速度）都多1，也有助於從B701走回功能房間。</w:t>
+        <w:t>無視火箭筒：火箭筒的4點傷害對他為0（全場只有1把，位於垃圾場B503，首位進入者約 40% 抽到）。</w:t>
       </w:r>
     </w:p>
     <w:p>
@@ -4877,7 +4877,7 @@
         <w:rPr>
           <w:rFonts w:ascii="微軟正黑體" w:hAnsi="微軟正黑體" w:eastAsia="微軟正黑體"/>
         </w:rPr>
-        <w:t>臨終祝禱：成為暗影後，只要吸到 1 點生命就復活（一般暗影需2點），復活血量為 max(3, 吸取總量)＝3；整局可用2次。暗影可穿牆移動（每步到實體相鄰的房間），每輪步數＝死前的移動速度（不含腎上腺素加成）；以死亡位置B701起算，速度5時約可到達24間房。結算時對同房的每個活人各吸1點，所以要在步數內找到有活人的房間。</w:t>
+        <w:t>抽到槍時放回並補抽非槍：武器庫只有刀／手槍／霰彈槍三種，他每次抽取實際上都得到刀（因為槍會被替換成非槍種類，也就是刀），所以每次進武器庫最多拿 2 把刀。</w:t>
       </w:r>
     </w:p>
     <w:p>
@@ -4888,7 +4888,15 @@
         <w:rPr>
           <w:rFonts w:ascii="微軟正黑體" w:hAnsi="微軟正黑體" w:eastAsia="微軟正黑體"/>
         </w:rPr>
-        <w:t>基本規則（所有玩家都適用，不是還魂師專屬）：暗影階段不受任何傷害；暗影吸血與復活排在結算的毒氣、飢餓之後，所以暗影復活的那一輪不用繳水糧、也不怕毒氣；而靠吸血復活的玩家，在「復活後的下一輪」結算時同樣免繳水糧、不受毒氣傷害（戰鬥仍有效）。例：第1輪結算復活，第2輪結算不用繳水糧、也不怕毒氣。還魂師的獨特處是復活只需吸1點（一般2點）且最多可復活兩次，再加上安魂儀式的5血；安魂儀式（戰鬥中途復活）不屬於吸血復活，之後的毒氣與飢餓仍然生效。</w:t>
+        <w:t>他永遠不持槍：面對持槍者永遠是被單方面壓制（受到對方全武力再減4），無法反擊。</w:t>
+      </w:r>
+    </w:p>
+    <w:p>
+      <w:pPr>
+        <w:pStyle w:val="Heading3"/>
+      </w:pPr>
+      <w:r>
+        <w:t>優勢</w:t>
       </w:r>
     </w:p>
     <w:p>
@@ -4899,7 +4907,7 @@
         <w:rPr>
           <w:rFonts w:ascii="微軟正黑體" w:hAnsi="微軟正黑體" w:eastAsia="微軟正黑體"/>
         </w:rPr>
-        <w:t>最多 3 次復活機會：1次安魂（5血）＋2次祝禱（3血）；第6輪死亡不會觸發安魂，但暗影吸血仍可在第6輪結算時復活。</w:t>
+        <w:t>對最大傷害來源（槍械）與最大範圍傷害（火箭筒）有硬減免；越到後期槍越多、火箭筒越可能被使用，價值越高。</w:t>
       </w:r>
     </w:p>
     <w:p>
@@ -4910,7 +4918,15 @@
         <w:rPr>
           <w:rFonts w:ascii="微軟正黑體" w:hAnsi="微軟正黑體" w:eastAsia="微軟正黑體"/>
         </w:rPr>
-        <w:t>期末排名看最終血量：第6輪結算時復活的暗影以 3 血計算，高於一般死者的 0。</w:t>
+        <w:t>被動技能，不占主動技能額度。</w:t>
+      </w:r>
+    </w:p>
+    <w:p>
+      <w:pPr>
+        <w:pStyle w:val="Heading3"/>
+      </w:pPr>
+      <w:r>
+        <w:t>弱點與風險</w:t>
       </w:r>
     </w:p>
     <w:p>
@@ -4921,15 +4937,7 @@
         <w:rPr>
           <w:rFonts w:ascii="微軟正黑體" w:hAnsi="微軟正黑體" w:eastAsia="微軟正黑體"/>
         </w:rPr>
-        <w:t>復活後回到B701（最底層深處），背包全空，要從B701庫存（3張/次）重新取回自己的遺物。</w:t>
-      </w:r>
-    </w:p>
-    <w:p>
-      <w:pPr>
-        <w:pStyle w:val="Heading3"/>
-      </w:pPr>
-      <w:r>
-        <w:t>優勢</w:t>
+        <w:t>完全沒有補給、回復或機動；對毒氣、飢餓、無槍戰鬥沒有任何增益。</w:t>
       </w:r>
     </w:p>
     <w:p>
@@ -4940,7 +4948,15 @@
         <w:rPr>
           <w:rFonts w:ascii="微軟正黑體" w:hAnsi="微軟正黑體" w:eastAsia="微軟正黑體"/>
         </w:rPr>
-        <w:t>復活條件比別人低（吸1點即可，一般暗影需2點；可復活兩次），所以能比別人更常、更快地享有「暗影階段與復活後下一輪免繳水糧、免毒氣」這個基本規則——保護人人都有，但他最容易觸發；全是被動，不需要任何宣告就能在致命時刻救回；在毒氣與飢餓使死亡集中於中後期時最能發揮。</w:t>
+        <w:t>無法持槍，輸出上限被刀與雙刀限制，也無法利用槍的單方面優勢。</w:t>
+      </w:r>
+    </w:p>
+    <w:p>
+      <w:pPr>
+        <w:pStyle w:val="Heading3"/>
+      </w:pPr>
+      <w:r>
+        <w:t>規則內的反制</w:t>
       </w:r>
     </w:p>
     <w:p>
@@ -4951,78 +4967,7 @@
         <w:rPr>
           <w:rFonts w:ascii="微軟正黑體" w:hAnsi="微軟正黑體" w:eastAsia="微軟正黑體"/>
         </w:rPr>
-        <w:t>死後是暗影，仍可穿牆走位（不受梯子與走廊限制），但步數只有死前的移動速度。</w:t>
-      </w:r>
-    </w:p>
-    <w:p>
-      <w:pPr>
-        <w:pStyle w:val="Heading3"/>
-      </w:pPr>
-      <w:r>
-        <w:t>弱點與風險</w:t>
-      </w:r>
-    </w:p>
-    <w:p>
-      <w:pPr>
-        <w:pStyle w:val="ListBullet"/>
-      </w:pPr>
-      <w:r>
-        <w:rPr>
-          <w:rFonts w:ascii="微軟正黑體" w:hAnsi="微軟正黑體" w:eastAsia="微軟正黑體"/>
-        </w:rPr>
-        <w:t>沒有死就沒有任何收益；復活後只有 5 或 3 血，且要立刻面對毒氣與飢餓。</w:t>
-      </w:r>
-    </w:p>
-    <w:p>
-      <w:pPr>
-        <w:pStyle w:val="ListBullet"/>
-      </w:pPr>
-      <w:r>
-        <w:rPr>
-          <w:rFonts w:ascii="微軟正黑體" w:hAnsi="微軟正黑體" w:eastAsia="微軟正黑體"/>
-        </w:rPr>
-        <w:t>復活後背包全空、人在B701，要花一輪以上的時間回到功能房間。</w:t>
-      </w:r>
-    </w:p>
-    <w:p>
-      <w:pPr>
-        <w:pStyle w:val="ListBullet"/>
-      </w:pPr>
-      <w:r>
-        <w:rPr>
-          <w:rFonts w:ascii="微軟正黑體" w:hAnsi="微軟正黑體" w:eastAsia="微軟正黑體"/>
-        </w:rPr>
-        <w:t>暗影吸血要有活人在同一房間；第6輪死亡幾乎無救。</w:t>
-      </w:r>
-    </w:p>
-    <w:p>
-      <w:pPr>
-        <w:pStyle w:val="ListBullet"/>
-      </w:pPr>
-      <w:r>
-        <w:rPr>
-          <w:rFonts w:ascii="微軟正黑體" w:hAnsi="微軟正黑體" w:eastAsia="微軟正黑體"/>
-        </w:rPr>
-        <w:t>入殮師若同局，會在他死亡時拿走他一張道具並加負重。</w:t>
-      </w:r>
-    </w:p>
-    <w:p>
-      <w:pPr>
-        <w:pStyle w:val="Heading3"/>
-      </w:pPr>
-      <w:r>
-        <w:t>規則內的反制</w:t>
-      </w:r>
-    </w:p>
-    <w:p>
-      <w:pPr>
-        <w:pStyle w:val="ListBullet"/>
-      </w:pPr>
-      <w:r>
-        <w:rPr>
-          <w:rFonts w:ascii="微軟正黑體" w:hAnsi="微軟正黑體" w:eastAsia="微軟正黑體"/>
-        </w:rPr>
-        <w:t>第6輪被擊殺時安魂儀式不觸發；入殮師同局時，他死亡會被取走1張道具。</w:t>
+        <w:t>無槍的高武力玩家（刀＋高基礎武力）：槍械減傷對他無效。</w:t>
       </w:r>
     </w:p>
     <w:p>
@@ -5038,7 +4983,7 @@
         <w:rPr>
           <w:rFonts w:ascii="微軟正黑體" w:hAnsi="微軟正黑體" w:eastAsia="微軟正黑體"/>
         </w:rPr>
-        <w:t>人數越多死亡越多，保險價值越高。</w:t>
+        <w:t>人數越多、槍械被使用的機會越多（全場6把槍），減傷價值越高；5人以下價值明顯下降。</w:t>
       </w:r>
     </w:p>
     <w:p>
@@ -5054,7 +4999,7 @@
         <w:rPr>
           <w:rFonts w:ascii="微軟正黑體" w:hAnsi="微軟正黑體" w:eastAsia="微軟正黑體"/>
         </w:rPr>
-        <w:t>配點建議：武力3／速度4／負重3。出生點B603（到B701 2步、到酒窖2步）。第1~3輪可以較冒險；安魂用掉後馬上到B701取回遺物，補水糧；暗影階段在步數內優先走進水塔、糧倉、大倉庫這類有人的房間（步數＝死前速度，所以配點時速度太低會讓暗影難以找人）。</w:t>
+        <w:t>配點建議：武力3／速度4／負重3。出生點依補給考慮。第1輪可進武器庫拿2把刀；之後避免被持槍者堵在功能房間，但遇到持槍者不必逃：傷害＝其武力−4。</w:t>
       </w:r>
     </w:p>
     <w:p>
@@ -5062,7 +5007,7 @@
         <w:pStyle w:val="Heading2"/>
       </w:pPr>
       <w:r>
-        <w:t>8. 🏀 橡膠人　｜　抗槍抗火箭</w:t>
+        <w:t>8. 🧬 基因怪人　｜　彈性成長</w:t>
       </w:r>
     </w:p>
     <w:p>
@@ -5071,7 +5016,7 @@
           <w:rFonts w:ascii="微軟正黑體" w:hAnsi="微軟正黑體" w:eastAsia="微軟正黑體"/>
           <w:b/>
         </w:rPr>
-        <w:t>強度 6.0 分（B 級）　生存 4／資源 2／戰鬥 3／機動 2／穩定 3.5</w:t>
+        <w:t>強度 5.9 分（B 級）　生存 2／資源 3／戰鬥 3／機動 3／穩定 4</w:t>
       </w:r>
     </w:p>
     <w:p>
@@ -5161,7 +5106,7 @@
                 <w:rFonts w:ascii="微軟正黑體" w:hAnsi="微軟正黑體" w:eastAsia="微軟正黑體"/>
                 <w:sz w:val="18"/>
               </w:rPr>
-              <w:t>橡膠身軀</w:t>
+              <w:t>先天優勢</w:t>
             </w:r>
           </w:p>
         </w:tc>
@@ -5191,7 +5136,7 @@
                 <w:rFonts w:ascii="微軟正黑體" w:hAnsi="微軟正黑體" w:eastAsia="微軟正黑體"/>
                 <w:sz w:val="18"/>
               </w:rPr>
-              <w:t>槍械傷害永久-4；但你無法持有槍（手槍／霰彈槍）：抽到槍時放回房間，並補抽一張（不可獲得槍）。</w:t>
+              <w:t>初始可分配基因點數12點，武力上限5點。</w:t>
             </w:r>
           </w:p>
         </w:tc>
@@ -5208,7 +5153,7 @@
                 <w:rFonts w:ascii="微軟正黑體" w:hAnsi="微軟正黑體" w:eastAsia="微軟正黑體"/>
                 <w:sz w:val="18"/>
               </w:rPr>
-              <w:t>彈力緩衝</w:t>
+              <w:t>基因重組</w:t>
             </w:r>
           </w:p>
         </w:tc>
@@ -5223,7 +5168,7 @@
                 <w:rFonts w:ascii="微軟正黑體" w:hAnsi="微軟正黑體" w:eastAsia="微軟正黑體"/>
                 <w:sz w:val="18"/>
               </w:rPr>
-              <w:t>被動</w:t>
+              <w:t>主動</w:t>
             </w:r>
           </w:p>
         </w:tc>
@@ -5238,7 +5183,7 @@
                 <w:rFonts w:ascii="微軟正黑體" w:hAnsi="微軟正黑體" w:eastAsia="微軟正黑體"/>
                 <w:sz w:val="18"/>
               </w:rPr>
-              <w:t>無視火箭筒傷害。</w:t>
+              <w:t>技能使用階段可重新分配點數。整局限用2次。</w:t>
             </w:r>
           </w:p>
         </w:tc>
@@ -5261,7 +5206,7 @@
         <w:rPr>
           <w:rFonts w:ascii="微軟正黑體" w:hAnsi="微軟正黑體" w:eastAsia="微軟正黑體"/>
         </w:rPr>
-        <w:t>槍械傷害-4：只在「對手持槍」的戰鬥中扣減（reduce：d−4，最低0）；對手的武力若≤4，戰鬥傷害完全歸零。</w:t>
+        <w:t>開局可分配12點（一般玩家10點），武力上限5。基因庫（每次三項各+1）與操作室B304（重新分配）是所有人都能用的功能房間，沒有使用次數限制。</w:t>
       </w:r>
     </w:p>
     <w:p>
@@ -5272,7 +5217,7 @@
         <w:rPr>
           <w:rFonts w:ascii="微軟正黑體" w:hAnsi="微軟正黑體" w:eastAsia="微軟正黑體"/>
         </w:rPr>
-        <w:t>無視火箭筒：火箭筒的4點傷害對他為0（全場只有1把，位於垃圾場B503，首位進入者約 40% 抽到）。</w:t>
+        <w:t>基因重組：可在技能階段隨時把「目前實際擁有的總點數」重新分配（包含基因庫、酒的加成）；速度會以不含腎上腺素加成的基礎速度計算，武力仍不能超過5。</w:t>
       </w:r>
     </w:p>
     <w:p>
@@ -5283,7 +5228,15 @@
         <w:rPr>
           <w:rFonts w:ascii="微軟正黑體" w:hAnsi="微軟正黑體" w:eastAsia="微軟正黑體"/>
         </w:rPr>
-        <w:t>抽到槍時放回並補抽非槍：武器庫只有刀／手槍／霰彈槍三種，他每次抽取實際上都得到刀（因為槍會被替換成非槍種類，也就是刀），所以每次進武器庫最多拿 2 把刀。</w:t>
+        <w:t>他的獨特價值＝多出 2 點屬性＋2 次不必跑去操作室B304的重新分配；但基因庫一次使用就是+3點，是所有人都有的更大成長來源。</w:t>
+      </w:r>
+    </w:p>
+    <w:p>
+      <w:pPr>
+        <w:pStyle w:val="Heading3"/>
+      </w:pPr>
+      <w:r>
+        <w:t>優勢</w:t>
       </w:r>
     </w:p>
     <w:p>
@@ -5294,15 +5247,7 @@
         <w:rPr>
           <w:rFonts w:ascii="微軟正黑體" w:hAnsi="微軟正黑體" w:eastAsia="微軟正黑體"/>
         </w:rPr>
-        <w:t>他永遠不持槍：面對持槍者永遠是被單方面壓制（受到對方全武力再減4），無法反擊。</w:t>
-      </w:r>
-    </w:p>
-    <w:p>
-      <w:pPr>
-        <w:pStyle w:val="Heading3"/>
-      </w:pPr>
-      <w:r>
-        <w:t>優勢</w:t>
+        <w:t>多 2 點永久屬性，沒有任何觸發條件。</w:t>
       </w:r>
     </w:p>
     <w:p>
@@ -5313,7 +5258,15 @@
         <w:rPr>
           <w:rFonts w:ascii="微軟正黑體" w:hAnsi="微軟正黑體" w:eastAsia="微軟正黑體"/>
         </w:rPr>
-        <w:t>對最大傷害來源（槍械）與最大範圍傷害（火箭筒）有硬減免；越到後期槍越多、火箭筒越可能被使用，價值越高。</w:t>
+        <w:t>可根據局勢把點數轉成速度（搶補給或逃毒氣）或負重（帶水糧）。</w:t>
+      </w:r>
+    </w:p>
+    <w:p>
+      <w:pPr>
+        <w:pStyle w:val="Heading3"/>
+      </w:pPr>
+      <w:r>
+        <w:t>弱點與風險</w:t>
       </w:r>
     </w:p>
     <w:p>
@@ -5324,15 +5277,7 @@
         <w:rPr>
           <w:rFonts w:ascii="微軟正黑體" w:hAnsi="微軟正黑體" w:eastAsia="微軟正黑體"/>
         </w:rPr>
-        <w:t>被動技能，不占主動技能額度。</w:t>
-      </w:r>
-    </w:p>
-    <w:p>
-      <w:pPr>
-        <w:pStyle w:val="Heading3"/>
-      </w:pPr>
-      <w:r>
-        <w:t>弱點與風險</w:t>
+        <w:t>沒有回復、防禦、補給或位移加成；武力上限5。</w:t>
       </w:r>
     </w:p>
     <w:p>
@@ -5343,7 +5288,15 @@
         <w:rPr>
           <w:rFonts w:ascii="微軟正黑體" w:hAnsi="微軟正黑體" w:eastAsia="微軟正黑體"/>
         </w:rPr>
-        <w:t>完全沒有補給、回復或機動；對毒氣、飢餓、無槍戰鬥沒有任何增益。</w:t>
+        <w:t>整體收益只是「2點＋2次重組」，不如基因庫或戰鬥類技能的爆發力。</w:t>
+      </w:r>
+    </w:p>
+    <w:p>
+      <w:pPr>
+        <w:pStyle w:val="Heading3"/>
+      </w:pPr>
+      <w:r>
+        <w:t>規則內的反制</w:t>
       </w:r>
     </w:p>
     <w:p>
@@ -5354,26 +5307,7 @@
         <w:rPr>
           <w:rFonts w:ascii="微軟正黑體" w:hAnsi="微軟正黑體" w:eastAsia="微軟正黑體"/>
         </w:rPr>
-        <w:t>無法持槍，輸出上限被刀與雙刀限制，也無法利用槍的單方面優勢。</w:t>
-      </w:r>
-    </w:p>
-    <w:p>
-      <w:pPr>
-        <w:pStyle w:val="Heading3"/>
-      </w:pPr>
-      <w:r>
-        <w:t>規則內的反制</w:t>
-      </w:r>
-    </w:p>
-    <w:p>
-      <w:pPr>
-        <w:pStyle w:val="ListBullet"/>
-      </w:pPr>
-      <w:r>
-        <w:rPr>
-          <w:rFonts w:ascii="微軟正黑體" w:hAnsi="微軟正黑體" w:eastAsia="微軟正黑體"/>
-        </w:rPr>
-        <w:t>無槍的高武力玩家（刀＋高基礎武力）：槍械減傷對他無效。</w:t>
+        <w:t>無。</w:t>
       </w:r>
     </w:p>
     <w:p>
@@ -5389,7 +5323,7 @@
         <w:rPr>
           <w:rFonts w:ascii="微軟正黑體" w:hAnsi="微軟正黑體" w:eastAsia="微軟正黑體"/>
         </w:rPr>
-        <w:t>人數越多、槍械被使用的機會越多（全場6把槍），減傷價值越高；5人以下價值明顯下降。</w:t>
+        <w:t>人數對他影響小，屬於人數中立的職業。</w:t>
       </w:r>
     </w:p>
     <w:p>
@@ -5405,7 +5339,7 @@
         <w:rPr>
           <w:rFonts w:ascii="微軟正黑體" w:hAnsi="微軟正黑體" w:eastAsia="微軟正黑體"/>
         </w:rPr>
-        <w:t>配點建議：武力3／速度4／負重3。出生點依補給考慮。第1輪可進武器庫拿2把刀；之後避免被持槍者堵在功能房間，但遇到持槍者不必逃：傷害＝其武力−4。</w:t>
+        <w:t>配點建議：武力3／速度5／負重4。第1輪以速度搶補給；有槍或要打架時第3輪前後重組成武力4~5；毒氣擴大時轉速度。</w:t>
       </w:r>
     </w:p>
     <w:p>
@@ -5413,7 +5347,7 @@
         <w:pStyle w:val="Heading2"/>
       </w:pPr>
       <w:r>
-        <w:t>9. 🧬 基因怪人　｜　彈性成長</w:t>
+        <w:t>9. ♻️ 拾荒者　｜　資源轉換</w:t>
       </w:r>
     </w:p>
     <w:p>
@@ -5422,7 +5356,7 @@
           <w:rFonts w:ascii="微軟正黑體" w:hAnsi="微軟正黑體" w:eastAsia="微軟正黑體"/>
           <w:b/>
         </w:rPr>
-        <w:t>強度 5.9 分（B 級）　生存 2／資源 3／戰鬥 3／機動 3／穩定 4</w:t>
+        <w:t>強度 5.75 分（C 級）　生存 2／資源 4.5／戰鬥 1.5／機動 2.5／穩定 3.5</w:t>
       </w:r>
     </w:p>
     <w:p>
@@ -5512,7 +5446,7 @@
                 <w:rFonts w:ascii="微軟正黑體" w:hAnsi="微軟正黑體" w:eastAsia="微軟正黑體"/>
                 <w:sz w:val="18"/>
               </w:rPr>
-              <w:t>先天優勢</w:t>
+              <w:t>拾荒嗅覺</w:t>
             </w:r>
           </w:p>
         </w:tc>
@@ -5542,7 +5476,7 @@
                 <w:rFonts w:ascii="微軟正黑體" w:hAnsi="微軟正黑體" w:eastAsia="微軟正黑體"/>
                 <w:sz w:val="18"/>
               </w:rPr>
-              <w:t>初始可分配基因點數12點，武力上限5點。</w:t>
+              <w:t>垃圾不佔負重；在房間抽取物品時，50%機率額外獲得1個垃圾（由垃圾場扣除）。</w:t>
             </w:r>
           </w:p>
         </w:tc>
@@ -5559,7 +5493,7 @@
                 <w:rFonts w:ascii="微軟正黑體" w:hAnsi="微軟正黑體" w:eastAsia="微軟正黑體"/>
                 <w:sz w:val="18"/>
               </w:rPr>
-              <w:t>基因重組</w:t>
+              <w:t>變廢為寶</w:t>
             </w:r>
           </w:p>
         </w:tc>
@@ -5589,7 +5523,7 @@
                 <w:rFonts w:ascii="微軟正黑體" w:hAnsi="微軟正黑體" w:eastAsia="微軟正黑體"/>
                 <w:sz w:val="18"/>
               </w:rPr>
-              <w:t>技能使用階段可重新分配點數。整局限用2次。</w:t>
+              <w:t>行動階段可使用：將背包內任意數量（自選）的垃圾隨機轉為水或糧。整局限用2次。</w:t>
             </w:r>
           </w:p>
         </w:tc>
@@ -5612,7 +5546,7 @@
         <w:rPr>
           <w:rFonts w:ascii="微軟正黑體" w:hAnsi="微軟正黑體" w:eastAsia="微軟正黑體"/>
         </w:rPr>
-        <w:t>開局可分配12點（一般玩家10點），武力上限5。基因庫（每次三項各+1）與操作室B304（重新分配）是所有人都能用的功能房間，沒有使用次數限制。</w:t>
+        <w:t>拾荒嗅覺是「每抽到1件物品就擲一次50%」（含之後因負重放回的那些），所以水塔抽4瓶水約得2個垃圾、垃圾場抽一次約得1.3個；垃圾庫存20，全部由垃圾場B503扣除。</w:t>
       </w:r>
     </w:p>
     <w:p>
@@ -5623,7 +5557,7 @@
         <w:rPr>
           <w:rFonts w:ascii="微軟正黑體" w:hAnsi="微軟正黑體" w:eastAsia="微軟正黑體"/>
         </w:rPr>
-        <w:t>基因重組：可在技能階段隨時把「目前實際擁有的總點數」重新分配（包含基因庫、酒的加成）；速度會以不含腎上腺素加成的基礎速度計算，武力仍不能超過5。</w:t>
+        <w:t>變廢為寶：每個垃圾轉成水或糧各50%，轉換出來的水糧要有背包空位（addItem 檢查），所以每次轉換的上限＝min(垃圾數, 剩餘負重)。整局2次。</w:t>
       </w:r>
     </w:p>
     <w:p>
@@ -5634,15 +5568,7 @@
         <w:rPr>
           <w:rFonts w:ascii="微軟正黑體" w:hAnsi="微軟正黑體" w:eastAsia="微軟正黑體"/>
         </w:rPr>
-        <w:t>他的獨特價值＝多出 2 點屬性＋2 次不必跑去操作室B304的重新分配；但基因庫一次使用就是+3點，是所有人都有的更大成長來源。</w:t>
-      </w:r>
-    </w:p>
-    <w:p>
-      <w:pPr>
-        <w:pStyle w:val="Heading3"/>
-      </w:pPr>
-      <w:r>
-        <w:t>優勢</w:t>
+        <w:t>垃圾場每次抽5，但非垃圾道具最多拿2件（dumpCap），且每次抽取是在垃圾／繩索／防毒面具／火箭筒／次元口袋／循環回收裝置 6 種中均等挑種類，所以每次進入約抽到 1.1 個垃圾。</w:t>
       </w:r>
     </w:p>
     <w:p>
@@ -5653,7 +5579,15 @@
         <w:rPr>
           <w:rFonts w:ascii="微軟正黑體" w:hAnsi="微軟正黑體" w:eastAsia="微軟正黑體"/>
         </w:rPr>
-        <w:t>多 2 點永久屬性，沒有任何觸發條件。</w:t>
+        <w:t>水糧是全場最稀缺資源：水15＋糧15＋水糧包1，需求是每人每輪各1（第2~6輪共 5水5糧），8人需要80份，12人需要120份。拾荒者轉換出來的水糧是額外「憑空產生」的，不會從水塔／糧倉扣庫存。</w:t>
+      </w:r>
+    </w:p>
+    <w:p>
+      <w:pPr>
+        <w:pStyle w:val="Heading3"/>
+      </w:pPr>
+      <w:r>
+        <w:t>優勢</w:t>
       </w:r>
     </w:p>
     <w:p>
@@ -5664,15 +5598,7 @@
         <w:rPr>
           <w:rFonts w:ascii="微軟正黑體" w:hAnsi="微軟正黑體" w:eastAsia="微軟正黑體"/>
         </w:rPr>
-        <w:t>可根據局勢把點數轉成速度（搶補給或逃毒氣）或負重（帶水糧）。</w:t>
-      </w:r>
-    </w:p>
-    <w:p>
-      <w:pPr>
-        <w:pStyle w:val="Heading3"/>
-      </w:pPr>
-      <w:r>
-        <w:t>弱點與風險</w:t>
+        <w:t>兩次轉換在負重允許下可各補 3~4 份水糧，等於減少約 6~8 點飢餓損失，且完全不占別人的庫存。</w:t>
       </w:r>
     </w:p>
     <w:p>
@@ -5683,7 +5609,7 @@
         <w:rPr>
           <w:rFonts w:ascii="微軟正黑體" w:hAnsi="微軟正黑體" w:eastAsia="微軟正黑體"/>
         </w:rPr>
-        <w:t>沒有回復、防禦、補給或位移加成；武力上限5。</w:t>
+        <w:t>垃圾不佔負重，累積成本低；每次搜索都在累積。</w:t>
       </w:r>
     </w:p>
     <w:p>
@@ -5694,7 +5620,7 @@
         <w:rPr>
           <w:rFonts w:ascii="微軟正黑體" w:hAnsi="微軟正黑體" w:eastAsia="微軟正黑體"/>
         </w:rPr>
-        <w:t>整體收益只是「2點＋2次重組」，不如基因庫或戰鬥類技能的爆發力。</w:t>
+        <w:t>轉換不限房間、不需要移動。</w:t>
       </w:r>
     </w:p>
     <w:p>
@@ -5702,7 +5628,7 @@
         <w:pStyle w:val="Heading3"/>
       </w:pPr>
       <w:r>
-        <w:t>規則內的反制</w:t>
+        <w:t>弱點與風險</w:t>
       </w:r>
     </w:p>
     <w:p>
@@ -5713,7 +5639,48 @@
         <w:rPr>
           <w:rFonts w:ascii="微軟正黑體" w:hAnsi="微軟正黑體" w:eastAsia="微軟正黑體"/>
         </w:rPr>
-        <w:t>無。</w:t>
+        <w:t>轉換結果隨機（水或糧），可能偏向某一種，而每輪兩種都要付；</w:t>
+      </w:r>
+    </w:p>
+    <w:p>
+      <w:pPr>
+        <w:pStyle w:val="ListBullet"/>
+      </w:pPr>
+      <w:r>
+        <w:rPr>
+          <w:rFonts w:ascii="微軟正黑體" w:hAnsi="微軟正黑體" w:eastAsia="微軟正黑體"/>
+        </w:rPr>
+        <w:t>轉換上限被負重卡住；只有2次，且每次占用當輪的主動技能額度。</w:t>
+      </w:r>
+    </w:p>
+    <w:p>
+      <w:pPr>
+        <w:pStyle w:val="ListBullet"/>
+      </w:pPr>
+      <w:r>
+        <w:rPr>
+          <w:rFonts w:ascii="微軟正黑體" w:hAnsi="微軟正黑體" w:eastAsia="微軟正黑體"/>
+        </w:rPr>
+        <w:t>沒有任何戰鬥、防禦或機動加成。</w:t>
+      </w:r>
+    </w:p>
+    <w:p>
+      <w:pPr>
+        <w:pStyle w:val="Heading3"/>
+      </w:pPr>
+      <w:r>
+        <w:t>規則內的反制</w:t>
+      </w:r>
+    </w:p>
+    <w:p>
+      <w:pPr>
+        <w:pStyle w:val="ListBullet"/>
+      </w:pPr>
+      <w:r>
+        <w:rPr>
+          <w:rFonts w:ascii="微軟正黑體" w:hAnsi="微軟正黑體" w:eastAsia="微軟正黑體"/>
+        </w:rPr>
+        <w:t>同樣會餓死：垃圾來得慢時（早期搜索次數少）轉換量少。</w:t>
       </w:r>
     </w:p>
     <w:p>
@@ -5729,7 +5696,7 @@
         <w:rPr>
           <w:rFonts w:ascii="微軟正黑體" w:hAnsi="微軟正黑體" w:eastAsia="微軟正黑體"/>
         </w:rPr>
-        <w:t>人數對他影響小，屬於人數中立的職業。</w:t>
+        <w:t>人數越多水糧越缺，轉換價值越高。</w:t>
       </w:r>
     </w:p>
     <w:p>
@@ -5745,7 +5712,7 @@
         <w:rPr>
           <w:rFonts w:ascii="微軟正黑體" w:hAnsi="微軟正黑體" w:eastAsia="微軟正黑體"/>
         </w:rPr>
-        <w:t>配點建議：武力3／速度5／負重4。第1輪以速度搶補給；有槍或要打架時第3輪前後重組成武力4~5；毒氣擴大時轉速度。</w:t>
+        <w:t>配點建議：武力2／速度4／負重4。出生點B402（到垃圾場B503只要1步）。第1輪在垃圾場搜索並一路在水塔、糧倉等多抽的房間累積垃圾；第3輪累積約6~8個後第一次轉換；第2次轉換留到第5輪。</w:t>
       </w:r>
     </w:p>
     <w:p>
@@ -5753,7 +5720,7 @@
         <w:pStyle w:val="Heading2"/>
       </w:pPr>
       <w:r>
-        <w:t>10. ♻️ 拾荒者　｜　資源轉換</w:t>
+        <w:t>10. 🕯️ 還魂師　｜　復活續命</w:t>
       </w:r>
     </w:p>
     <w:p>
@@ -5762,7 +5729,7 @@
           <w:rFonts w:ascii="微軟正黑體" w:hAnsi="微軟正黑體" w:eastAsia="微軟正黑體"/>
           <w:b/>
         </w:rPr>
-        <w:t>強度 5.75 分（C 級）　生存 2／資源 4.5／戰鬥 1.5／機動 2.5／穩定 3.5</w:t>
+        <w:t>強度 5.55 分（C 級）　生存 4／資源 1.5／戰鬥 2／機動 3／穩定 3.5</w:t>
       </w:r>
     </w:p>
     <w:p>
@@ -5852,7 +5819,7 @@
                 <w:rFonts w:ascii="微軟正黑體" w:hAnsi="微軟正黑體" w:eastAsia="微軟正黑體"/>
                 <w:sz w:val="18"/>
               </w:rPr>
-              <w:t>拾荒嗅覺</w:t>
+              <w:t>臨終祝禱</w:t>
             </w:r>
           </w:p>
         </w:tc>
@@ -5882,7 +5849,7 @@
                 <w:rFonts w:ascii="微軟正黑體" w:hAnsi="微軟正黑體" w:eastAsia="微軟正黑體"/>
                 <w:sz w:val="18"/>
               </w:rPr>
-              <w:t>垃圾不佔負重；在房間抽取物品時，50%機率額外獲得1個垃圾（由垃圾場扣除）。</w:t>
+              <w:t>死亡成為暗影時，吸血所需總量降為1點即可復活（整局可發動兩次，復活後血量為3）。</w:t>
             </w:r>
           </w:p>
         </w:tc>
@@ -5899,7 +5866,7 @@
                 <w:rFonts w:ascii="微軟正黑體" w:hAnsi="微軟正黑體" w:eastAsia="微軟正黑體"/>
                 <w:sz w:val="18"/>
               </w:rPr>
-              <w:t>變廢為寶</w:t>
+              <w:t>安魂儀式</w:t>
             </w:r>
           </w:p>
         </w:tc>
@@ -5914,7 +5881,7 @@
                 <w:rFonts w:ascii="微軟正黑體" w:hAnsi="微軟正黑體" w:eastAsia="微軟正黑體"/>
                 <w:sz w:val="18"/>
               </w:rPr>
-              <w:t>主動</w:t>
+              <w:t>被動</w:t>
             </w:r>
           </w:p>
         </w:tc>
@@ -5929,7 +5896,7 @@
                 <w:rFonts w:ascii="微軟正黑體" w:hAnsi="微軟正黑體" w:eastAsia="微軟正黑體"/>
                 <w:sz w:val="18"/>
               </w:rPr>
-              <w:t>行動階段可使用：將背包內任意數量（自選）的垃圾隨機轉為水或糧。整局限用2次。</w:t>
+              <w:t>復活後速度永久+1。</w:t>
             </w:r>
           </w:p>
         </w:tc>
@@ -5952,7 +5919,7 @@
         <w:rPr>
           <w:rFonts w:ascii="微軟正黑體" w:hAnsi="微軟正黑體" w:eastAsia="微軟正黑體"/>
         </w:rPr>
-        <w:t>拾荒嗅覺是「每抽到1件物品就擲一次50%」（含之後因負重放回的那些），所以水塔抽4瓶水約得2個垃圾、垃圾場抽一次約得1.3個；垃圾庫存20，全部由垃圾場B503扣除。</w:t>
+        <w:t>臨終祝禱：成為暗影後，只要吸到 1 點生命就復活（一般暗影需2點），復活血量為 max(3, 吸取總量)＝3；整局可用2次（第3次起恢復為需吸2點）。吸血復活是在「吸血的那個房間」原地復活。</w:t>
       </w:r>
     </w:p>
     <w:p>
@@ -5963,7 +5930,7 @@
         <w:rPr>
           <w:rFonts w:ascii="微軟正黑體" w:hAnsi="微軟正黑體" w:eastAsia="微軟正黑體"/>
         </w:rPr>
-        <w:t>變廢為寶：每個垃圾轉成水或糧各50%，轉換出來的水糧要有背包空位（addItem 檢查），所以每次轉換的上限＝min(垃圾數, 剩餘負重)。整局2次。</w:t>
+        <w:t>暗影可穿牆移動（每步到實體相鄰的房間），每輪步數＝死前的移動速度（不含腎上腺素加成）；死亡後人在最底層B701，速度5時約可到達24間房。結算時對同房的每個活人各吸1點，所以要在步數內找到有活人的房間。</w:t>
       </w:r>
     </w:p>
     <w:p>
@@ -5974,7 +5941,7 @@
         <w:rPr>
           <w:rFonts w:ascii="微軟正黑體" w:hAnsi="微軟正黑體" w:eastAsia="微軟正黑體"/>
         </w:rPr>
-        <w:t>垃圾場每次抽5，但非垃圾道具最多拿2件（dumpCap），且每次抽取是在垃圾／繩索／防毒面具／火箭筒／次元口袋／循環回收裝置 6 種中均等挑種類，所以每次進入約抽到 1.1 個垃圾。</w:t>
+        <w:t>安魂儀式：每次復活後速度永久+1，之後的每輪步數與暗影階段的步數（死前速度）都多1；復活兩次就是+2。</w:t>
       </w:r>
     </w:p>
     <w:p>
@@ -5985,15 +5952,7 @@
         <w:rPr>
           <w:rFonts w:ascii="微軟正黑體" w:hAnsi="微軟正黑體" w:eastAsia="微軟正黑體"/>
         </w:rPr>
-        <w:t>水糧是全場最稀缺資源：水15＋糧15＋水糧包1，需求是每人每輪各1（第2~6輪共 5水5糧），8人需要80份，12人需要120份。拾荒者轉換出來的水糧是額外「憑空產生」的，不會從水塔／糧倉扣庫存。</w:t>
-      </w:r>
-    </w:p>
-    <w:p>
-      <w:pPr>
-        <w:pStyle w:val="Heading3"/>
-      </w:pPr>
-      <w:r>
-        <w:t>優勢</w:t>
+        <w:t>基本規則（所有玩家都適用，不是還魂師專屬）：暗影階段不受任何傷害；暗影吸血與復活排在結算的毒氣、飢餓之後，所以暗影復活的那一輪不用繳水糧、也不怕毒氣；而靠吸血復活的玩家，在「復活後的下一輪」結算時同樣免繳水糧、不受毒氣傷害（戰鬥仍有效）。例：第1輪結算復活，第2輪結算不用繳水糧、也不怕毒氣。還魂師的獨特處是復活只需吸1點（一般2點）且可復活兩次，復活後速度永久+1。</w:t>
       </w:r>
     </w:p>
     <w:p>
@@ -6004,7 +5963,7 @@
         <w:rPr>
           <w:rFonts w:ascii="微軟正黑體" w:hAnsi="微軟正黑體" w:eastAsia="微軟正黑體"/>
         </w:rPr>
-        <w:t>兩次轉換在負重允許下可各補 3~4 份水糧，等於減少約 6~8 點飢餓損失，且完全不占別人的庫存。</w:t>
+        <w:t>最多 2 次復活機會（各以3血復活）；期末排名看最終血量：第6輪結算時復活的暗影以 3 血計算，高於一般死者的 0。</w:t>
       </w:r>
     </w:p>
     <w:p>
@@ -6015,7 +5974,15 @@
         <w:rPr>
           <w:rFonts w:ascii="微軟正黑體" w:hAnsi="微軟正黑體" w:eastAsia="微軟正黑體"/>
         </w:rPr>
-        <w:t>垃圾不佔負重，累積成本低；每次搜索都在累積。</w:t>
+        <w:t>復活後背包全空（死亡時道具已掉入停屍間B701），要靠重新搜索補給。</w:t>
+      </w:r>
+    </w:p>
+    <w:p>
+      <w:pPr>
+        <w:pStyle w:val="Heading3"/>
+      </w:pPr>
+      <w:r>
+        <w:t>優勢</w:t>
       </w:r>
     </w:p>
     <w:p>
@@ -6026,15 +5993,7 @@
         <w:rPr>
           <w:rFonts w:ascii="微軟正黑體" w:hAnsi="微軟正黑體" w:eastAsia="微軟正黑體"/>
         </w:rPr>
-        <w:t>轉換不限房間、不需要移動。</w:t>
-      </w:r>
-    </w:p>
-    <w:p>
-      <w:pPr>
-        <w:pStyle w:val="Heading3"/>
-      </w:pPr>
-      <w:r>
-        <w:t>弱點與風險</w:t>
+        <w:t>復活條件比別人低（吸1點即可，一般暗影需2點；可復活兩次），所以能比別人更常、更快地享有「暗影階段與復活後下一輪免繳水糧、免毒氣」這個基本規則——保護人人都有，但他最容易觸發；全是被動，不需要任何宣告。</w:t>
       </w:r>
     </w:p>
     <w:p>
@@ -6045,7 +6004,7 @@
         <w:rPr>
           <w:rFonts w:ascii="微軟正黑體" w:hAnsi="微軟正黑體" w:eastAsia="微軟正黑體"/>
         </w:rPr>
-        <w:t>轉換結果隨機（水或糧），可能偏向某一種，而每輪兩種都要付；</w:t>
+        <w:t>每次復活速度永久+1，復活後更容易回到功能房間搶補給。</w:t>
       </w:r>
     </w:p>
     <w:p>
@@ -6056,7 +6015,15 @@
         <w:rPr>
           <w:rFonts w:ascii="微軟正黑體" w:hAnsi="微軟正黑體" w:eastAsia="微軟正黑體"/>
         </w:rPr>
-        <w:t>轉換上限被負重卡住；只有2次，且每次占用當輪的主動技能額度。</w:t>
+        <w:t>依傷害預算，不含戰鬥第4輪起每輪就有最多5點，死亡較可能出現在中後期，保險在那時最有價值。</w:t>
+      </w:r>
+    </w:p>
+    <w:p>
+      <w:pPr>
+        <w:pStyle w:val="Heading3"/>
+      </w:pPr>
+      <w:r>
+        <w:t>弱點與風險</w:t>
       </w:r>
     </w:p>
     <w:p>
@@ -6067,15 +6034,7 @@
         <w:rPr>
           <w:rFonts w:ascii="微軟正黑體" w:hAnsi="微軟正黑體" w:eastAsia="微軟正黑體"/>
         </w:rPr>
-        <w:t>沒有任何戰鬥、防禦或機動加成。</w:t>
-      </w:r>
-    </w:p>
-    <w:p>
-      <w:pPr>
-        <w:pStyle w:val="Heading3"/>
-      </w:pPr>
-      <w:r>
-        <w:t>規則內的反制</w:t>
+        <w:t>沒有死就沒有任何收益；復活後只有 3 血，且背包全空。</w:t>
       </w:r>
     </w:p>
     <w:p>
@@ -6086,7 +6045,37 @@
         <w:rPr>
           <w:rFonts w:ascii="微軟正黑體" w:hAnsi="微軟正黑體" w:eastAsia="微軟正黑體"/>
         </w:rPr>
-        <w:t>同樣會餓死：垃圾來得慢時（早期搜索次數少）轉換量少。</w:t>
+        <w:t>暗影吸血要有活人在同一房間，步數有限（死前速度），找不到人就不會復活；第6輪死亡幾乎無救。</w:t>
+      </w:r>
+    </w:p>
+    <w:p>
+      <w:pPr>
+        <w:pStyle w:val="ListBullet"/>
+      </w:pPr>
+      <w:r>
+        <w:rPr>
+          <w:rFonts w:ascii="微軟正黑體" w:hAnsi="微軟正黑體" w:eastAsia="微軟正黑體"/>
+        </w:rPr>
+        <w:t>沒有任何補給、戰鬥或防禦加成；入殮師若同局，會在他死亡時拿走他一張道具並加負重。</w:t>
+      </w:r>
+    </w:p>
+    <w:p>
+      <w:pPr>
+        <w:pStyle w:val="Heading3"/>
+      </w:pPr>
+      <w:r>
+        <w:t>規則內的反制</w:t>
+      </w:r>
+    </w:p>
+    <w:p>
+      <w:pPr>
+        <w:pStyle w:val="ListBullet"/>
+      </w:pPr>
+      <w:r>
+        <w:rPr>
+          <w:rFonts w:ascii="微軟正黑體" w:hAnsi="微軟正黑體" w:eastAsia="微軟正黑體"/>
+        </w:rPr>
+        <w:t>入殮師同局時，他死亡會被取走1張道具；暗影階段被避開（沒有活人同房）就無法復活。</w:t>
       </w:r>
     </w:p>
     <w:p>
@@ -6102,7 +6091,7 @@
         <w:rPr>
           <w:rFonts w:ascii="微軟正黑體" w:hAnsi="微軟正黑體" w:eastAsia="微軟正黑體"/>
         </w:rPr>
-        <w:t>人數越多水糧越缺，轉換價值越高。</w:t>
+        <w:t>人數越多死亡越多，保險價值越高。</w:t>
       </w:r>
     </w:p>
     <w:p>
@@ -6118,7 +6107,7 @@
         <w:rPr>
           <w:rFonts w:ascii="微軟正黑體" w:hAnsi="微軟正黑體" w:eastAsia="微軟正黑體"/>
         </w:rPr>
-        <w:t>配點建議：武力2／速度4／負重4。出生點B402（到垃圾場B503只要1步）。第1輪在垃圾場搜索並一路在水塔、糧倉等多抽的房間累積垃圾；第3輪累積約6~8個後第一次轉換；第2次轉換留到第5輪。</w:t>
+        <w:t>配點建議：武力3／速度4~5／負重3（速度會決定暗影階段的步數，速度太低暗影難以找人）。出生點B603（到B701 2步、到酒窖2步）。第1~3輪可以較冒險；死亡後在步數內優先走進水塔、糧倉、大倉庫這類有人的房間吸血；復活後先補水糧。</w:t>
       </w:r>
     </w:p>
     <w:p>
@@ -6606,7 +6595,7 @@
                 <w:rFonts w:ascii="微軟正黑體" w:hAnsi="微軟正黑體" w:eastAsia="微軟正黑體"/>
                 <w:sz w:val="18"/>
               </w:rPr>
-              <w:t>每輪輪到自己行動時，先自動擲骰：擲到1：本回合免疫所有傷害（戰鬥、毒氣、火箭筒等，飢餓仍需繳交水/糧），且本回合在房間抽取道具時多抽1張；擲到4：本回合可以多移動兩步，且本回合在房間抽取道具時多抽1張；擲到6：立即恢復2點生命（不超過上限）；擲到2可重擲（見幸運重擲）；擲到3、5沒有效果。</w:t>
+              <w:t>每輪輪到自己行動時，先自動擲骰：擲到1：本回合免疫所有傷害（戰鬥、毒氣、火箭筒等；飢餓仍需繳交水/糧，暗影吸血也擋不住），且本回合在房間抽取道具時多抽1張；擲到4：本回合可以多移動兩步，且本回合在房間抽取道具時多抽1張；擲到6：立即恢復2點生命（不超過上限）；擲到2可重擲（見幸運重擲）；擲到3、5沒有效果。</w:t>
             </w:r>
           </w:p>
         </w:tc>
@@ -6687,7 +6676,7 @@
         <w:rPr>
           <w:rFonts w:ascii="微軟正黑體" w:hAnsi="微軟正黑體" w:eastAsia="微軟正黑體"/>
         </w:rPr>
-        <w:t>擲到1（20%）：本輪免疫所有傷害（戰鬥、毒氣、火箭筒、暗影吸血、激光室等，唯一例外是飢餓），且房間搜索多抽1張；擲到4（20%）：本回合可以多移動兩步（步數上限10）且搜索多抽1張；擲到6（20%）：立即恢復2點生命（不超過上限）；擲到3、5（40%）：沒有效果。</w:t>
+        <w:t>擲到1（20%）：本輪免疫所有傷害（戰鬥、毒氣、火箭筒、激光室等；例外是飢餓與暗影吸血，這兩種擋不住），且房間搜索多抽1張；擲到4（20%）：本回合可以多移動兩步（步數上限10）且搜索多抽1張；擲到6（20%）：立即恢復2點生命（不超過上限）；擲到3、5（40%）：沒有效果。</w:t>
       </w:r>
     </w:p>
     <w:p>
@@ -7529,7 +7518,7 @@
         <w:rPr>
           <w:rFonts w:ascii="微軟正黑體" w:hAnsi="微軟正黑體" w:eastAsia="微軟正黑體"/>
         </w:rPr>
-        <w:t>完全依賴他人死亡，且死亡集中在第4~6輪（毒氣每輪3~4點、飢餓每輪最多2點），早期沒有收益；第6輪死者取得的物品多半無法再使用。</w:t>
+        <w:t>完全依賴他人死亡，且依傷害預算，死亡較可能出現在第4~6輪（毒氣每輪3~4點、飢餓每輪最多2點），早期沒有收益；第6輪死者取得的物品多半無法再使用。</w:t>
       </w:r>
     </w:p>
     <w:p>
@@ -9538,7 +9527,7 @@
                 <w:rFonts w:ascii="微軟正黑體" w:hAnsi="微軟正黑體" w:eastAsia="微軟正黑體"/>
                 <w:sz w:val="18"/>
               </w:rPr>
-              <w:t>🕯️ 還魂師</w:t>
+              <w:t>🏀 橡膠人</w:t>
             </w:r>
           </w:p>
         </w:tc>
@@ -9553,7 +9542,7 @@
                 <w:rFonts w:ascii="微軟正黑體" w:hAnsi="微軟正黑體" w:eastAsia="微軟正黑體"/>
                 <w:sz w:val="18"/>
               </w:rPr>
-              <w:t>復活續命</w:t>
+              <w:t>抗槍抗火箭</w:t>
             </w:r>
           </w:p>
         </w:tc>
@@ -9568,7 +9557,7 @@
                 <w:rFonts w:ascii="微軟正黑體" w:hAnsi="微軟正黑體" w:eastAsia="微軟正黑體"/>
                 <w:sz w:val="18"/>
               </w:rPr>
-              <w:t>5</w:t>
+              <w:t>4</w:t>
             </w:r>
           </w:p>
         </w:tc>
@@ -9583,7 +9572,7 @@
                 <w:rFonts w:ascii="微軟正黑體" w:hAnsi="微軟正黑體" w:eastAsia="微軟正黑體"/>
                 <w:sz w:val="18"/>
               </w:rPr>
-              <w:t>1.5</w:t>
+              <w:t>2</w:t>
             </w:r>
           </w:p>
         </w:tc>
@@ -9598,6 +9587,21 @@
                 <w:rFonts w:ascii="微軟正黑體" w:hAnsi="微軟正黑體" w:eastAsia="微軟正黑體"/>
                 <w:sz w:val="18"/>
               </w:rPr>
+              <w:t>3</w:t>
+            </w:r>
+          </w:p>
+        </w:tc>
+        <w:tc>
+          <w:tcPr>
+            <w:tcW w:type="dxa" w:w="567"/>
+          </w:tcPr>
+          <w:p>
+            <w:r/>
+            <w:r>
+              <w:rPr>
+                <w:rFonts w:ascii="微軟正黑體" w:hAnsi="微軟正黑體" w:eastAsia="微軟正黑體"/>
+                <w:sz w:val="18"/>
+              </w:rPr>
               <w:t>2</w:t>
             </w:r>
           </w:p>
@@ -9613,13 +9617,13 @@
                 <w:rFonts w:ascii="微軟正黑體" w:hAnsi="微軟正黑體" w:eastAsia="微軟正黑體"/>
                 <w:sz w:val="18"/>
               </w:rPr>
-              <w:t>3</w:t>
-            </w:r>
-          </w:p>
-        </w:tc>
-        <w:tc>
-          <w:tcPr>
-            <w:tcW w:type="dxa" w:w="567"/>
+              <w:t>3.5</w:t>
+            </w:r>
+          </w:p>
+        </w:tc>
+        <w:tc>
+          <w:tcPr>
+            <w:tcW w:type="dxa" w:w="680"/>
           </w:tcPr>
           <w:p>
             <w:r/>
@@ -9628,22 +9632,7 @@
                 <w:rFonts w:ascii="微軟正黑體" w:hAnsi="微軟正黑體" w:eastAsia="微軟正黑體"/>
                 <w:sz w:val="18"/>
               </w:rPr>
-              <w:t>3.5</w:t>
-            </w:r>
-          </w:p>
-        </w:tc>
-        <w:tc>
-          <w:tcPr>
-            <w:tcW w:type="dxa" w:w="680"/>
-          </w:tcPr>
-          <w:p>
-            <w:r/>
-            <w:r>
-              <w:rPr>
-                <w:rFonts w:ascii="微軟正黑體" w:hAnsi="微軟正黑體" w:eastAsia="微軟正黑體"/>
-                <w:sz w:val="18"/>
-              </w:rPr>
-              <w:t>6.05</w:t>
+              <w:t>6.0</w:t>
             </w:r>
           </w:p>
         </w:tc>
@@ -9705,7 +9694,7 @@
                 <w:rFonts w:ascii="微軟正黑體" w:hAnsi="微軟正黑體" w:eastAsia="微軟正黑體"/>
                 <w:sz w:val="18"/>
               </w:rPr>
-              <w:t>🏀 橡膠人</w:t>
+              <w:t>🧬 基因怪人</w:t>
             </w:r>
           </w:p>
         </w:tc>
@@ -9720,7 +9709,7 @@
                 <w:rFonts w:ascii="微軟正黑體" w:hAnsi="微軟正黑體" w:eastAsia="微軟正黑體"/>
                 <w:sz w:val="18"/>
               </w:rPr>
-              <w:t>抗槍抗火箭</w:t>
+              <w:t>彈性成長</w:t>
             </w:r>
           </w:p>
         </w:tc>
@@ -9735,13 +9724,73 @@
                 <w:rFonts w:ascii="微軟正黑體" w:hAnsi="微軟正黑體" w:eastAsia="微軟正黑體"/>
                 <w:sz w:val="18"/>
               </w:rPr>
+              <w:t>2</w:t>
+            </w:r>
+          </w:p>
+        </w:tc>
+        <w:tc>
+          <w:tcPr>
+            <w:tcW w:type="dxa" w:w="567"/>
+          </w:tcPr>
+          <w:p>
+            <w:r/>
+            <w:r>
+              <w:rPr>
+                <w:rFonts w:ascii="微軟正黑體" w:hAnsi="微軟正黑體" w:eastAsia="微軟正黑體"/>
+                <w:sz w:val="18"/>
+              </w:rPr>
+              <w:t>3</w:t>
+            </w:r>
+          </w:p>
+        </w:tc>
+        <w:tc>
+          <w:tcPr>
+            <w:tcW w:type="dxa" w:w="567"/>
+          </w:tcPr>
+          <w:p>
+            <w:r/>
+            <w:r>
+              <w:rPr>
+                <w:rFonts w:ascii="微軟正黑體" w:hAnsi="微軟正黑體" w:eastAsia="微軟正黑體"/>
+                <w:sz w:val="18"/>
+              </w:rPr>
+              <w:t>3</w:t>
+            </w:r>
+          </w:p>
+        </w:tc>
+        <w:tc>
+          <w:tcPr>
+            <w:tcW w:type="dxa" w:w="567"/>
+          </w:tcPr>
+          <w:p>
+            <w:r/>
+            <w:r>
+              <w:rPr>
+                <w:rFonts w:ascii="微軟正黑體" w:hAnsi="微軟正黑體" w:eastAsia="微軟正黑體"/>
+                <w:sz w:val="18"/>
+              </w:rPr>
+              <w:t>3</w:t>
+            </w:r>
+          </w:p>
+        </w:tc>
+        <w:tc>
+          <w:tcPr>
+            <w:tcW w:type="dxa" w:w="567"/>
+          </w:tcPr>
+          <w:p>
+            <w:r/>
+            <w:r>
+              <w:rPr>
+                <w:rFonts w:ascii="微軟正黑體" w:hAnsi="微軟正黑體" w:eastAsia="微軟正黑體"/>
+                <w:sz w:val="18"/>
+              </w:rPr>
               <w:t>4</w:t>
             </w:r>
           </w:p>
         </w:tc>
         <w:tc>
           <w:tcPr>
-            <w:tcW w:type="dxa" w:w="567"/>
+            <w:tcW w:type="dxa" w:w="680"/>
           </w:tcPr>
           <w:p>
             <w:r/>
@@ -9750,67 +9799,7 @@
                 <w:rFonts w:ascii="微軟正黑體" w:hAnsi="微軟正黑體" w:eastAsia="微軟正黑體"/>
                 <w:sz w:val="18"/>
               </w:rPr>
-              <w:t>2</w:t>
-            </w:r>
-          </w:p>
-        </w:tc>
-        <w:tc>
-          <w:tcPr>
-            <w:tcW w:type="dxa" w:w="567"/>
-          </w:tcPr>
-          <w:p>
-            <w:r/>
-            <w:r>
-              <w:rPr>
-                <w:rFonts w:ascii="微軟正黑體" w:hAnsi="微軟正黑體" w:eastAsia="微軟正黑體"/>
-                <w:sz w:val="18"/>
-              </w:rPr>
-              <w:t>3</w:t>
-            </w:r>
-          </w:p>
-        </w:tc>
-        <w:tc>
-          <w:tcPr>
-            <w:tcW w:type="dxa" w:w="567"/>
-          </w:tcPr>
-          <w:p>
-            <w:r/>
-            <w:r>
-              <w:rPr>
-                <w:rFonts w:ascii="微軟正黑體" w:hAnsi="微軟正黑體" w:eastAsia="微軟正黑體"/>
-                <w:sz w:val="18"/>
-              </w:rPr>
-              <w:t>2</w:t>
-            </w:r>
-          </w:p>
-        </w:tc>
-        <w:tc>
-          <w:tcPr>
-            <w:tcW w:type="dxa" w:w="567"/>
-          </w:tcPr>
-          <w:p>
-            <w:r/>
-            <w:r>
-              <w:rPr>
-                <w:rFonts w:ascii="微軟正黑體" w:hAnsi="微軟正黑體" w:eastAsia="微軟正黑體"/>
-                <w:sz w:val="18"/>
-              </w:rPr>
-              <w:t>3.5</w:t>
-            </w:r>
-          </w:p>
-        </w:tc>
-        <w:tc>
-          <w:tcPr>
-            <w:tcW w:type="dxa" w:w="680"/>
-          </w:tcPr>
-          <w:p>
-            <w:r/>
-            <w:r>
-              <w:rPr>
-                <w:rFonts w:ascii="微軟正黑體" w:hAnsi="微軟正黑體" w:eastAsia="微軟正黑體"/>
-                <w:sz w:val="18"/>
-              </w:rPr>
-              <w:t>6.0</w:t>
+              <w:t>5.9</w:t>
             </w:r>
           </w:p>
         </w:tc>
@@ -9872,7 +9861,7 @@
                 <w:rFonts w:ascii="微軟正黑體" w:hAnsi="微軟正黑體" w:eastAsia="微軟正黑體"/>
                 <w:sz w:val="18"/>
               </w:rPr>
-              <w:t>🧬 基因怪人</w:t>
+              <w:t>♻️ 拾荒者</w:t>
             </w:r>
           </w:p>
         </w:tc>
@@ -9887,7 +9876,7 @@
                 <w:rFonts w:ascii="微軟正黑體" w:hAnsi="微軟正黑體" w:eastAsia="微軟正黑體"/>
                 <w:sz w:val="18"/>
               </w:rPr>
-              <w:t>彈性成長</w:t>
+              <w:t>資源轉換</w:t>
             </w:r>
           </w:p>
         </w:tc>
@@ -9917,7 +9906,7 @@
                 <w:rFonts w:ascii="微軟正黑體" w:hAnsi="微軟正黑體" w:eastAsia="微軟正黑體"/>
                 <w:sz w:val="18"/>
               </w:rPr>
-              <w:t>3</w:t>
+              <w:t>4.5</w:t>
             </w:r>
           </w:p>
         </w:tc>
@@ -9932,7 +9921,7 @@
                 <w:rFonts w:ascii="微軟正黑體" w:hAnsi="微軟正黑體" w:eastAsia="微軟正黑體"/>
                 <w:sz w:val="18"/>
               </w:rPr>
-              <w:t>3</w:t>
+              <w:t>1.5</w:t>
             </w:r>
           </w:p>
         </w:tc>
@@ -9947,7 +9936,7 @@
                 <w:rFonts w:ascii="微軟正黑體" w:hAnsi="微軟正黑體" w:eastAsia="微軟正黑體"/>
                 <w:sz w:val="18"/>
               </w:rPr>
-              <w:t>3</w:t>
+              <w:t>2.5</w:t>
             </w:r>
           </w:p>
         </w:tc>
@@ -9962,7 +9951,7 @@
                 <w:rFonts w:ascii="微軟正黑體" w:hAnsi="微軟正黑體" w:eastAsia="微軟正黑體"/>
                 <w:sz w:val="18"/>
               </w:rPr>
-              <w:t>4</w:t>
+              <w:t>3.5</w:t>
             </w:r>
           </w:p>
         </w:tc>
@@ -9977,7 +9966,7 @@
                 <w:rFonts w:ascii="微軟正黑體" w:hAnsi="微軟正黑體" w:eastAsia="微軟正黑體"/>
                 <w:sz w:val="18"/>
               </w:rPr>
-              <w:t>5.9</w:t>
+              <w:t>5.75</w:t>
             </w:r>
           </w:p>
         </w:tc>
@@ -9992,7 +9981,7 @@
                 <w:rFonts w:ascii="微軟正黑體" w:hAnsi="微軟正黑體" w:eastAsia="微軟正黑體"/>
                 <w:sz w:val="18"/>
               </w:rPr>
-              <w:t>B</w:t>
+              <w:t>C</w:t>
             </w:r>
           </w:p>
         </w:tc>
@@ -10039,7 +10028,7 @@
                 <w:rFonts w:ascii="微軟正黑體" w:hAnsi="微軟正黑體" w:eastAsia="微軟正黑體"/>
                 <w:sz w:val="18"/>
               </w:rPr>
-              <w:t>♻️ 拾荒者</w:t>
+              <w:t>🕯️ 還魂師</w:t>
             </w:r>
           </w:p>
         </w:tc>
@@ -10054,7 +10043,7 @@
                 <w:rFonts w:ascii="微軟正黑體" w:hAnsi="微軟正黑體" w:eastAsia="微軟正黑體"/>
                 <w:sz w:val="18"/>
               </w:rPr>
-              <w:t>資源轉換</w:t>
+              <w:t>復活續命</w:t>
             </w:r>
           </w:p>
         </w:tc>
@@ -10069,6 +10058,36 @@
                 <w:rFonts w:ascii="微軟正黑體" w:hAnsi="微軟正黑體" w:eastAsia="微軟正黑體"/>
                 <w:sz w:val="18"/>
               </w:rPr>
+              <w:t>4</w:t>
+            </w:r>
+          </w:p>
+        </w:tc>
+        <w:tc>
+          <w:tcPr>
+            <w:tcW w:type="dxa" w:w="567"/>
+          </w:tcPr>
+          <w:p>
+            <w:r/>
+            <w:r>
+              <w:rPr>
+                <w:rFonts w:ascii="微軟正黑體" w:hAnsi="微軟正黑體" w:eastAsia="微軟正黑體"/>
+                <w:sz w:val="18"/>
+              </w:rPr>
+              <w:t>1.5</w:t>
+            </w:r>
+          </w:p>
+        </w:tc>
+        <w:tc>
+          <w:tcPr>
+            <w:tcW w:type="dxa" w:w="567"/>
+          </w:tcPr>
+          <w:p>
+            <w:r/>
+            <w:r>
+              <w:rPr>
+                <w:rFonts w:ascii="微軟正黑體" w:hAnsi="微軟正黑體" w:eastAsia="微軟正黑體"/>
+                <w:sz w:val="18"/>
+              </w:rPr>
               <w:t>2</w:t>
             </w:r>
           </w:p>
@@ -10084,7 +10103,7 @@
                 <w:rFonts w:ascii="微軟正黑體" w:hAnsi="微軟正黑體" w:eastAsia="微軟正黑體"/>
                 <w:sz w:val="18"/>
               </w:rPr>
-              <w:t>4.5</w:t>
+              <w:t>3</w:t>
             </w:r>
           </w:p>
         </w:tc>
@@ -10099,13 +10118,13 @@
                 <w:rFonts w:ascii="微軟正黑體" w:hAnsi="微軟正黑體" w:eastAsia="微軟正黑體"/>
                 <w:sz w:val="18"/>
               </w:rPr>
-              <w:t>1.5</w:t>
-            </w:r>
-          </w:p>
-        </w:tc>
-        <w:tc>
-          <w:tcPr>
-            <w:tcW w:type="dxa" w:w="567"/>
+              <w:t>3.5</w:t>
+            </w:r>
+          </w:p>
+        </w:tc>
+        <w:tc>
+          <w:tcPr>
+            <w:tcW w:type="dxa" w:w="680"/>
           </w:tcPr>
           <w:p>
             <w:r/>
@@ -10114,37 +10133,7 @@
                 <w:rFonts w:ascii="微軟正黑體" w:hAnsi="微軟正黑體" w:eastAsia="微軟正黑體"/>
                 <w:sz w:val="18"/>
               </w:rPr>
-              <w:t>2.5</w:t>
-            </w:r>
-          </w:p>
-        </w:tc>
-        <w:tc>
-          <w:tcPr>
-            <w:tcW w:type="dxa" w:w="567"/>
-          </w:tcPr>
-          <w:p>
-            <w:r/>
-            <w:r>
-              <w:rPr>
-                <w:rFonts w:ascii="微軟正黑體" w:hAnsi="微軟正黑體" w:eastAsia="微軟正黑體"/>
-                <w:sz w:val="18"/>
-              </w:rPr>
-              <w:t>3.5</w:t>
-            </w:r>
-          </w:p>
-        </w:tc>
-        <w:tc>
-          <w:tcPr>
-            <w:tcW w:type="dxa" w:w="680"/>
-          </w:tcPr>
-          <w:p>
-            <w:r/>
-            <w:r>
-              <w:rPr>
-                <w:rFonts w:ascii="微軟正黑體" w:hAnsi="微軟正黑體" w:eastAsia="微軟正黑體"/>
-                <w:sz w:val="18"/>
-              </w:rPr>
-              <w:t>5.75</w:t>
+              <w:t>5.55</w:t>
             </w:r>
           </w:p>
         </w:tc>
@@ -11189,7 +11178,7 @@
           <w:rFonts w:ascii="微軟正黑體" w:hAnsi="微軟正黑體" w:eastAsia="微軟正黑體"/>
           <w:b w:val="0"/>
         </w:rPr>
-        <w:t>16 位平均 5.88 分，最高與最低相差 2.95 分。</w:t>
+        <w:t>16 位平均 5.85 分，最高與最低相差 2.95 分。</w:t>
       </w:r>
     </w:p>
     <w:p>
@@ -11219,7 +11208,7 @@
         <w:rPr>
           <w:rFonts w:ascii="微軟正黑體" w:hAnsi="微軟正黑體" w:eastAsia="微軟正黑體"/>
         </w:rPr>
-        <w:t>B 級（屠夫、馴獸師、工程師、橡膠人、攀岩者、基因怪人）：單一面向有明確優勢，且不依賴隨機或他人。</w:t>
+        <w:t>B 級（屠夫、馴獸師、攀岩者、工程師、橡膠人、基因怪人）：單一面向有明確優勢或穩定的保障。</w:t>
       </w:r>
     </w:p>
     <w:p>
@@ -11230,7 +11219,7 @@
         <w:rPr>
           <w:rFonts w:ascii="微軟正黑體" w:hAnsi="微軟正黑體" w:eastAsia="微軟正黑體"/>
         </w:rPr>
-        <w:t>C 級（拾荒者、還魂師、購物大媽、私家偵探、庸才、入殮師、幸運兒、吸血鬼）：效果成立但受條件限制（需先累積、需要他人死亡、隨機性高或畏光等代價）。</w:t>
+        <w:t>C 級（拾荒者、還魂師、購物大媽、幸運兒、庸才、入殮師、吸血鬼、私家偵探）：效果成立但受條件限制（需先累積、需要他人死亡、隨機性高或畏光等代價）。</w:t>
       </w:r>
     </w:p>
     <w:p>
@@ -11583,7 +11572,7 @@
                 <w:rFonts w:ascii="微軟正黑體" w:hAnsi="微軟正黑體" w:eastAsia="微軟正黑體"/>
                 <w:sz w:val="18"/>
               </w:rPr>
-              <w:t>免疫戰鬥、毒氣、火箭筒、暗影吸血（飢餓除外）；仍可對同房玩家造成武力差傷害。</w:t>
+              <w:t>免疫戰鬥、毒氣、火箭筒（飢餓與暗影吸血除外）；仍可對同房玩家造成武力差傷害。</w:t>
             </w:r>
           </w:p>
         </w:tc>
@@ -11606,7 +11595,7 @@
         <w:rPr>
           <w:rFonts w:ascii="微軟正黑體" w:hAnsi="微軟正黑體" w:eastAsia="微軟正黑體"/>
         </w:rPr>
-        <w:t>所有機率與距離都是用遊戲程式中相同的抽取與地圖資料直接計算（抽取機率為 20~30 萬次蒙地卡羅，距離為廣度優先搜尋）；未使用AI對戰模擬，因為AI的決策不屬於規則。</w:t>
+        <w:t>所有機率與距離都是用遊戲程式中相同的抽取與地圖資料直接計算（抽取機率為 20~30 萬次蒙地卡羅，距離為廣度優先搜尋）；評分不使用AI對戰模擬（AI的決策不屬於規則）；第七章的AI模擬只作對照，不用來改分。</w:t>
       </w:r>
     </w:p>
     <w:p>
@@ -11640,6 +11629,2806 @@
           <w:rFonts w:ascii="微軟正黑體" w:hAnsi="微軟正黑體" w:eastAsia="微軟正黑體"/>
         </w:rPr>
         <w:t>本報告以 8~12 人、地圖一為準；啟用地圖二（樂透房、配給站、神秘商店）、懸賞或擴充職業時，結論不一定成立。</w:t>
+      </w:r>
+    </w:p>
+    <w:p>
+      <w:pPr>
+        <w:pStyle w:val="Heading1"/>
+      </w:pPr>
+      <w:r>
+        <w:t>七、AI 模擬參考（300 場九人局）</w:t>
+      </w:r>
+    </w:p>
+    <w:p>
+      <w:r>
+        <w:rPr>
+          <w:rFonts w:ascii="微軟正黑體" w:hAnsi="微軟正黑體" w:eastAsia="微軟正黑體"/>
+          <w:b w:val="0"/>
+        </w:rPr>
+        <w:t>以下是用遊戲 App 的無畫面模擬跑出的參考數據，與前面「依規則推演」的評分是兩種不同性質的資料：它反映的是 AI 玩家的操作結果，不是規則本身，所以只作為對照，不用來改分。</w:t>
+      </w:r>
+    </w:p>
+    <w:p>
+      <w:pPr>
+        <w:pStyle w:val="ListBullet"/>
+      </w:pPr>
+      <w:r>
+        <w:rPr>
+          <w:rFonts w:ascii="微軟正黑體" w:hAnsi="微軟正黑體" w:eastAsia="微軟正黑體"/>
+        </w:rPr>
+        <w:t>模擬設定：實體模式 16 職業、每場 9 人（職業隨機、同場不重複）、地圖一，共 300 場（2700 個玩家樣本，每個職業約 160~180 場）。每位玩家的武力／速度／負重由 AI 隨機分配。</w:t>
+      </w:r>
+    </w:p>
+    <w:p>
+      <w:pPr>
+        <w:pStyle w:val="ListBullet"/>
+      </w:pPr>
+      <w:r>
+        <w:rPr>
+          <w:rFonts w:ascii="微軟正黑體" w:hAnsi="微軟正黑體" w:eastAsia="微軟正黑體"/>
+        </w:rPr>
+        <w:t>AI 選出生點：AI 會依職業挑出生點（例如雇傭兵、屠夫、吸血鬼偏向離武器庫近的103，飲品師偏向離酒窖近的B603，拾荒者與庸才偏向離垃圾場近的B402，基因怪人偏向離基因庫近的B103），並對已有人選的出生點降低意願，以避開第1輪出生點戰鬥；選擇帶有隨機性。</w:t>
+      </w:r>
+    </w:p>
+    <w:p>
+      <w:pPr>
+        <w:pStyle w:val="ListBullet"/>
+      </w:pPr>
+      <w:r>
+        <w:rPr>
+          <w:rFonts w:ascii="微軟正黑體" w:hAnsi="微軟正黑體" w:eastAsia="微軟正黑體"/>
+        </w:rPr>
+        <w:t>AI 不會做的事：不會使用飲品師的酒、不會做基因怪人的基因重組，其他職業的技能也只有部分有簡單的使用邏輯，所以飲品師、基因怪人等職業的模擬結果特別不可靠。</w:t>
+      </w:r>
+    </w:p>
+    <w:p>
+      <w:pPr>
+        <w:pStyle w:val="ListBullet"/>
+      </w:pPr>
+      <w:r>
+        <w:rPr>
+          <w:rFonts w:ascii="微軟正黑體" w:hAnsi="微軟正黑體" w:eastAsia="微軟正黑體"/>
+        </w:rPr>
+        <w:t>整體：平均最終血量 0.33、最終存活率 10%（AI 不會刻意囤水糧或躲避毒氣，大多數人最後都死亡）。因為多數人最終血量為0，名次主要靠「是否存活」和武力決定。</w:t>
+      </w:r>
+    </w:p>
+    <w:tbl>
+      <w:tblPr>
+        <w:tblStyle w:val="TableGrid"/>
+        <w:tblW w:type="auto" w:w="0"/>
+        <w:tblLook w:firstColumn="1" w:firstRow="1" w:lastColumn="0" w:lastRow="0" w:noHBand="0" w:noVBand="1" w:val="04A0"/>
+      </w:tblPr>
+      <w:tblGrid>
+        <w:gridCol w:w="997"/>
+        <w:gridCol w:w="997"/>
+        <w:gridCol w:w="997"/>
+        <w:gridCol w:w="997"/>
+        <w:gridCol w:w="997"/>
+        <w:gridCol w:w="997"/>
+        <w:gridCol w:w="997"/>
+        <w:gridCol w:w="997"/>
+        <w:gridCol w:w="997"/>
+        <w:gridCol w:w="997"/>
+      </w:tblGrid>
+      <w:tr>
+        <w:tc>
+          <w:tcPr>
+            <w:tcW w:type="dxa" w:w="1361"/>
+            <w:shd w:val="clear" w:color="auto" w:fill="1F3A5F"/>
+          </w:tcPr>
+          <w:p>
+            <w:r/>
+            <w:r>
+              <w:rPr>
+                <w:rFonts w:ascii="微軟正黑體" w:hAnsi="微軟正黑體" w:eastAsia="微軟正黑體"/>
+                <w:b/>
+                <w:color w:val="FFFFFF"/>
+                <w:sz w:val="17"/>
+              </w:rPr>
+              <w:t>職業</w:t>
+            </w:r>
+          </w:p>
+        </w:tc>
+        <w:tc>
+          <w:tcPr>
+            <w:tcW w:type="dxa" w:w="907"/>
+            <w:shd w:val="clear" w:color="auto" w:fill="1F3A5F"/>
+          </w:tcPr>
+          <w:p>
+            <w:r/>
+            <w:r>
+              <w:rPr>
+                <w:rFonts w:ascii="微軟正黑體" w:hAnsi="微軟正黑體" w:eastAsia="微軟正黑體"/>
+                <w:b/>
+                <w:color w:val="FFFFFF"/>
+                <w:sz w:val="17"/>
+              </w:rPr>
+              <w:t>規則評分</w:t>
+            </w:r>
+          </w:p>
+        </w:tc>
+        <w:tc>
+          <w:tcPr>
+            <w:tcW w:type="dxa" w:w="737"/>
+            <w:shd w:val="clear" w:color="auto" w:fill="1F3A5F"/>
+          </w:tcPr>
+          <w:p>
+            <w:r/>
+            <w:r>
+              <w:rPr>
+                <w:rFonts w:ascii="微軟正黑體" w:hAnsi="微軟正黑體" w:eastAsia="微軟正黑體"/>
+                <w:b/>
+                <w:color w:val="FFFFFF"/>
+                <w:sz w:val="17"/>
+              </w:rPr>
+              <w:t>場數</w:t>
+            </w:r>
+          </w:p>
+        </w:tc>
+        <w:tc>
+          <w:tcPr>
+            <w:tcW w:type="dxa" w:w="1134"/>
+            <w:shd w:val="clear" w:color="auto" w:fill="1F3A5F"/>
+          </w:tcPr>
+          <w:p>
+            <w:r/>
+            <w:r>
+              <w:rPr>
+                <w:rFonts w:ascii="微軟正黑體" w:hAnsi="微軟正黑體" w:eastAsia="微軟正黑體"/>
+                <w:b/>
+                <w:color w:val="FFFFFF"/>
+                <w:sz w:val="17"/>
+              </w:rPr>
+              <w:t>平均最終血量</w:t>
+            </w:r>
+          </w:p>
+        </w:tc>
+        <w:tc>
+          <w:tcPr>
+            <w:tcW w:type="dxa" w:w="850"/>
+            <w:shd w:val="clear" w:color="auto" w:fill="1F3A5F"/>
+          </w:tcPr>
+          <w:p>
+            <w:r/>
+            <w:r>
+              <w:rPr>
+                <w:rFonts w:ascii="微軟正黑體" w:hAnsi="微軟正黑體" w:eastAsia="微軟正黑體"/>
+                <w:b/>
+                <w:color w:val="FFFFFF"/>
+                <w:sz w:val="17"/>
+              </w:rPr>
+              <w:t>存活率</w:t>
+            </w:r>
+          </w:p>
+        </w:tc>
+        <w:tc>
+          <w:tcPr>
+            <w:tcW w:type="dxa" w:w="850"/>
+            <w:shd w:val="clear" w:color="auto" w:fill="1F3A5F"/>
+          </w:tcPr>
+          <w:p>
+            <w:r/>
+            <w:r>
+              <w:rPr>
+                <w:rFonts w:ascii="微軟正黑體" w:hAnsi="微軟正黑體" w:eastAsia="微軟正黑體"/>
+                <w:b/>
+                <w:color w:val="FFFFFF"/>
+                <w:sz w:val="17"/>
+              </w:rPr>
+              <w:t>名次分</w:t>
+            </w:r>
+          </w:p>
+        </w:tc>
+        <w:tc>
+          <w:tcPr>
+            <w:tcW w:type="dxa" w:w="850"/>
+            <w:shd w:val="clear" w:color="auto" w:fill="1F3A5F"/>
+          </w:tcPr>
+          <w:p>
+            <w:r/>
+            <w:r>
+              <w:rPr>
+                <w:rFonts w:ascii="微軟正黑體" w:hAnsi="微軟正黑體" w:eastAsia="微軟正黑體"/>
+                <w:b/>
+                <w:color w:val="FFFFFF"/>
+                <w:sz w:val="17"/>
+              </w:rPr>
+              <w:t>前3名</w:t>
+            </w:r>
+          </w:p>
+        </w:tc>
+        <w:tc>
+          <w:tcPr>
+            <w:tcW w:type="dxa" w:w="794"/>
+            <w:shd w:val="clear" w:color="auto" w:fill="1F3A5F"/>
+          </w:tcPr>
+          <w:p>
+            <w:r/>
+            <w:r>
+              <w:rPr>
+                <w:rFonts w:ascii="微軟正黑體" w:hAnsi="微軟正黑體" w:eastAsia="微軟正黑體"/>
+                <w:b/>
+                <w:color w:val="FFFFFF"/>
+                <w:sz w:val="17"/>
+              </w:rPr>
+              <w:t>冠軍</w:t>
+            </w:r>
+          </w:p>
+        </w:tc>
+        <w:tc>
+          <w:tcPr>
+            <w:tcW w:type="dxa" w:w="850"/>
+            <w:shd w:val="clear" w:color="auto" w:fill="1F3A5F"/>
+          </w:tcPr>
+          <w:p>
+            <w:r/>
+            <w:r>
+              <w:rPr>
+                <w:rFonts w:ascii="微軟正黑體" w:hAnsi="微軟正黑體" w:eastAsia="微軟正黑體"/>
+                <w:b/>
+                <w:color w:val="FFFFFF"/>
+                <w:sz w:val="17"/>
+              </w:rPr>
+              <w:t>平均擊殺</w:t>
+            </w:r>
+          </w:p>
+        </w:tc>
+        <w:tc>
+          <w:tcPr>
+            <w:tcW w:type="dxa" w:w="964"/>
+            <w:shd w:val="clear" w:color="auto" w:fill="1F3A5F"/>
+          </w:tcPr>
+          <w:p>
+            <w:r/>
+            <w:r>
+              <w:rPr>
+                <w:rFonts w:ascii="微軟正黑體" w:hAnsi="微軟正黑體" w:eastAsia="微軟正黑體"/>
+                <w:b/>
+                <w:color w:val="FFFFFF"/>
+                <w:sz w:val="17"/>
+              </w:rPr>
+              <w:t>平均死亡輪</w:t>
+            </w:r>
+          </w:p>
+        </w:tc>
+      </w:tr>
+      <w:tr>
+        <w:tc>
+          <w:tcPr>
+            <w:tcW w:type="dxa" w:w="1361"/>
+          </w:tcPr>
+          <w:p>
+            <w:r/>
+            <w:r>
+              <w:rPr>
+                <w:rFonts w:ascii="微軟正黑體" w:hAnsi="微軟正黑體" w:eastAsia="微軟正黑體"/>
+                <w:sz w:val="17"/>
+              </w:rPr>
+              <w:t>雇傭兵</w:t>
+            </w:r>
+          </w:p>
+        </w:tc>
+        <w:tc>
+          <w:tcPr>
+            <w:tcW w:type="dxa" w:w="907"/>
+          </w:tcPr>
+          <w:p>
+            <w:r/>
+            <w:r>
+              <w:rPr>
+                <w:rFonts w:ascii="微軟正黑體" w:hAnsi="微軟正黑體" w:eastAsia="微軟正黑體"/>
+                <w:sz w:val="17"/>
+              </w:rPr>
+              <w:t>7.75</w:t>
+            </w:r>
+          </w:p>
+        </w:tc>
+        <w:tc>
+          <w:tcPr>
+            <w:tcW w:type="dxa" w:w="737"/>
+          </w:tcPr>
+          <w:p>
+            <w:r/>
+            <w:r>
+              <w:rPr>
+                <w:rFonts w:ascii="微軟正黑體" w:hAnsi="微軟正黑體" w:eastAsia="微軟正黑體"/>
+                <w:sz w:val="17"/>
+              </w:rPr>
+              <w:t>171</w:t>
+            </w:r>
+          </w:p>
+        </w:tc>
+        <w:tc>
+          <w:tcPr>
+            <w:tcW w:type="dxa" w:w="1134"/>
+          </w:tcPr>
+          <w:p>
+            <w:r/>
+            <w:r>
+              <w:rPr>
+                <w:rFonts w:ascii="微軟正黑體" w:hAnsi="微軟正黑體" w:eastAsia="微軟正黑體"/>
+                <w:sz w:val="17"/>
+              </w:rPr>
+              <w:t>0.22</w:t>
+            </w:r>
+          </w:p>
+        </w:tc>
+        <w:tc>
+          <w:tcPr>
+            <w:tcW w:type="dxa" w:w="850"/>
+          </w:tcPr>
+          <w:p>
+            <w:r/>
+            <w:r>
+              <w:rPr>
+                <w:rFonts w:ascii="微軟正黑體" w:hAnsi="微軟正黑體" w:eastAsia="微軟正黑體"/>
+                <w:sz w:val="17"/>
+              </w:rPr>
+              <w:t>7%</w:t>
+            </w:r>
+          </w:p>
+        </w:tc>
+        <w:tc>
+          <w:tcPr>
+            <w:tcW w:type="dxa" w:w="850"/>
+          </w:tcPr>
+          <w:p>
+            <w:r/>
+            <w:r>
+              <w:rPr>
+                <w:rFonts w:ascii="微軟正黑體" w:hAnsi="微軟正黑體" w:eastAsia="微軟正黑體"/>
+                <w:sz w:val="17"/>
+              </w:rPr>
+              <w:t>58</w:t>
+            </w:r>
+          </w:p>
+        </w:tc>
+        <w:tc>
+          <w:tcPr>
+            <w:tcW w:type="dxa" w:w="850"/>
+          </w:tcPr>
+          <w:p>
+            <w:r/>
+            <w:r>
+              <w:rPr>
+                <w:rFonts w:ascii="微軟正黑體" w:hAnsi="微軟正黑體" w:eastAsia="微軟正黑體"/>
+                <w:sz w:val="17"/>
+              </w:rPr>
+              <w:t>41%</w:t>
+            </w:r>
+          </w:p>
+        </w:tc>
+        <w:tc>
+          <w:tcPr>
+            <w:tcW w:type="dxa" w:w="794"/>
+          </w:tcPr>
+          <w:p>
+            <w:r/>
+            <w:r>
+              <w:rPr>
+                <w:rFonts w:ascii="微軟正黑體" w:hAnsi="微軟正黑體" w:eastAsia="微軟正黑體"/>
+                <w:sz w:val="17"/>
+              </w:rPr>
+              <w:t>13%</w:t>
+            </w:r>
+          </w:p>
+        </w:tc>
+        <w:tc>
+          <w:tcPr>
+            <w:tcW w:type="dxa" w:w="850"/>
+          </w:tcPr>
+          <w:p>
+            <w:r/>
+            <w:r>
+              <w:rPr>
+                <w:rFonts w:ascii="微軟正黑體" w:hAnsi="微軟正黑體" w:eastAsia="微軟正黑體"/>
+                <w:sz w:val="17"/>
+              </w:rPr>
+              <w:t>0.6</w:t>
+            </w:r>
+          </w:p>
+        </w:tc>
+        <w:tc>
+          <w:tcPr>
+            <w:tcW w:type="dxa" w:w="964"/>
+          </w:tcPr>
+          <w:p>
+            <w:r/>
+            <w:r>
+              <w:rPr>
+                <w:rFonts w:ascii="微軟正黑體" w:hAnsi="微軟正黑體" w:eastAsia="微軟正黑體"/>
+                <w:sz w:val="17"/>
+              </w:rPr>
+              <w:t>4.5</w:t>
+            </w:r>
+          </w:p>
+        </w:tc>
+      </w:tr>
+      <w:tr>
+        <w:tc>
+          <w:tcPr>
+            <w:tcW w:type="dxa" w:w="1361"/>
+          </w:tcPr>
+          <w:p>
+            <w:r/>
+            <w:r>
+              <w:rPr>
+                <w:rFonts w:ascii="微軟正黑體" w:hAnsi="微軟正黑體" w:eastAsia="微軟正黑體"/>
+                <w:sz w:val="17"/>
+              </w:rPr>
+              <w:t>飲品師</w:t>
+            </w:r>
+          </w:p>
+        </w:tc>
+        <w:tc>
+          <w:tcPr>
+            <w:tcW w:type="dxa" w:w="907"/>
+          </w:tcPr>
+          <w:p>
+            <w:r/>
+            <w:r>
+              <w:rPr>
+                <w:rFonts w:ascii="微軟正黑體" w:hAnsi="微軟正黑體" w:eastAsia="微軟正黑體"/>
+                <w:sz w:val="17"/>
+              </w:rPr>
+              <w:t>7.1</w:t>
+            </w:r>
+          </w:p>
+        </w:tc>
+        <w:tc>
+          <w:tcPr>
+            <w:tcW w:type="dxa" w:w="737"/>
+          </w:tcPr>
+          <w:p>
+            <w:r/>
+            <w:r>
+              <w:rPr>
+                <w:rFonts w:ascii="微軟正黑體" w:hAnsi="微軟正黑體" w:eastAsia="微軟正黑體"/>
+                <w:sz w:val="17"/>
+              </w:rPr>
+              <w:t>181</w:t>
+            </w:r>
+          </w:p>
+        </w:tc>
+        <w:tc>
+          <w:tcPr>
+            <w:tcW w:type="dxa" w:w="1134"/>
+          </w:tcPr>
+          <w:p>
+            <w:r/>
+            <w:r>
+              <w:rPr>
+                <w:rFonts w:ascii="微軟正黑體" w:hAnsi="微軟正黑體" w:eastAsia="微軟正黑體"/>
+                <w:sz w:val="17"/>
+              </w:rPr>
+              <w:t>0.13</w:t>
+            </w:r>
+          </w:p>
+        </w:tc>
+        <w:tc>
+          <w:tcPr>
+            <w:tcW w:type="dxa" w:w="850"/>
+          </w:tcPr>
+          <w:p>
+            <w:r/>
+            <w:r>
+              <w:rPr>
+                <w:rFonts w:ascii="微軟正黑體" w:hAnsi="微軟正黑體" w:eastAsia="微軟正黑體"/>
+                <w:sz w:val="17"/>
+              </w:rPr>
+              <w:t>6%</w:t>
+            </w:r>
+          </w:p>
+        </w:tc>
+        <w:tc>
+          <w:tcPr>
+            <w:tcW w:type="dxa" w:w="850"/>
+          </w:tcPr>
+          <w:p>
+            <w:r/>
+            <w:r>
+              <w:rPr>
+                <w:rFonts w:ascii="微軟正黑體" w:hAnsi="微軟正黑體" w:eastAsia="微軟正黑體"/>
+                <w:sz w:val="17"/>
+              </w:rPr>
+              <w:t>57</w:t>
+            </w:r>
+          </w:p>
+        </w:tc>
+        <w:tc>
+          <w:tcPr>
+            <w:tcW w:type="dxa" w:w="850"/>
+          </w:tcPr>
+          <w:p>
+            <w:r/>
+            <w:r>
+              <w:rPr>
+                <w:rFonts w:ascii="微軟正黑體" w:hAnsi="微軟正黑體" w:eastAsia="微軟正黑體"/>
+                <w:sz w:val="17"/>
+              </w:rPr>
+              <w:t>41%</w:t>
+            </w:r>
+          </w:p>
+        </w:tc>
+        <w:tc>
+          <w:tcPr>
+            <w:tcW w:type="dxa" w:w="794"/>
+          </w:tcPr>
+          <w:p>
+            <w:r/>
+            <w:r>
+              <w:rPr>
+                <w:rFonts w:ascii="微軟正黑體" w:hAnsi="微軟正黑體" w:eastAsia="微軟正黑體"/>
+                <w:sz w:val="17"/>
+              </w:rPr>
+              <w:t>12%</w:t>
+            </w:r>
+          </w:p>
+        </w:tc>
+        <w:tc>
+          <w:tcPr>
+            <w:tcW w:type="dxa" w:w="850"/>
+          </w:tcPr>
+          <w:p>
+            <w:r/>
+            <w:r>
+              <w:rPr>
+                <w:rFonts w:ascii="微軟正黑體" w:hAnsi="微軟正黑體" w:eastAsia="微軟正黑體"/>
+                <w:sz w:val="17"/>
+              </w:rPr>
+              <w:t>0.28</w:t>
+            </w:r>
+          </w:p>
+        </w:tc>
+        <w:tc>
+          <w:tcPr>
+            <w:tcW w:type="dxa" w:w="964"/>
+          </w:tcPr>
+          <w:p>
+            <w:r/>
+            <w:r>
+              <w:rPr>
+                <w:rFonts w:ascii="微軟正黑體" w:hAnsi="微軟正黑體" w:eastAsia="微軟正黑體"/>
+                <w:sz w:val="17"/>
+              </w:rPr>
+              <w:t>3.8</w:t>
+            </w:r>
+          </w:p>
+        </w:tc>
+      </w:tr>
+      <w:tr>
+        <w:tc>
+          <w:tcPr>
+            <w:tcW w:type="dxa" w:w="1361"/>
+          </w:tcPr>
+          <w:p>
+            <w:r/>
+            <w:r>
+              <w:rPr>
+                <w:rFonts w:ascii="微軟正黑體" w:hAnsi="微軟正黑體" w:eastAsia="微軟正黑體"/>
+                <w:sz w:val="17"/>
+              </w:rPr>
+              <w:t>馴獸師</w:t>
+            </w:r>
+          </w:p>
+        </w:tc>
+        <w:tc>
+          <w:tcPr>
+            <w:tcW w:type="dxa" w:w="907"/>
+          </w:tcPr>
+          <w:p>
+            <w:r/>
+            <w:r>
+              <w:rPr>
+                <w:rFonts w:ascii="微軟正黑體" w:hAnsi="微軟正黑體" w:eastAsia="微軟正黑體"/>
+                <w:sz w:val="17"/>
+              </w:rPr>
+              <w:t>6.35</w:t>
+            </w:r>
+          </w:p>
+        </w:tc>
+        <w:tc>
+          <w:tcPr>
+            <w:tcW w:type="dxa" w:w="737"/>
+          </w:tcPr>
+          <w:p>
+            <w:r/>
+            <w:r>
+              <w:rPr>
+                <w:rFonts w:ascii="微軟正黑體" w:hAnsi="微軟正黑體" w:eastAsia="微軟正黑體"/>
+                <w:sz w:val="17"/>
+              </w:rPr>
+              <w:t>167</w:t>
+            </w:r>
+          </w:p>
+        </w:tc>
+        <w:tc>
+          <w:tcPr>
+            <w:tcW w:type="dxa" w:w="1134"/>
+          </w:tcPr>
+          <w:p>
+            <w:r/>
+            <w:r>
+              <w:rPr>
+                <w:rFonts w:ascii="微軟正黑體" w:hAnsi="微軟正黑體" w:eastAsia="微軟正黑體"/>
+                <w:sz w:val="17"/>
+              </w:rPr>
+              <w:t>0.4</w:t>
+            </w:r>
+          </w:p>
+        </w:tc>
+        <w:tc>
+          <w:tcPr>
+            <w:tcW w:type="dxa" w:w="850"/>
+          </w:tcPr>
+          <w:p>
+            <w:r/>
+            <w:r>
+              <w:rPr>
+                <w:rFonts w:ascii="微軟正黑體" w:hAnsi="微軟正黑體" w:eastAsia="微軟正黑體"/>
+                <w:sz w:val="17"/>
+              </w:rPr>
+              <w:t>11%</w:t>
+            </w:r>
+          </w:p>
+        </w:tc>
+        <w:tc>
+          <w:tcPr>
+            <w:tcW w:type="dxa" w:w="850"/>
+          </w:tcPr>
+          <w:p>
+            <w:r/>
+            <w:r>
+              <w:rPr>
+                <w:rFonts w:ascii="微軟正黑體" w:hAnsi="微軟正黑體" w:eastAsia="微軟正黑體"/>
+                <w:sz w:val="17"/>
+              </w:rPr>
+              <w:t>71</w:t>
+            </w:r>
+          </w:p>
+        </w:tc>
+        <w:tc>
+          <w:tcPr>
+            <w:tcW w:type="dxa" w:w="850"/>
+          </w:tcPr>
+          <w:p>
+            <w:r/>
+            <w:r>
+              <w:rPr>
+                <w:rFonts w:ascii="微軟正黑體" w:hAnsi="微軟正黑體" w:eastAsia="微軟正黑體"/>
+                <w:sz w:val="17"/>
+              </w:rPr>
+              <w:t>60%</w:t>
+            </w:r>
+          </w:p>
+        </w:tc>
+        <w:tc>
+          <w:tcPr>
+            <w:tcW w:type="dxa" w:w="794"/>
+          </w:tcPr>
+          <w:p>
+            <w:r/>
+            <w:r>
+              <w:rPr>
+                <w:rFonts w:ascii="微軟正黑體" w:hAnsi="微軟正黑體" w:eastAsia="微軟正黑體"/>
+                <w:sz w:val="17"/>
+              </w:rPr>
+              <w:t>30%</w:t>
+            </w:r>
+          </w:p>
+        </w:tc>
+        <w:tc>
+          <w:tcPr>
+            <w:tcW w:type="dxa" w:w="850"/>
+          </w:tcPr>
+          <w:p>
+            <w:r/>
+            <w:r>
+              <w:rPr>
+                <w:rFonts w:ascii="微軟正黑體" w:hAnsi="微軟正黑體" w:eastAsia="微軟正黑體"/>
+                <w:sz w:val="17"/>
+              </w:rPr>
+              <w:t>0.36</w:t>
+            </w:r>
+          </w:p>
+        </w:tc>
+        <w:tc>
+          <w:tcPr>
+            <w:tcW w:type="dxa" w:w="964"/>
+          </w:tcPr>
+          <w:p>
+            <w:r/>
+            <w:r>
+              <w:rPr>
+                <w:rFonts w:ascii="微軟正黑體" w:hAnsi="微軟正黑體" w:eastAsia="微軟正黑體"/>
+                <w:sz w:val="17"/>
+              </w:rPr>
+              <w:t>4.1</w:t>
+            </w:r>
+          </w:p>
+        </w:tc>
+      </w:tr>
+      <w:tr>
+        <w:tc>
+          <w:tcPr>
+            <w:tcW w:type="dxa" w:w="1361"/>
+          </w:tcPr>
+          <w:p>
+            <w:r/>
+            <w:r>
+              <w:rPr>
+                <w:rFonts w:ascii="微軟正黑體" w:hAnsi="微軟正黑體" w:eastAsia="微軟正黑體"/>
+                <w:sz w:val="17"/>
+              </w:rPr>
+              <w:t>屠夫</w:t>
+            </w:r>
+          </w:p>
+        </w:tc>
+        <w:tc>
+          <w:tcPr>
+            <w:tcW w:type="dxa" w:w="907"/>
+          </w:tcPr>
+          <w:p>
+            <w:r/>
+            <w:r>
+              <w:rPr>
+                <w:rFonts w:ascii="微軟正黑體" w:hAnsi="微軟正黑體" w:eastAsia="微軟正黑體"/>
+                <w:sz w:val="17"/>
+              </w:rPr>
+              <w:t>6.35</w:t>
+            </w:r>
+          </w:p>
+        </w:tc>
+        <w:tc>
+          <w:tcPr>
+            <w:tcW w:type="dxa" w:w="737"/>
+          </w:tcPr>
+          <w:p>
+            <w:r/>
+            <w:r>
+              <w:rPr>
+                <w:rFonts w:ascii="微軟正黑體" w:hAnsi="微軟正黑體" w:eastAsia="微軟正黑體"/>
+                <w:sz w:val="17"/>
+              </w:rPr>
+              <w:t>175</w:t>
+            </w:r>
+          </w:p>
+        </w:tc>
+        <w:tc>
+          <w:tcPr>
+            <w:tcW w:type="dxa" w:w="1134"/>
+          </w:tcPr>
+          <w:p>
+            <w:r/>
+            <w:r>
+              <w:rPr>
+                <w:rFonts w:ascii="微軟正黑體" w:hAnsi="微軟正黑體" w:eastAsia="微軟正黑體"/>
+                <w:sz w:val="17"/>
+              </w:rPr>
+              <w:t>0.31</w:t>
+            </w:r>
+          </w:p>
+        </w:tc>
+        <w:tc>
+          <w:tcPr>
+            <w:tcW w:type="dxa" w:w="850"/>
+          </w:tcPr>
+          <w:p>
+            <w:r/>
+            <w:r>
+              <w:rPr>
+                <w:rFonts w:ascii="微軟正黑體" w:hAnsi="微軟正黑體" w:eastAsia="微軟正黑體"/>
+                <w:sz w:val="17"/>
+              </w:rPr>
+              <w:t>11%</w:t>
+            </w:r>
+          </w:p>
+        </w:tc>
+        <w:tc>
+          <w:tcPr>
+            <w:tcW w:type="dxa" w:w="850"/>
+          </w:tcPr>
+          <w:p>
+            <w:r/>
+            <w:r>
+              <w:rPr>
+                <w:rFonts w:ascii="微軟正黑體" w:hAnsi="微軟正黑體" w:eastAsia="微軟正黑體"/>
+                <w:sz w:val="17"/>
+              </w:rPr>
+              <w:t>55</w:t>
+            </w:r>
+          </w:p>
+        </w:tc>
+        <w:tc>
+          <w:tcPr>
+            <w:tcW w:type="dxa" w:w="850"/>
+          </w:tcPr>
+          <w:p>
+            <w:r/>
+            <w:r>
+              <w:rPr>
+                <w:rFonts w:ascii="微軟正黑體" w:hAnsi="微軟正黑體" w:eastAsia="微軟正黑體"/>
+                <w:sz w:val="17"/>
+              </w:rPr>
+              <w:t>37%</w:t>
+            </w:r>
+          </w:p>
+        </w:tc>
+        <w:tc>
+          <w:tcPr>
+            <w:tcW w:type="dxa" w:w="794"/>
+          </w:tcPr>
+          <w:p>
+            <w:r/>
+            <w:r>
+              <w:rPr>
+                <w:rFonts w:ascii="微軟正黑體" w:hAnsi="微軟正黑體" w:eastAsia="微軟正黑體"/>
+                <w:sz w:val="17"/>
+              </w:rPr>
+              <w:t>13%</w:t>
+            </w:r>
+          </w:p>
+        </w:tc>
+        <w:tc>
+          <w:tcPr>
+            <w:tcW w:type="dxa" w:w="850"/>
+          </w:tcPr>
+          <w:p>
+            <w:r/>
+            <w:r>
+              <w:rPr>
+                <w:rFonts w:ascii="微軟正黑體" w:hAnsi="微軟正黑體" w:eastAsia="微軟正黑體"/>
+                <w:sz w:val="17"/>
+              </w:rPr>
+              <w:t>0.53</w:t>
+            </w:r>
+          </w:p>
+        </w:tc>
+        <w:tc>
+          <w:tcPr>
+            <w:tcW w:type="dxa" w:w="964"/>
+          </w:tcPr>
+          <w:p>
+            <w:r/>
+            <w:r>
+              <w:rPr>
+                <w:rFonts w:ascii="微軟正黑體" w:hAnsi="微軟正黑體" w:eastAsia="微軟正黑體"/>
+                <w:sz w:val="17"/>
+              </w:rPr>
+              <w:t>4.3</w:t>
+            </w:r>
+          </w:p>
+        </w:tc>
+      </w:tr>
+      <w:tr>
+        <w:tc>
+          <w:tcPr>
+            <w:tcW w:type="dxa" w:w="1361"/>
+          </w:tcPr>
+          <w:p>
+            <w:r/>
+            <w:r>
+              <w:rPr>
+                <w:rFonts w:ascii="微軟正黑體" w:hAnsi="微軟正黑體" w:eastAsia="微軟正黑體"/>
+                <w:sz w:val="17"/>
+              </w:rPr>
+              <w:t>攀岩者</w:t>
+            </w:r>
+          </w:p>
+        </w:tc>
+        <w:tc>
+          <w:tcPr>
+            <w:tcW w:type="dxa" w:w="907"/>
+          </w:tcPr>
+          <w:p>
+            <w:r/>
+            <w:r>
+              <w:rPr>
+                <w:rFonts w:ascii="微軟正黑體" w:hAnsi="微軟正黑體" w:eastAsia="微軟正黑體"/>
+                <w:sz w:val="17"/>
+              </w:rPr>
+              <w:t>6.2</w:t>
+            </w:r>
+          </w:p>
+        </w:tc>
+        <w:tc>
+          <w:tcPr>
+            <w:tcW w:type="dxa" w:w="737"/>
+          </w:tcPr>
+          <w:p>
+            <w:r/>
+            <w:r>
+              <w:rPr>
+                <w:rFonts w:ascii="微軟正黑體" w:hAnsi="微軟正黑體" w:eastAsia="微軟正黑體"/>
+                <w:sz w:val="17"/>
+              </w:rPr>
+              <w:t>192</w:t>
+            </w:r>
+          </w:p>
+        </w:tc>
+        <w:tc>
+          <w:tcPr>
+            <w:tcW w:type="dxa" w:w="1134"/>
+          </w:tcPr>
+          <w:p>
+            <w:r/>
+            <w:r>
+              <w:rPr>
+                <w:rFonts w:ascii="微軟正黑體" w:hAnsi="微軟正黑體" w:eastAsia="微軟正黑體"/>
+                <w:sz w:val="17"/>
+              </w:rPr>
+              <w:t>0.21</w:t>
+            </w:r>
+          </w:p>
+        </w:tc>
+        <w:tc>
+          <w:tcPr>
+            <w:tcW w:type="dxa" w:w="850"/>
+          </w:tcPr>
+          <w:p>
+            <w:r/>
+            <w:r>
+              <w:rPr>
+                <w:rFonts w:ascii="微軟正黑體" w:hAnsi="微軟正黑體" w:eastAsia="微軟正黑體"/>
+                <w:sz w:val="17"/>
+              </w:rPr>
+              <w:t>6%</w:t>
+            </w:r>
+          </w:p>
+        </w:tc>
+        <w:tc>
+          <w:tcPr>
+            <w:tcW w:type="dxa" w:w="850"/>
+          </w:tcPr>
+          <w:p>
+            <w:r/>
+            <w:r>
+              <w:rPr>
+                <w:rFonts w:ascii="微軟正黑體" w:hAnsi="微軟正黑體" w:eastAsia="微軟正黑體"/>
+                <w:sz w:val="17"/>
+              </w:rPr>
+              <w:t>51</w:t>
+            </w:r>
+          </w:p>
+        </w:tc>
+        <w:tc>
+          <w:tcPr>
+            <w:tcW w:type="dxa" w:w="850"/>
+          </w:tcPr>
+          <w:p>
+            <w:r/>
+            <w:r>
+              <w:rPr>
+                <w:rFonts w:ascii="微軟正黑體" w:hAnsi="微軟正黑體" w:eastAsia="微軟正黑體"/>
+                <w:sz w:val="17"/>
+              </w:rPr>
+              <w:t>34%</w:t>
+            </w:r>
+          </w:p>
+        </w:tc>
+        <w:tc>
+          <w:tcPr>
+            <w:tcW w:type="dxa" w:w="794"/>
+          </w:tcPr>
+          <w:p>
+            <w:r/>
+            <w:r>
+              <w:rPr>
+                <w:rFonts w:ascii="微軟正黑體" w:hAnsi="微軟正黑體" w:eastAsia="微軟正黑體"/>
+                <w:sz w:val="17"/>
+              </w:rPr>
+              <w:t>11%</w:t>
+            </w:r>
+          </w:p>
+        </w:tc>
+        <w:tc>
+          <w:tcPr>
+            <w:tcW w:type="dxa" w:w="850"/>
+          </w:tcPr>
+          <w:p>
+            <w:r/>
+            <w:r>
+              <w:rPr>
+                <w:rFonts w:ascii="微軟正黑體" w:hAnsi="微軟正黑體" w:eastAsia="微軟正黑體"/>
+                <w:sz w:val="17"/>
+              </w:rPr>
+              <w:t>0.16</w:t>
+            </w:r>
+          </w:p>
+        </w:tc>
+        <w:tc>
+          <w:tcPr>
+            <w:tcW w:type="dxa" w:w="964"/>
+          </w:tcPr>
+          <w:p>
+            <w:r/>
+            <w:r>
+              <w:rPr>
+                <w:rFonts w:ascii="微軟正黑體" w:hAnsi="微軟正黑體" w:eastAsia="微軟正黑體"/>
+                <w:sz w:val="17"/>
+              </w:rPr>
+              <w:t>3.9</w:t>
+            </w:r>
+          </w:p>
+        </w:tc>
+      </w:tr>
+      <w:tr>
+        <w:tc>
+          <w:tcPr>
+            <w:tcW w:type="dxa" w:w="1361"/>
+          </w:tcPr>
+          <w:p>
+            <w:r/>
+            <w:r>
+              <w:rPr>
+                <w:rFonts w:ascii="微軟正黑體" w:hAnsi="微軟正黑體" w:eastAsia="微軟正黑體"/>
+                <w:sz w:val="17"/>
+              </w:rPr>
+              <w:t>工程師</w:t>
+            </w:r>
+          </w:p>
+        </w:tc>
+        <w:tc>
+          <w:tcPr>
+            <w:tcW w:type="dxa" w:w="907"/>
+          </w:tcPr>
+          <w:p>
+            <w:r/>
+            <w:r>
+              <w:rPr>
+                <w:rFonts w:ascii="微軟正黑體" w:hAnsi="微軟正黑體" w:eastAsia="微軟正黑體"/>
+                <w:sz w:val="17"/>
+              </w:rPr>
+              <w:t>6.05</w:t>
+            </w:r>
+          </w:p>
+        </w:tc>
+        <w:tc>
+          <w:tcPr>
+            <w:tcW w:type="dxa" w:w="737"/>
+          </w:tcPr>
+          <w:p>
+            <w:r/>
+            <w:r>
+              <w:rPr>
+                <w:rFonts w:ascii="微軟正黑體" w:hAnsi="微軟正黑體" w:eastAsia="微軟正黑體"/>
+                <w:sz w:val="17"/>
+              </w:rPr>
+              <w:t>176</w:t>
+            </w:r>
+          </w:p>
+        </w:tc>
+        <w:tc>
+          <w:tcPr>
+            <w:tcW w:type="dxa" w:w="1134"/>
+          </w:tcPr>
+          <w:p>
+            <w:r/>
+            <w:r>
+              <w:rPr>
+                <w:rFonts w:ascii="微軟正黑體" w:hAnsi="微軟正黑體" w:eastAsia="微軟正黑體"/>
+                <w:sz w:val="17"/>
+              </w:rPr>
+              <w:t>0.55</w:t>
+            </w:r>
+          </w:p>
+        </w:tc>
+        <w:tc>
+          <w:tcPr>
+            <w:tcW w:type="dxa" w:w="850"/>
+          </w:tcPr>
+          <w:p>
+            <w:r/>
+            <w:r>
+              <w:rPr>
+                <w:rFonts w:ascii="微軟正黑體" w:hAnsi="微軟正黑體" w:eastAsia="微軟正黑體"/>
+                <w:sz w:val="17"/>
+              </w:rPr>
+              <w:t>15%</w:t>
+            </w:r>
+          </w:p>
+        </w:tc>
+        <w:tc>
+          <w:tcPr>
+            <w:tcW w:type="dxa" w:w="850"/>
+          </w:tcPr>
+          <w:p>
+            <w:r/>
+            <w:r>
+              <w:rPr>
+                <w:rFonts w:ascii="微軟正黑體" w:hAnsi="微軟正黑體" w:eastAsia="微軟正黑體"/>
+                <w:sz w:val="17"/>
+              </w:rPr>
+              <w:t>57</w:t>
+            </w:r>
+          </w:p>
+        </w:tc>
+        <w:tc>
+          <w:tcPr>
+            <w:tcW w:type="dxa" w:w="850"/>
+          </w:tcPr>
+          <w:p>
+            <w:r/>
+            <w:r>
+              <w:rPr>
+                <w:rFonts w:ascii="微軟正黑體" w:hAnsi="微軟正黑體" w:eastAsia="微軟正黑體"/>
+                <w:sz w:val="17"/>
+              </w:rPr>
+              <w:t>42%</w:t>
+            </w:r>
+          </w:p>
+        </w:tc>
+        <w:tc>
+          <w:tcPr>
+            <w:tcW w:type="dxa" w:w="794"/>
+          </w:tcPr>
+          <w:p>
+            <w:r/>
+            <w:r>
+              <w:rPr>
+                <w:rFonts w:ascii="微軟正黑體" w:hAnsi="微軟正黑體" w:eastAsia="微軟正黑體"/>
+                <w:sz w:val="17"/>
+              </w:rPr>
+              <w:t>17%</w:t>
+            </w:r>
+          </w:p>
+        </w:tc>
+        <w:tc>
+          <w:tcPr>
+            <w:tcW w:type="dxa" w:w="850"/>
+          </w:tcPr>
+          <w:p>
+            <w:r/>
+            <w:r>
+              <w:rPr>
+                <w:rFonts w:ascii="微軟正黑體" w:hAnsi="微軟正黑體" w:eastAsia="微軟正黑體"/>
+                <w:sz w:val="17"/>
+              </w:rPr>
+              <w:t>0.26</w:t>
+            </w:r>
+          </w:p>
+        </w:tc>
+        <w:tc>
+          <w:tcPr>
+            <w:tcW w:type="dxa" w:w="964"/>
+          </w:tcPr>
+          <w:p>
+            <w:r/>
+            <w:r>
+              <w:rPr>
+                <w:rFonts w:ascii="微軟正黑體" w:hAnsi="微軟正黑體" w:eastAsia="微軟正黑體"/>
+                <w:sz w:val="17"/>
+              </w:rPr>
+              <w:t>4</w:t>
+            </w:r>
+          </w:p>
+        </w:tc>
+      </w:tr>
+      <w:tr>
+        <w:tc>
+          <w:tcPr>
+            <w:tcW w:type="dxa" w:w="1361"/>
+          </w:tcPr>
+          <w:p>
+            <w:r/>
+            <w:r>
+              <w:rPr>
+                <w:rFonts w:ascii="微軟正黑體" w:hAnsi="微軟正黑體" w:eastAsia="微軟正黑體"/>
+                <w:sz w:val="17"/>
+              </w:rPr>
+              <w:t>橡膠人</w:t>
+            </w:r>
+          </w:p>
+        </w:tc>
+        <w:tc>
+          <w:tcPr>
+            <w:tcW w:type="dxa" w:w="907"/>
+          </w:tcPr>
+          <w:p>
+            <w:r/>
+            <w:r>
+              <w:rPr>
+                <w:rFonts w:ascii="微軟正黑體" w:hAnsi="微軟正黑體" w:eastAsia="微軟正黑體"/>
+                <w:sz w:val="17"/>
+              </w:rPr>
+              <w:t>6.0</w:t>
+            </w:r>
+          </w:p>
+        </w:tc>
+        <w:tc>
+          <w:tcPr>
+            <w:tcW w:type="dxa" w:w="737"/>
+          </w:tcPr>
+          <w:p>
+            <w:r/>
+            <w:r>
+              <w:rPr>
+                <w:rFonts w:ascii="微軟正黑體" w:hAnsi="微軟正黑體" w:eastAsia="微軟正黑體"/>
+                <w:sz w:val="17"/>
+              </w:rPr>
+              <w:t>169</w:t>
+            </w:r>
+          </w:p>
+        </w:tc>
+        <w:tc>
+          <w:tcPr>
+            <w:tcW w:type="dxa" w:w="1134"/>
+          </w:tcPr>
+          <w:p>
+            <w:r/>
+            <w:r>
+              <w:rPr>
+                <w:rFonts w:ascii="微軟正黑體" w:hAnsi="微軟正黑體" w:eastAsia="微軟正黑體"/>
+                <w:sz w:val="17"/>
+              </w:rPr>
+              <w:t>0.22</w:t>
+            </w:r>
+          </w:p>
+        </w:tc>
+        <w:tc>
+          <w:tcPr>
+            <w:tcW w:type="dxa" w:w="850"/>
+          </w:tcPr>
+          <w:p>
+            <w:r/>
+            <w:r>
+              <w:rPr>
+                <w:rFonts w:ascii="微軟正黑體" w:hAnsi="微軟正黑體" w:eastAsia="微軟正黑體"/>
+                <w:sz w:val="17"/>
+              </w:rPr>
+              <w:t>8%</w:t>
+            </w:r>
+          </w:p>
+        </w:tc>
+        <w:tc>
+          <w:tcPr>
+            <w:tcW w:type="dxa" w:w="850"/>
+          </w:tcPr>
+          <w:p>
+            <w:r/>
+            <w:r>
+              <w:rPr>
+                <w:rFonts w:ascii="微軟正黑體" w:hAnsi="微軟正黑體" w:eastAsia="微軟正黑體"/>
+                <w:sz w:val="17"/>
+              </w:rPr>
+              <w:t>56</w:t>
+            </w:r>
+          </w:p>
+        </w:tc>
+        <w:tc>
+          <w:tcPr>
+            <w:tcW w:type="dxa" w:w="850"/>
+          </w:tcPr>
+          <w:p>
+            <w:r/>
+            <w:r>
+              <w:rPr>
+                <w:rFonts w:ascii="微軟正黑體" w:hAnsi="微軟正黑體" w:eastAsia="微軟正黑體"/>
+                <w:sz w:val="17"/>
+              </w:rPr>
+              <w:t>39%</w:t>
+            </w:r>
+          </w:p>
+        </w:tc>
+        <w:tc>
+          <w:tcPr>
+            <w:tcW w:type="dxa" w:w="794"/>
+          </w:tcPr>
+          <w:p>
+            <w:r/>
+            <w:r>
+              <w:rPr>
+                <w:rFonts w:ascii="微軟正黑體" w:hAnsi="微軟正黑體" w:eastAsia="微軟正黑體"/>
+                <w:sz w:val="17"/>
+              </w:rPr>
+              <w:t>14%</w:t>
+            </w:r>
+          </w:p>
+        </w:tc>
+        <w:tc>
+          <w:tcPr>
+            <w:tcW w:type="dxa" w:w="850"/>
+          </w:tcPr>
+          <w:p>
+            <w:r/>
+            <w:r>
+              <w:rPr>
+                <w:rFonts w:ascii="微軟正黑體" w:hAnsi="微軟正黑體" w:eastAsia="微軟正黑體"/>
+                <w:sz w:val="17"/>
+              </w:rPr>
+              <w:t>0.05</w:t>
+            </w:r>
+          </w:p>
+        </w:tc>
+        <w:tc>
+          <w:tcPr>
+            <w:tcW w:type="dxa" w:w="964"/>
+          </w:tcPr>
+          <w:p>
+            <w:r/>
+            <w:r>
+              <w:rPr>
+                <w:rFonts w:ascii="微軟正黑體" w:hAnsi="微軟正黑體" w:eastAsia="微軟正黑體"/>
+                <w:sz w:val="17"/>
+              </w:rPr>
+              <w:t>3.7</w:t>
+            </w:r>
+          </w:p>
+        </w:tc>
+      </w:tr>
+      <w:tr>
+        <w:tc>
+          <w:tcPr>
+            <w:tcW w:type="dxa" w:w="1361"/>
+          </w:tcPr>
+          <w:p>
+            <w:r/>
+            <w:r>
+              <w:rPr>
+                <w:rFonts w:ascii="微軟正黑體" w:hAnsi="微軟正黑體" w:eastAsia="微軟正黑體"/>
+                <w:sz w:val="17"/>
+              </w:rPr>
+              <w:t>基因怪人</w:t>
+            </w:r>
+          </w:p>
+        </w:tc>
+        <w:tc>
+          <w:tcPr>
+            <w:tcW w:type="dxa" w:w="907"/>
+          </w:tcPr>
+          <w:p>
+            <w:r/>
+            <w:r>
+              <w:rPr>
+                <w:rFonts w:ascii="微軟正黑體" w:hAnsi="微軟正黑體" w:eastAsia="微軟正黑體"/>
+                <w:sz w:val="17"/>
+              </w:rPr>
+              <w:t>5.9</w:t>
+            </w:r>
+          </w:p>
+        </w:tc>
+        <w:tc>
+          <w:tcPr>
+            <w:tcW w:type="dxa" w:w="737"/>
+          </w:tcPr>
+          <w:p>
+            <w:r/>
+            <w:r>
+              <w:rPr>
+                <w:rFonts w:ascii="微軟正黑體" w:hAnsi="微軟正黑體" w:eastAsia="微軟正黑體"/>
+                <w:sz w:val="17"/>
+              </w:rPr>
+              <w:t>157</w:t>
+            </w:r>
+          </w:p>
+        </w:tc>
+        <w:tc>
+          <w:tcPr>
+            <w:tcW w:type="dxa" w:w="1134"/>
+          </w:tcPr>
+          <w:p>
+            <w:r/>
+            <w:r>
+              <w:rPr>
+                <w:rFonts w:ascii="微軟正黑體" w:hAnsi="微軟正黑體" w:eastAsia="微軟正黑體"/>
+                <w:sz w:val="17"/>
+              </w:rPr>
+              <w:t>0.43</w:t>
+            </w:r>
+          </w:p>
+        </w:tc>
+        <w:tc>
+          <w:tcPr>
+            <w:tcW w:type="dxa" w:w="850"/>
+          </w:tcPr>
+          <w:p>
+            <w:r/>
+            <w:r>
+              <w:rPr>
+                <w:rFonts w:ascii="微軟正黑體" w:hAnsi="微軟正黑體" w:eastAsia="微軟正黑體"/>
+                <w:sz w:val="17"/>
+              </w:rPr>
+              <w:t>12%</w:t>
+            </w:r>
+          </w:p>
+        </w:tc>
+        <w:tc>
+          <w:tcPr>
+            <w:tcW w:type="dxa" w:w="850"/>
+          </w:tcPr>
+          <w:p>
+            <w:r/>
+            <w:r>
+              <w:rPr>
+                <w:rFonts w:ascii="微軟正黑體" w:hAnsi="微軟正黑體" w:eastAsia="微軟正黑體"/>
+                <w:sz w:val="17"/>
+              </w:rPr>
+              <w:t>54</w:t>
+            </w:r>
+          </w:p>
+        </w:tc>
+        <w:tc>
+          <w:tcPr>
+            <w:tcW w:type="dxa" w:w="850"/>
+          </w:tcPr>
+          <w:p>
+            <w:r/>
+            <w:r>
+              <w:rPr>
+                <w:rFonts w:ascii="微軟正黑體" w:hAnsi="微軟正黑體" w:eastAsia="微軟正黑體"/>
+                <w:sz w:val="17"/>
+              </w:rPr>
+              <w:t>34%</w:t>
+            </w:r>
+          </w:p>
+        </w:tc>
+        <w:tc>
+          <w:tcPr>
+            <w:tcW w:type="dxa" w:w="794"/>
+          </w:tcPr>
+          <w:p>
+            <w:r/>
+            <w:r>
+              <w:rPr>
+                <w:rFonts w:ascii="微軟正黑體" w:hAnsi="微軟正黑體" w:eastAsia="微軟正黑體"/>
+                <w:sz w:val="17"/>
+              </w:rPr>
+              <w:t>9%</w:t>
+            </w:r>
+          </w:p>
+        </w:tc>
+        <w:tc>
+          <w:tcPr>
+            <w:tcW w:type="dxa" w:w="850"/>
+          </w:tcPr>
+          <w:p>
+            <w:r/>
+            <w:r>
+              <w:rPr>
+                <w:rFonts w:ascii="微軟正黑體" w:hAnsi="微軟正黑體" w:eastAsia="微軟正黑體"/>
+                <w:sz w:val="17"/>
+              </w:rPr>
+              <w:t>0.27</w:t>
+            </w:r>
+          </w:p>
+        </w:tc>
+        <w:tc>
+          <w:tcPr>
+            <w:tcW w:type="dxa" w:w="964"/>
+          </w:tcPr>
+          <w:p>
+            <w:r/>
+            <w:r>
+              <w:rPr>
+                <w:rFonts w:ascii="微軟正黑體" w:hAnsi="微軟正黑體" w:eastAsia="微軟正黑體"/>
+                <w:sz w:val="17"/>
+              </w:rPr>
+              <w:t>4.3</w:t>
+            </w:r>
+          </w:p>
+        </w:tc>
+      </w:tr>
+      <w:tr>
+        <w:tc>
+          <w:tcPr>
+            <w:tcW w:type="dxa" w:w="1361"/>
+          </w:tcPr>
+          <w:p>
+            <w:r/>
+            <w:r>
+              <w:rPr>
+                <w:rFonts w:ascii="微軟正黑體" w:hAnsi="微軟正黑體" w:eastAsia="微軟正黑體"/>
+                <w:sz w:val="17"/>
+              </w:rPr>
+              <w:t>拾荒者</w:t>
+            </w:r>
+          </w:p>
+        </w:tc>
+        <w:tc>
+          <w:tcPr>
+            <w:tcW w:type="dxa" w:w="907"/>
+          </w:tcPr>
+          <w:p>
+            <w:r/>
+            <w:r>
+              <w:rPr>
+                <w:rFonts w:ascii="微軟正黑體" w:hAnsi="微軟正黑體" w:eastAsia="微軟正黑體"/>
+                <w:sz w:val="17"/>
+              </w:rPr>
+              <w:t>5.75</w:t>
+            </w:r>
+          </w:p>
+        </w:tc>
+        <w:tc>
+          <w:tcPr>
+            <w:tcW w:type="dxa" w:w="737"/>
+          </w:tcPr>
+          <w:p>
+            <w:r/>
+            <w:r>
+              <w:rPr>
+                <w:rFonts w:ascii="微軟正黑體" w:hAnsi="微軟正黑體" w:eastAsia="微軟正黑體"/>
+                <w:sz w:val="17"/>
+              </w:rPr>
+              <w:t>164</w:t>
+            </w:r>
+          </w:p>
+        </w:tc>
+        <w:tc>
+          <w:tcPr>
+            <w:tcW w:type="dxa" w:w="1134"/>
+          </w:tcPr>
+          <w:p>
+            <w:r/>
+            <w:r>
+              <w:rPr>
+                <w:rFonts w:ascii="微軟正黑體" w:hAnsi="微軟正黑體" w:eastAsia="微軟正黑體"/>
+                <w:sz w:val="17"/>
+              </w:rPr>
+              <w:t>0.42</w:t>
+            </w:r>
+          </w:p>
+        </w:tc>
+        <w:tc>
+          <w:tcPr>
+            <w:tcW w:type="dxa" w:w="850"/>
+          </w:tcPr>
+          <w:p>
+            <w:r/>
+            <w:r>
+              <w:rPr>
+                <w:rFonts w:ascii="微軟正黑體" w:hAnsi="微軟正黑體" w:eastAsia="微軟正黑體"/>
+                <w:sz w:val="17"/>
+              </w:rPr>
+              <w:t>10%</w:t>
+            </w:r>
+          </w:p>
+        </w:tc>
+        <w:tc>
+          <w:tcPr>
+            <w:tcW w:type="dxa" w:w="850"/>
+          </w:tcPr>
+          <w:p>
+            <w:r/>
+            <w:r>
+              <w:rPr>
+                <w:rFonts w:ascii="微軟正黑體" w:hAnsi="微軟正黑體" w:eastAsia="微軟正黑體"/>
+                <w:sz w:val="17"/>
+              </w:rPr>
+              <w:t>58</w:t>
+            </w:r>
+          </w:p>
+        </w:tc>
+        <w:tc>
+          <w:tcPr>
+            <w:tcW w:type="dxa" w:w="850"/>
+          </w:tcPr>
+          <w:p>
+            <w:r/>
+            <w:r>
+              <w:rPr>
+                <w:rFonts w:ascii="微軟正黑體" w:hAnsi="微軟正黑體" w:eastAsia="微軟正黑體"/>
+                <w:sz w:val="17"/>
+              </w:rPr>
+              <w:t>43%</w:t>
+            </w:r>
+          </w:p>
+        </w:tc>
+        <w:tc>
+          <w:tcPr>
+            <w:tcW w:type="dxa" w:w="794"/>
+          </w:tcPr>
+          <w:p>
+            <w:r/>
+            <w:r>
+              <w:rPr>
+                <w:rFonts w:ascii="微軟正黑體" w:hAnsi="微軟正黑體" w:eastAsia="微軟正黑體"/>
+                <w:sz w:val="17"/>
+              </w:rPr>
+              <w:t>15%</w:t>
+            </w:r>
+          </w:p>
+        </w:tc>
+        <w:tc>
+          <w:tcPr>
+            <w:tcW w:type="dxa" w:w="850"/>
+          </w:tcPr>
+          <w:p>
+            <w:r/>
+            <w:r>
+              <w:rPr>
+                <w:rFonts w:ascii="微軟正黑體" w:hAnsi="微軟正黑體" w:eastAsia="微軟正黑體"/>
+                <w:sz w:val="17"/>
+              </w:rPr>
+              <w:t>0.32</w:t>
+            </w:r>
+          </w:p>
+        </w:tc>
+        <w:tc>
+          <w:tcPr>
+            <w:tcW w:type="dxa" w:w="964"/>
+          </w:tcPr>
+          <w:p>
+            <w:r/>
+            <w:r>
+              <w:rPr>
+                <w:rFonts w:ascii="微軟正黑體" w:hAnsi="微軟正黑體" w:eastAsia="微軟正黑體"/>
+                <w:sz w:val="17"/>
+              </w:rPr>
+              <w:t>3.9</w:t>
+            </w:r>
+          </w:p>
+        </w:tc>
+      </w:tr>
+      <w:tr>
+        <w:tc>
+          <w:tcPr>
+            <w:tcW w:type="dxa" w:w="1361"/>
+          </w:tcPr>
+          <w:p>
+            <w:r/>
+            <w:r>
+              <w:rPr>
+                <w:rFonts w:ascii="微軟正黑體" w:hAnsi="微軟正黑體" w:eastAsia="微軟正黑體"/>
+                <w:sz w:val="17"/>
+              </w:rPr>
+              <w:t>還魂師</w:t>
+            </w:r>
+          </w:p>
+        </w:tc>
+        <w:tc>
+          <w:tcPr>
+            <w:tcW w:type="dxa" w:w="907"/>
+          </w:tcPr>
+          <w:p>
+            <w:r/>
+            <w:r>
+              <w:rPr>
+                <w:rFonts w:ascii="微軟正黑體" w:hAnsi="微軟正黑體" w:eastAsia="微軟正黑體"/>
+                <w:sz w:val="17"/>
+              </w:rPr>
+              <w:t>5.55</w:t>
+            </w:r>
+          </w:p>
+        </w:tc>
+        <w:tc>
+          <w:tcPr>
+            <w:tcW w:type="dxa" w:w="737"/>
+          </w:tcPr>
+          <w:p>
+            <w:r/>
+            <w:r>
+              <w:rPr>
+                <w:rFonts w:ascii="微軟正黑體" w:hAnsi="微軟正黑體" w:eastAsia="微軟正黑體"/>
+                <w:sz w:val="17"/>
+              </w:rPr>
+              <w:t>163</w:t>
+            </w:r>
+          </w:p>
+        </w:tc>
+        <w:tc>
+          <w:tcPr>
+            <w:tcW w:type="dxa" w:w="1134"/>
+          </w:tcPr>
+          <w:p>
+            <w:r/>
+            <w:r>
+              <w:rPr>
+                <w:rFonts w:ascii="微軟正黑體" w:hAnsi="微軟正黑體" w:eastAsia="微軟正黑體"/>
+                <w:sz w:val="17"/>
+              </w:rPr>
+              <w:t>0.21</w:t>
+            </w:r>
+          </w:p>
+        </w:tc>
+        <w:tc>
+          <w:tcPr>
+            <w:tcW w:type="dxa" w:w="850"/>
+          </w:tcPr>
+          <w:p>
+            <w:r/>
+            <w:r>
+              <w:rPr>
+                <w:rFonts w:ascii="微軟正黑體" w:hAnsi="微軟正黑體" w:eastAsia="微軟正黑體"/>
+                <w:sz w:val="17"/>
+              </w:rPr>
+              <w:t>7%</w:t>
+            </w:r>
+          </w:p>
+        </w:tc>
+        <w:tc>
+          <w:tcPr>
+            <w:tcW w:type="dxa" w:w="850"/>
+          </w:tcPr>
+          <w:p>
+            <w:r/>
+            <w:r>
+              <w:rPr>
+                <w:rFonts w:ascii="微軟正黑體" w:hAnsi="微軟正黑體" w:eastAsia="微軟正黑體"/>
+                <w:sz w:val="17"/>
+              </w:rPr>
+              <w:t>55</w:t>
+            </w:r>
+          </w:p>
+        </w:tc>
+        <w:tc>
+          <w:tcPr>
+            <w:tcW w:type="dxa" w:w="850"/>
+          </w:tcPr>
+          <w:p>
+            <w:r/>
+            <w:r>
+              <w:rPr>
+                <w:rFonts w:ascii="微軟正黑體" w:hAnsi="微軟正黑體" w:eastAsia="微軟正黑體"/>
+                <w:sz w:val="17"/>
+              </w:rPr>
+              <w:t>35%</w:t>
+            </w:r>
+          </w:p>
+        </w:tc>
+        <w:tc>
+          <w:tcPr>
+            <w:tcW w:type="dxa" w:w="794"/>
+          </w:tcPr>
+          <w:p>
+            <w:r/>
+            <w:r>
+              <w:rPr>
+                <w:rFonts w:ascii="微軟正黑體" w:hAnsi="微軟正黑體" w:eastAsia="微軟正黑體"/>
+                <w:sz w:val="17"/>
+              </w:rPr>
+              <w:t>13%</w:t>
+            </w:r>
+          </w:p>
+        </w:tc>
+        <w:tc>
+          <w:tcPr>
+            <w:tcW w:type="dxa" w:w="850"/>
+          </w:tcPr>
+          <w:p>
+            <w:r/>
+            <w:r>
+              <w:rPr>
+                <w:rFonts w:ascii="微軟正黑體" w:hAnsi="微軟正黑體" w:eastAsia="微軟正黑體"/>
+                <w:sz w:val="17"/>
+              </w:rPr>
+              <w:t>0.33</w:t>
+            </w:r>
+          </w:p>
+        </w:tc>
+        <w:tc>
+          <w:tcPr>
+            <w:tcW w:type="dxa" w:w="964"/>
+          </w:tcPr>
+          <w:p>
+            <w:r/>
+            <w:r>
+              <w:rPr>
+                <w:rFonts w:ascii="微軟正黑體" w:hAnsi="微軟正黑體" w:eastAsia="微軟正黑體"/>
+                <w:sz w:val="17"/>
+              </w:rPr>
+              <w:t>4.1</w:t>
+            </w:r>
+          </w:p>
+        </w:tc>
+      </w:tr>
+      <w:tr>
+        <w:tc>
+          <w:tcPr>
+            <w:tcW w:type="dxa" w:w="1361"/>
+          </w:tcPr>
+          <w:p>
+            <w:r/>
+            <w:r>
+              <w:rPr>
+                <w:rFonts w:ascii="微軟正黑體" w:hAnsi="微軟正黑體" w:eastAsia="微軟正黑體"/>
+                <w:sz w:val="17"/>
+              </w:rPr>
+              <w:t>購物大媽</w:t>
+            </w:r>
+          </w:p>
+        </w:tc>
+        <w:tc>
+          <w:tcPr>
+            <w:tcW w:type="dxa" w:w="907"/>
+          </w:tcPr>
+          <w:p>
+            <w:r/>
+            <w:r>
+              <w:rPr>
+                <w:rFonts w:ascii="微軟正黑體" w:hAnsi="微軟正黑體" w:eastAsia="微軟正黑體"/>
+                <w:sz w:val="17"/>
+              </w:rPr>
+              <w:t>5.45</w:t>
+            </w:r>
+          </w:p>
+        </w:tc>
+        <w:tc>
+          <w:tcPr>
+            <w:tcW w:type="dxa" w:w="737"/>
+          </w:tcPr>
+          <w:p>
+            <w:r/>
+            <w:r>
+              <w:rPr>
+                <w:rFonts w:ascii="微軟正黑體" w:hAnsi="微軟正黑體" w:eastAsia="微軟正黑體"/>
+                <w:sz w:val="17"/>
+              </w:rPr>
+              <w:t>164</w:t>
+            </w:r>
+          </w:p>
+        </w:tc>
+        <w:tc>
+          <w:tcPr>
+            <w:tcW w:type="dxa" w:w="1134"/>
+          </w:tcPr>
+          <w:p>
+            <w:r/>
+            <w:r>
+              <w:rPr>
+                <w:rFonts w:ascii="微軟正黑體" w:hAnsi="微軟正黑體" w:eastAsia="微軟正黑體"/>
+                <w:sz w:val="17"/>
+              </w:rPr>
+              <w:t>0.16</w:t>
+            </w:r>
+          </w:p>
+        </w:tc>
+        <w:tc>
+          <w:tcPr>
+            <w:tcW w:type="dxa" w:w="850"/>
+          </w:tcPr>
+          <w:p>
+            <w:r/>
+            <w:r>
+              <w:rPr>
+                <w:rFonts w:ascii="微軟正黑體" w:hAnsi="微軟正黑體" w:eastAsia="微軟正黑體"/>
+                <w:sz w:val="17"/>
+              </w:rPr>
+              <w:t>5%</w:t>
+            </w:r>
+          </w:p>
+        </w:tc>
+        <w:tc>
+          <w:tcPr>
+            <w:tcW w:type="dxa" w:w="850"/>
+          </w:tcPr>
+          <w:p>
+            <w:r/>
+            <w:r>
+              <w:rPr>
+                <w:rFonts w:ascii="微軟正黑體" w:hAnsi="微軟正黑體" w:eastAsia="微軟正黑體"/>
+                <w:sz w:val="17"/>
+              </w:rPr>
+              <w:t>58</w:t>
+            </w:r>
+          </w:p>
+        </w:tc>
+        <w:tc>
+          <w:tcPr>
+            <w:tcW w:type="dxa" w:w="850"/>
+          </w:tcPr>
+          <w:p>
+            <w:r/>
+            <w:r>
+              <w:rPr>
+                <w:rFonts w:ascii="微軟正黑體" w:hAnsi="微軟正黑體" w:eastAsia="微軟正黑體"/>
+                <w:sz w:val="17"/>
+              </w:rPr>
+              <w:t>40%</w:t>
+            </w:r>
+          </w:p>
+        </w:tc>
+        <w:tc>
+          <w:tcPr>
+            <w:tcW w:type="dxa" w:w="794"/>
+          </w:tcPr>
+          <w:p>
+            <w:r/>
+            <w:r>
+              <w:rPr>
+                <w:rFonts w:ascii="微軟正黑體" w:hAnsi="微軟正黑體" w:eastAsia="微軟正黑體"/>
+                <w:sz w:val="17"/>
+              </w:rPr>
+              <w:t>14%</w:t>
+            </w:r>
+          </w:p>
+        </w:tc>
+        <w:tc>
+          <w:tcPr>
+            <w:tcW w:type="dxa" w:w="850"/>
+          </w:tcPr>
+          <w:p>
+            <w:r/>
+            <w:r>
+              <w:rPr>
+                <w:rFonts w:ascii="微軟正黑體" w:hAnsi="微軟正黑體" w:eastAsia="微軟正黑體"/>
+                <w:sz w:val="17"/>
+              </w:rPr>
+              <w:t>0.23</w:t>
+            </w:r>
+          </w:p>
+        </w:tc>
+        <w:tc>
+          <w:tcPr>
+            <w:tcW w:type="dxa" w:w="964"/>
+          </w:tcPr>
+          <w:p>
+            <w:r/>
+            <w:r>
+              <w:rPr>
+                <w:rFonts w:ascii="微軟正黑體" w:hAnsi="微軟正黑體" w:eastAsia="微軟正黑體"/>
+                <w:sz w:val="17"/>
+              </w:rPr>
+              <w:t>4</w:t>
+            </w:r>
+          </w:p>
+        </w:tc>
+      </w:tr>
+      <w:tr>
+        <w:tc>
+          <w:tcPr>
+            <w:tcW w:type="dxa" w:w="1361"/>
+          </w:tcPr>
+          <w:p>
+            <w:r/>
+            <w:r>
+              <w:rPr>
+                <w:rFonts w:ascii="微軟正黑體" w:hAnsi="微軟正黑體" w:eastAsia="微軟正黑體"/>
+                <w:sz w:val="17"/>
+              </w:rPr>
+              <w:t>幸運兒</w:t>
+            </w:r>
+          </w:p>
+        </w:tc>
+        <w:tc>
+          <w:tcPr>
+            <w:tcW w:type="dxa" w:w="907"/>
+          </w:tcPr>
+          <w:p>
+            <w:r/>
+            <w:r>
+              <w:rPr>
+                <w:rFonts w:ascii="微軟正黑體" w:hAnsi="微軟正黑體" w:eastAsia="微軟正黑體"/>
+                <w:sz w:val="17"/>
+              </w:rPr>
+              <w:t>5.4</w:t>
+            </w:r>
+          </w:p>
+        </w:tc>
+        <w:tc>
+          <w:tcPr>
+            <w:tcW w:type="dxa" w:w="737"/>
+          </w:tcPr>
+          <w:p>
+            <w:r/>
+            <w:r>
+              <w:rPr>
+                <w:rFonts w:ascii="微軟正黑體" w:hAnsi="微軟正黑體" w:eastAsia="微軟正黑體"/>
+                <w:sz w:val="17"/>
+              </w:rPr>
+              <w:t>154</w:t>
+            </w:r>
+          </w:p>
+        </w:tc>
+        <w:tc>
+          <w:tcPr>
+            <w:tcW w:type="dxa" w:w="1134"/>
+          </w:tcPr>
+          <w:p>
+            <w:r/>
+            <w:r>
+              <w:rPr>
+                <w:rFonts w:ascii="微軟正黑體" w:hAnsi="微軟正黑體" w:eastAsia="微軟正黑體"/>
+                <w:sz w:val="17"/>
+              </w:rPr>
+              <w:t>0.37</w:t>
+            </w:r>
+          </w:p>
+        </w:tc>
+        <w:tc>
+          <w:tcPr>
+            <w:tcW w:type="dxa" w:w="850"/>
+          </w:tcPr>
+          <w:p>
+            <w:r/>
+            <w:r>
+              <w:rPr>
+                <w:rFonts w:ascii="微軟正黑體" w:hAnsi="微軟正黑體" w:eastAsia="微軟正黑體"/>
+                <w:sz w:val="17"/>
+              </w:rPr>
+              <w:t>12%</w:t>
+            </w:r>
+          </w:p>
+        </w:tc>
+        <w:tc>
+          <w:tcPr>
+            <w:tcW w:type="dxa" w:w="850"/>
+          </w:tcPr>
+          <w:p>
+            <w:r/>
+            <w:r>
+              <w:rPr>
+                <w:rFonts w:ascii="微軟正黑體" w:hAnsi="微軟正黑體" w:eastAsia="微軟正黑體"/>
+                <w:sz w:val="17"/>
+              </w:rPr>
+              <w:t>57</w:t>
+            </w:r>
+          </w:p>
+        </w:tc>
+        <w:tc>
+          <w:tcPr>
+            <w:tcW w:type="dxa" w:w="850"/>
+          </w:tcPr>
+          <w:p>
+            <w:r/>
+            <w:r>
+              <w:rPr>
+                <w:rFonts w:ascii="微軟正黑體" w:hAnsi="微軟正黑體" w:eastAsia="微軟正黑體"/>
+                <w:sz w:val="17"/>
+              </w:rPr>
+              <w:t>38%</w:t>
+            </w:r>
+          </w:p>
+        </w:tc>
+        <w:tc>
+          <w:tcPr>
+            <w:tcW w:type="dxa" w:w="794"/>
+          </w:tcPr>
+          <w:p>
+            <w:r/>
+            <w:r>
+              <w:rPr>
+                <w:rFonts w:ascii="微軟正黑體" w:hAnsi="微軟正黑體" w:eastAsia="微軟正黑體"/>
+                <w:sz w:val="17"/>
+              </w:rPr>
+              <w:t>16%</w:t>
+            </w:r>
+          </w:p>
+        </w:tc>
+        <w:tc>
+          <w:tcPr>
+            <w:tcW w:type="dxa" w:w="850"/>
+          </w:tcPr>
+          <w:p>
+            <w:r/>
+            <w:r>
+              <w:rPr>
+                <w:rFonts w:ascii="微軟正黑體" w:hAnsi="微軟正黑體" w:eastAsia="微軟正黑體"/>
+                <w:sz w:val="17"/>
+              </w:rPr>
+              <w:t>0.45</w:t>
+            </w:r>
+          </w:p>
+        </w:tc>
+        <w:tc>
+          <w:tcPr>
+            <w:tcW w:type="dxa" w:w="964"/>
+          </w:tcPr>
+          <w:p>
+            <w:r/>
+            <w:r>
+              <w:rPr>
+                <w:rFonts w:ascii="微軟正黑體" w:hAnsi="微軟正黑體" w:eastAsia="微軟正黑體"/>
+                <w:sz w:val="17"/>
+              </w:rPr>
+              <w:t>4.5</w:t>
+            </w:r>
+          </w:p>
+        </w:tc>
+      </w:tr>
+      <w:tr>
+        <w:tc>
+          <w:tcPr>
+            <w:tcW w:type="dxa" w:w="1361"/>
+          </w:tcPr>
+          <w:p>
+            <w:r/>
+            <w:r>
+              <w:rPr>
+                <w:rFonts w:ascii="微軟正黑體" w:hAnsi="微軟正黑體" w:eastAsia="微軟正黑體"/>
+                <w:sz w:val="17"/>
+              </w:rPr>
+              <w:t>庸才</w:t>
+            </w:r>
+          </w:p>
+        </w:tc>
+        <w:tc>
+          <w:tcPr>
+            <w:tcW w:type="dxa" w:w="907"/>
+          </w:tcPr>
+          <w:p>
+            <w:r/>
+            <w:r>
+              <w:rPr>
+                <w:rFonts w:ascii="微軟正黑體" w:hAnsi="微軟正黑體" w:eastAsia="微軟正黑體"/>
+                <w:sz w:val="17"/>
+              </w:rPr>
+              <w:t>5.15</w:t>
+            </w:r>
+          </w:p>
+        </w:tc>
+        <w:tc>
+          <w:tcPr>
+            <w:tcW w:type="dxa" w:w="737"/>
+          </w:tcPr>
+          <w:p>
+            <w:r/>
+            <w:r>
+              <w:rPr>
+                <w:rFonts w:ascii="微軟正黑體" w:hAnsi="微軟正黑體" w:eastAsia="微軟正黑體"/>
+                <w:sz w:val="17"/>
+              </w:rPr>
+              <w:t>172</w:t>
+            </w:r>
+          </w:p>
+        </w:tc>
+        <w:tc>
+          <w:tcPr>
+            <w:tcW w:type="dxa" w:w="1134"/>
+          </w:tcPr>
+          <w:p>
+            <w:r/>
+            <w:r>
+              <w:rPr>
+                <w:rFonts w:ascii="微軟正黑體" w:hAnsi="微軟正黑體" w:eastAsia="微軟正黑體"/>
+                <w:sz w:val="17"/>
+              </w:rPr>
+              <w:t>0.74</w:t>
+            </w:r>
+          </w:p>
+        </w:tc>
+        <w:tc>
+          <w:tcPr>
+            <w:tcW w:type="dxa" w:w="850"/>
+          </w:tcPr>
+          <w:p>
+            <w:r/>
+            <w:r>
+              <w:rPr>
+                <w:rFonts w:ascii="微軟正黑體" w:hAnsi="微軟正黑體" w:eastAsia="微軟正黑體"/>
+                <w:sz w:val="17"/>
+              </w:rPr>
+              <w:t>17%</w:t>
+            </w:r>
+          </w:p>
+        </w:tc>
+        <w:tc>
+          <w:tcPr>
+            <w:tcW w:type="dxa" w:w="850"/>
+          </w:tcPr>
+          <w:p>
+            <w:r/>
+            <w:r>
+              <w:rPr>
+                <w:rFonts w:ascii="微軟正黑體" w:hAnsi="微軟正黑體" w:eastAsia="微軟正黑體"/>
+                <w:sz w:val="17"/>
+              </w:rPr>
+              <w:t>62</w:t>
+            </w:r>
+          </w:p>
+        </w:tc>
+        <w:tc>
+          <w:tcPr>
+            <w:tcW w:type="dxa" w:w="850"/>
+          </w:tcPr>
+          <w:p>
+            <w:r/>
+            <w:r>
+              <w:rPr>
+                <w:rFonts w:ascii="微軟正黑體" w:hAnsi="微軟正黑體" w:eastAsia="微軟正黑體"/>
+                <w:sz w:val="17"/>
+              </w:rPr>
+              <w:t>46%</w:t>
+            </w:r>
+          </w:p>
+        </w:tc>
+        <w:tc>
+          <w:tcPr>
+            <w:tcW w:type="dxa" w:w="794"/>
+          </w:tcPr>
+          <w:p>
+            <w:r/>
+            <w:r>
+              <w:rPr>
+                <w:rFonts w:ascii="微軟正黑體" w:hAnsi="微軟正黑體" w:eastAsia="微軟正黑體"/>
+                <w:sz w:val="17"/>
+              </w:rPr>
+              <w:t>21%</w:t>
+            </w:r>
+          </w:p>
+        </w:tc>
+        <w:tc>
+          <w:tcPr>
+            <w:tcW w:type="dxa" w:w="850"/>
+          </w:tcPr>
+          <w:p>
+            <w:r/>
+            <w:r>
+              <w:rPr>
+                <w:rFonts w:ascii="微軟正黑體" w:hAnsi="微軟正黑體" w:eastAsia="微軟正黑體"/>
+                <w:sz w:val="17"/>
+              </w:rPr>
+              <w:t>0.26</w:t>
+            </w:r>
+          </w:p>
+        </w:tc>
+        <w:tc>
+          <w:tcPr>
+            <w:tcW w:type="dxa" w:w="964"/>
+          </w:tcPr>
+          <w:p>
+            <w:r/>
+            <w:r>
+              <w:rPr>
+                <w:rFonts w:ascii="微軟正黑體" w:hAnsi="微軟正黑體" w:eastAsia="微軟正黑體"/>
+                <w:sz w:val="17"/>
+              </w:rPr>
+              <w:t>3.8</w:t>
+            </w:r>
+          </w:p>
+        </w:tc>
+      </w:tr>
+      <w:tr>
+        <w:tc>
+          <w:tcPr>
+            <w:tcW w:type="dxa" w:w="1361"/>
+          </w:tcPr>
+          <w:p>
+            <w:r/>
+            <w:r>
+              <w:rPr>
+                <w:rFonts w:ascii="微軟正黑體" w:hAnsi="微軟正黑體" w:eastAsia="微軟正黑體"/>
+                <w:sz w:val="17"/>
+              </w:rPr>
+              <w:t>入殮師</w:t>
+            </w:r>
+          </w:p>
+        </w:tc>
+        <w:tc>
+          <w:tcPr>
+            <w:tcW w:type="dxa" w:w="907"/>
+          </w:tcPr>
+          <w:p>
+            <w:r/>
+            <w:r>
+              <w:rPr>
+                <w:rFonts w:ascii="微軟正黑體" w:hAnsi="微軟正黑體" w:eastAsia="微軟正黑體"/>
+                <w:sz w:val="17"/>
+              </w:rPr>
+              <w:t>5.0</w:t>
+            </w:r>
+          </w:p>
+        </w:tc>
+        <w:tc>
+          <w:tcPr>
+            <w:tcW w:type="dxa" w:w="737"/>
+          </w:tcPr>
+          <w:p>
+            <w:r/>
+            <w:r>
+              <w:rPr>
+                <w:rFonts w:ascii="微軟正黑體" w:hAnsi="微軟正黑體" w:eastAsia="微軟正黑體"/>
+                <w:sz w:val="17"/>
+              </w:rPr>
+              <w:t>168</w:t>
+            </w:r>
+          </w:p>
+        </w:tc>
+        <w:tc>
+          <w:tcPr>
+            <w:tcW w:type="dxa" w:w="1134"/>
+          </w:tcPr>
+          <w:p>
+            <w:r/>
+            <w:r>
+              <w:rPr>
+                <w:rFonts w:ascii="微軟正黑體" w:hAnsi="微軟正黑體" w:eastAsia="微軟正黑體"/>
+                <w:sz w:val="17"/>
+              </w:rPr>
+              <w:t>0.51</w:t>
+            </w:r>
+          </w:p>
+        </w:tc>
+        <w:tc>
+          <w:tcPr>
+            <w:tcW w:type="dxa" w:w="850"/>
+          </w:tcPr>
+          <w:p>
+            <w:r/>
+            <w:r>
+              <w:rPr>
+                <w:rFonts w:ascii="微軟正黑體" w:hAnsi="微軟正黑體" w:eastAsia="微軟正黑體"/>
+                <w:sz w:val="17"/>
+              </w:rPr>
+              <w:t>14%</w:t>
+            </w:r>
+          </w:p>
+        </w:tc>
+        <w:tc>
+          <w:tcPr>
+            <w:tcW w:type="dxa" w:w="850"/>
+          </w:tcPr>
+          <w:p>
+            <w:r/>
+            <w:r>
+              <w:rPr>
+                <w:rFonts w:ascii="微軟正黑體" w:hAnsi="微軟正黑體" w:eastAsia="微軟正黑體"/>
+                <w:sz w:val="17"/>
+              </w:rPr>
+              <w:t>59</w:t>
+            </w:r>
+          </w:p>
+        </w:tc>
+        <w:tc>
+          <w:tcPr>
+            <w:tcW w:type="dxa" w:w="850"/>
+          </w:tcPr>
+          <w:p>
+            <w:r/>
+            <w:r>
+              <w:rPr>
+                <w:rFonts w:ascii="微軟正黑體" w:hAnsi="微軟正黑體" w:eastAsia="微軟正黑體"/>
+                <w:sz w:val="17"/>
+              </w:rPr>
+              <w:t>43%</w:t>
+            </w:r>
+          </w:p>
+        </w:tc>
+        <w:tc>
+          <w:tcPr>
+            <w:tcW w:type="dxa" w:w="794"/>
+          </w:tcPr>
+          <w:p>
+            <w:r/>
+            <w:r>
+              <w:rPr>
+                <w:rFonts w:ascii="微軟正黑體" w:hAnsi="微軟正黑體" w:eastAsia="微軟正黑體"/>
+                <w:sz w:val="17"/>
+              </w:rPr>
+              <w:t>15%</w:t>
+            </w:r>
+          </w:p>
+        </w:tc>
+        <w:tc>
+          <w:tcPr>
+            <w:tcW w:type="dxa" w:w="850"/>
+          </w:tcPr>
+          <w:p>
+            <w:r/>
+            <w:r>
+              <w:rPr>
+                <w:rFonts w:ascii="微軟正黑體" w:hAnsi="微軟正黑體" w:eastAsia="微軟正黑體"/>
+                <w:sz w:val="17"/>
+              </w:rPr>
+              <w:t>0.48</w:t>
+            </w:r>
+          </w:p>
+        </w:tc>
+        <w:tc>
+          <w:tcPr>
+            <w:tcW w:type="dxa" w:w="964"/>
+          </w:tcPr>
+          <w:p>
+            <w:r/>
+            <w:r>
+              <w:rPr>
+                <w:rFonts w:ascii="微軟正黑體" w:hAnsi="微軟正黑體" w:eastAsia="微軟正黑體"/>
+                <w:sz w:val="17"/>
+              </w:rPr>
+              <w:t>4</w:t>
+            </w:r>
+          </w:p>
+        </w:tc>
+      </w:tr>
+      <w:tr>
+        <w:tc>
+          <w:tcPr>
+            <w:tcW w:type="dxa" w:w="1361"/>
+          </w:tcPr>
+          <w:p>
+            <w:r/>
+            <w:r>
+              <w:rPr>
+                <w:rFonts w:ascii="微軟正黑體" w:hAnsi="微軟正黑體" w:eastAsia="微軟正黑體"/>
+                <w:sz w:val="17"/>
+              </w:rPr>
+              <w:t>吸血鬼</w:t>
+            </w:r>
+          </w:p>
+        </w:tc>
+        <w:tc>
+          <w:tcPr>
+            <w:tcW w:type="dxa" w:w="907"/>
+          </w:tcPr>
+          <w:p>
+            <w:r/>
+            <w:r>
+              <w:rPr>
+                <w:rFonts w:ascii="微軟正黑體" w:hAnsi="微軟正黑體" w:eastAsia="微軟正黑體"/>
+                <w:sz w:val="17"/>
+              </w:rPr>
+              <w:t>4.85</w:t>
+            </w:r>
+          </w:p>
+        </w:tc>
+        <w:tc>
+          <w:tcPr>
+            <w:tcW w:type="dxa" w:w="737"/>
+          </w:tcPr>
+          <w:p>
+            <w:r/>
+            <w:r>
+              <w:rPr>
+                <w:rFonts w:ascii="微軟正黑體" w:hAnsi="微軟正黑體" w:eastAsia="微軟正黑體"/>
+                <w:sz w:val="17"/>
+              </w:rPr>
+              <w:t>167</w:t>
+            </w:r>
+          </w:p>
+        </w:tc>
+        <w:tc>
+          <w:tcPr>
+            <w:tcW w:type="dxa" w:w="1134"/>
+          </w:tcPr>
+          <w:p>
+            <w:r/>
+            <w:r>
+              <w:rPr>
+                <w:rFonts w:ascii="微軟正黑體" w:hAnsi="微軟正黑體" w:eastAsia="微軟正黑體"/>
+                <w:sz w:val="17"/>
+              </w:rPr>
+              <w:t>0.16</w:t>
+            </w:r>
+          </w:p>
+        </w:tc>
+        <w:tc>
+          <w:tcPr>
+            <w:tcW w:type="dxa" w:w="850"/>
+          </w:tcPr>
+          <w:p>
+            <w:r/>
+            <w:r>
+              <w:rPr>
+                <w:rFonts w:ascii="微軟正黑體" w:hAnsi="微軟正黑體" w:eastAsia="微軟正黑體"/>
+                <w:sz w:val="17"/>
+              </w:rPr>
+              <w:t>7%</w:t>
+            </w:r>
+          </w:p>
+        </w:tc>
+        <w:tc>
+          <w:tcPr>
+            <w:tcW w:type="dxa" w:w="850"/>
+          </w:tcPr>
+          <w:p>
+            <w:r/>
+            <w:r>
+              <w:rPr>
+                <w:rFonts w:ascii="微軟正黑體" w:hAnsi="微軟正黑體" w:eastAsia="微軟正黑體"/>
+                <w:sz w:val="17"/>
+              </w:rPr>
+              <w:t>57</w:t>
+            </w:r>
+          </w:p>
+        </w:tc>
+        <w:tc>
+          <w:tcPr>
+            <w:tcW w:type="dxa" w:w="850"/>
+          </w:tcPr>
+          <w:p>
+            <w:r/>
+            <w:r>
+              <w:rPr>
+                <w:rFonts w:ascii="微軟正黑體" w:hAnsi="微軟正黑體" w:eastAsia="微軟正黑體"/>
+                <w:sz w:val="17"/>
+              </w:rPr>
+              <w:t>46%</w:t>
+            </w:r>
+          </w:p>
+        </w:tc>
+        <w:tc>
+          <w:tcPr>
+            <w:tcW w:type="dxa" w:w="794"/>
+          </w:tcPr>
+          <w:p>
+            <w:r/>
+            <w:r>
+              <w:rPr>
+                <w:rFonts w:ascii="微軟正黑體" w:hAnsi="微軟正黑體" w:eastAsia="微軟正黑體"/>
+                <w:sz w:val="17"/>
+              </w:rPr>
+              <w:t>15%</w:t>
+            </w:r>
+          </w:p>
+        </w:tc>
+        <w:tc>
+          <w:tcPr>
+            <w:tcW w:type="dxa" w:w="850"/>
+          </w:tcPr>
+          <w:p>
+            <w:r/>
+            <w:r>
+              <w:rPr>
+                <w:rFonts w:ascii="微軟正黑體" w:hAnsi="微軟正黑體" w:eastAsia="微軟正黑體"/>
+                <w:sz w:val="17"/>
+              </w:rPr>
+              <w:t>0.23</w:t>
+            </w:r>
+          </w:p>
+        </w:tc>
+        <w:tc>
+          <w:tcPr>
+            <w:tcW w:type="dxa" w:w="964"/>
+          </w:tcPr>
+          <w:p>
+            <w:r/>
+            <w:r>
+              <w:rPr>
+                <w:rFonts w:ascii="微軟正黑體" w:hAnsi="微軟正黑體" w:eastAsia="微軟正黑體"/>
+                <w:sz w:val="17"/>
+              </w:rPr>
+              <w:t>4.2</w:t>
+            </w:r>
+          </w:p>
+        </w:tc>
+      </w:tr>
+      <w:tr>
+        <w:tc>
+          <w:tcPr>
+            <w:tcW w:type="dxa" w:w="1361"/>
+          </w:tcPr>
+          <w:p>
+            <w:r/>
+            <w:r>
+              <w:rPr>
+                <w:rFonts w:ascii="微軟正黑體" w:hAnsi="微軟正黑體" w:eastAsia="微軟正黑體"/>
+                <w:sz w:val="17"/>
+              </w:rPr>
+              <w:t>私家偵探</w:t>
+            </w:r>
+          </w:p>
+        </w:tc>
+        <w:tc>
+          <w:tcPr>
+            <w:tcW w:type="dxa" w:w="907"/>
+          </w:tcPr>
+          <w:p>
+            <w:r/>
+            <w:r>
+              <w:rPr>
+                <w:rFonts w:ascii="微軟正黑體" w:hAnsi="微軟正黑體" w:eastAsia="微軟正黑體"/>
+                <w:sz w:val="17"/>
+              </w:rPr>
+              <w:t>4.8</w:t>
+            </w:r>
+          </w:p>
+        </w:tc>
+        <w:tc>
+          <w:tcPr>
+            <w:tcW w:type="dxa" w:w="737"/>
+          </w:tcPr>
+          <w:p>
+            <w:r/>
+            <w:r>
+              <w:rPr>
+                <w:rFonts w:ascii="微軟正黑體" w:hAnsi="微軟正黑體" w:eastAsia="微軟正黑體"/>
+                <w:sz w:val="17"/>
+              </w:rPr>
+              <w:t>160</w:t>
+            </w:r>
+          </w:p>
+        </w:tc>
+        <w:tc>
+          <w:tcPr>
+            <w:tcW w:type="dxa" w:w="1134"/>
+          </w:tcPr>
+          <w:p>
+            <w:r/>
+            <w:r>
+              <w:rPr>
+                <w:rFonts w:ascii="微軟正黑體" w:hAnsi="微軟正黑體" w:eastAsia="微軟正黑體"/>
+                <w:sz w:val="17"/>
+              </w:rPr>
+              <w:t>0.28</w:t>
+            </w:r>
+          </w:p>
+        </w:tc>
+        <w:tc>
+          <w:tcPr>
+            <w:tcW w:type="dxa" w:w="850"/>
+          </w:tcPr>
+          <w:p>
+            <w:r/>
+            <w:r>
+              <w:rPr>
+                <w:rFonts w:ascii="微軟正黑體" w:hAnsi="微軟正黑體" w:eastAsia="微軟正黑體"/>
+                <w:sz w:val="17"/>
+              </w:rPr>
+              <w:t>11%</w:t>
+            </w:r>
+          </w:p>
+        </w:tc>
+        <w:tc>
+          <w:tcPr>
+            <w:tcW w:type="dxa" w:w="850"/>
+          </w:tcPr>
+          <w:p>
+            <w:r/>
+            <w:r>
+              <w:rPr>
+                <w:rFonts w:ascii="微軟正黑體" w:hAnsi="微軟正黑體" w:eastAsia="微軟正黑體"/>
+                <w:sz w:val="17"/>
+              </w:rPr>
+              <w:t>61</w:t>
+            </w:r>
+          </w:p>
+        </w:tc>
+        <w:tc>
+          <w:tcPr>
+            <w:tcW w:type="dxa" w:w="850"/>
+          </w:tcPr>
+          <w:p>
+            <w:r/>
+            <w:r>
+              <w:rPr>
+                <w:rFonts w:ascii="微軟正黑體" w:hAnsi="微軟正黑體" w:eastAsia="微軟正黑體"/>
+                <w:sz w:val="17"/>
+              </w:rPr>
+              <w:t>45%</w:t>
+            </w:r>
+          </w:p>
+        </w:tc>
+        <w:tc>
+          <w:tcPr>
+            <w:tcW w:type="dxa" w:w="794"/>
+          </w:tcPr>
+          <w:p>
+            <w:r/>
+            <w:r>
+              <w:rPr>
+                <w:rFonts w:ascii="微軟正黑體" w:hAnsi="微軟正黑體" w:eastAsia="微軟正黑體"/>
+                <w:sz w:val="17"/>
+              </w:rPr>
+              <w:t>19%</w:t>
+            </w:r>
+          </w:p>
+        </w:tc>
+        <w:tc>
+          <w:tcPr>
+            <w:tcW w:type="dxa" w:w="850"/>
+          </w:tcPr>
+          <w:p>
+            <w:r/>
+            <w:r>
+              <w:rPr>
+                <w:rFonts w:ascii="微軟正黑體" w:hAnsi="微軟正黑體" w:eastAsia="微軟正黑體"/>
+                <w:sz w:val="17"/>
+              </w:rPr>
+              <w:t>0.39</w:t>
+            </w:r>
+          </w:p>
+        </w:tc>
+        <w:tc>
+          <w:tcPr>
+            <w:tcW w:type="dxa" w:w="964"/>
+          </w:tcPr>
+          <w:p>
+            <w:r/>
+            <w:r>
+              <w:rPr>
+                <w:rFonts w:ascii="微軟正黑體" w:hAnsi="微軟正黑體" w:eastAsia="微軟正黑體"/>
+                <w:sz w:val="17"/>
+              </w:rPr>
+              <w:t>4</w:t>
+            </w:r>
+          </w:p>
+        </w:tc>
+      </w:tr>
+    </w:tbl>
+    <w:p/>
+    <w:p>
+      <w:r>
+        <w:rPr>
+          <w:rFonts w:ascii="微軟正黑體" w:hAnsi="微軟正黑體" w:eastAsia="微軟正黑體"/>
+          <w:b w:val="0"/>
+        </w:rPr>
+        <w:t>名次分＝(1−平均名次百分位)×100，50 為中間；本次 300 場的標準誤約 ±2~3 分，平均最終血量的 z 值為 ±2 以內時不宜解讀為差異。</w:t>
+      </w:r>
+    </w:p>
+    <w:p>
+      <w:pPr>
+        <w:pStyle w:val="Heading2"/>
+      </w:pPr>
+      <w:r>
+        <w:t>與規則評分對照的觀察</w:t>
+      </w:r>
+    </w:p>
+    <w:p>
+      <w:pPr>
+        <w:pStyle w:val="ListBullet"/>
+      </w:pPr>
+      <w:r>
+        <w:rPr>
+          <w:rFonts w:ascii="微軟正黑體" w:hAnsi="微軟正黑體" w:eastAsia="微軟正黑體"/>
+        </w:rPr>
+        <w:t>名次分最高：馴獸師（71）、庸才（62）、私家偵探（61）；最低：攀岩者（51）、基因怪人（54）。名次分的差距多半在標準誤範圍內，只有馴獸師的領先和攀岩者的墊底較明確。</w:t>
+      </w:r>
+    </w:p>
+    <w:p>
+      <w:pPr>
+        <w:pStyle w:val="ListBullet"/>
+      </w:pPr>
+      <w:r>
+        <w:rPr>
+          <w:rFonts w:ascii="微軟正黑體" w:hAnsi="微軟正黑體" w:eastAsia="微軟正黑體"/>
+        </w:rPr>
+        <w:t>馴獸師的模擬名次分明顯最高（71、冠軍率30%），和規則評分排在前段（6.35）一致，且模擬暗示他可能比評分更強：AI 會挑有水、糧、藥的房間派遣獵犬。</w:t>
+      </w:r>
+    </w:p>
+    <w:p>
+      <w:pPr>
+        <w:pStyle w:val="ListBullet"/>
+      </w:pPr>
+      <w:r>
+        <w:rPr>
+          <w:rFonts w:ascii="微軟正黑體" w:hAnsi="微軟正黑體" w:eastAsia="微軟正黑體"/>
+        </w:rPr>
+        <w:t>雇傭兵在規則評分最高（7.75），但模擬名次分只有58、存活率7%；他的平均擊殺（0.6）是全場最高，顯示持槍優勢有發揮（造成擊殺），但 AI 的整體生存很差。這個落差有可能是 AI 不會規劃補水糧與避毒（雇傭兵本身沒有生存手段），這是推測，沒有另外驗證。</w:t>
+      </w:r>
+    </w:p>
+    <w:p>
+      <w:pPr>
+        <w:pStyle w:val="ListBullet"/>
+      </w:pPr>
+      <w:r>
+        <w:rPr>
+          <w:rFonts w:ascii="微軟正黑體" w:hAnsi="微軟正黑體" w:eastAsia="微軟正黑體"/>
+        </w:rPr>
+        <w:t>橡膠人的模擬擊殺只有0.05、存活率8%：他無法持槍，AI 抽到槍會被替換成刀，對 AI 來說輸出偏低；他的抗槍減傷在 AI 局沒有轉成存活，模擬低估或高估多少無法判斷。</w:t>
+      </w:r>
+    </w:p>
+    <w:p>
+      <w:pPr>
+        <w:pStyle w:val="ListBullet"/>
+      </w:pPr>
+      <w:r>
+        <w:rPr>
+          <w:rFonts w:ascii="微軟正黑體" w:hAnsi="微軟正黑體" w:eastAsia="微軟正黑體"/>
+        </w:rPr>
+        <w:t>庸才平均最終血量最高（0.74，z=4.7，存活率17%）；工程師（0.55）、入殮師（0.51）次之。數值本身仍小於1（多數人死亡），需配合存活率一起看；庸才的斷尾求生是少數 AI 會使用、且能直接回血的技能。</w:t>
+      </w:r>
+    </w:p>
+    <w:p>
+      <w:pPr>
+        <w:pStyle w:val="ListBullet"/>
+      </w:pPr>
+      <w:r>
+        <w:rPr>
+          <w:rFonts w:ascii="微軟正黑體" w:hAnsi="微軟正黑體" w:eastAsia="微軟正黑體"/>
+        </w:rPr>
+        <w:t>還魂師的模擬結果偏低（存活率7%、名次分55、平均最終血量0.21）。AI 的暗影只會隨機走到步數內的房間（偏好功能房間），不會刻意找活人，所以臨終祝禱的復活條件在 AI 局很難達成；真人暗影可以判斷哪個房間有人，這個結果低估了真人的表現（推測，未驗證）。</w:t>
+      </w:r>
+    </w:p>
+    <w:p>
+      <w:pPr>
+        <w:pStyle w:val="ListBullet"/>
+      </w:pPr>
+      <w:r>
+        <w:rPr>
+          <w:rFonts w:ascii="微軟正黑體" w:hAnsi="微軟正黑體" w:eastAsia="微軟正黑體"/>
+        </w:rPr>
+        <w:t>私家偵探的模擬名次分（61）高於規則評分（4.8）的位置，但 AI 不需要靠聊天判斷目標位置、也沒有被誤導的問題，不能直接代表真人局。</w:t>
+      </w:r>
+    </w:p>
+    <w:p>
+      <w:pPr>
+        <w:pStyle w:val="ListBullet"/>
+      </w:pPr>
+      <w:r>
+        <w:rPr>
+          <w:rFonts w:ascii="微軟正黑體" w:hAnsi="微軟正黑體" w:eastAsia="微軟正黑體"/>
+        </w:rPr>
+        <w:t>飲品師與基因怪人在模擬中的結果不能代表真人，因為 AI 不會使用他們的核心技能。</w:t>
       </w:r>
     </w:p>
     <w:sectPr>

</xml_diff>

<commit_message>
Polish skill descriptions of the 16 physical-mode professions; 入殮師 亡者遺贈 now decided at the moment of death
Co-Authored-By: Claude Sonnet 5.5 <noreply@anthropic.com>
</commit_message>
<xml_diff>
--- a/禁閉逃殺_實體模式16職業強度分析.docx
+++ b/禁閉逃殺_實體模式16職業強度分析.docx
@@ -3014,7 +3014,7 @@
                 <w:rFonts w:ascii="微軟正黑體" w:hAnsi="微軟正黑體" w:eastAsia="微軟正黑體"/>
                 <w:sz w:val="18"/>
               </w:rPr>
-              <w:t>你的果汁(酒)不佔負重，並初始擁有酒窖的2張果汁。使用前可剔除四種效果（也可以不剔除；要剔除就必須剔除剛好四種），再隨機抽取。</w:t>
+              <w:t>你的果汁(酒)不佔負重，開局先拿走酒窖的2瓶。使用酒前可選擇剔除剛好四種結果（也可不剔除），再從剩下的結果中隨機抽取。</w:t>
             </w:r>
           </w:p>
         </w:tc>
@@ -3061,7 +3061,7 @@
                 <w:rFonts w:ascii="微軟正黑體" w:hAnsi="微軟正黑體" w:eastAsia="微軟正黑體"/>
                 <w:sz w:val="18"/>
               </w:rPr>
-              <w:t>道具使用階段，你的果汁可對其他存活玩家使用（同樣可先剔除四種效果，也可不剔除）；其他玩家也可把酒交給你，請你代為調製。</w:t>
+              <w:t>道具使用階段，你可請同房的存活玩家喝你的果汁（同樣可剔除四種結果或不剔除）；其他玩家也可把酒交給你，請你代為調製。</w:t>
             </w:r>
           </w:p>
         </w:tc>
@@ -3409,7 +3409,7 @@
                 <w:rFonts w:ascii="微軟正黑體" w:hAnsi="微軟正黑體" w:eastAsia="微軟正黑體"/>
                 <w:sz w:val="18"/>
               </w:rPr>
-              <w:t>手持刀時，武力額外+2；刀不佔負重。</w:t>
+              <w:t>背包內有刀時，武力額外+2（只加一次）；刀不佔負重。</w:t>
             </w:r>
           </w:p>
         </w:tc>
@@ -3456,7 +3456,7 @@
                 <w:rFonts w:ascii="微軟正黑體" w:hAnsi="微軟正黑體" w:eastAsia="微軟正黑體"/>
                 <w:sz w:val="18"/>
               </w:rPr>
-              <w:t>擊殺其他玩家後，恢復2點生命。</w:t>
+              <w:t>在戰鬥中擊殺其他玩家後，恢復2點生命。</w:t>
             </w:r>
           </w:p>
         </w:tc>
@@ -3771,7 +3771,7 @@
                 <w:rFonts w:ascii="微軟正黑體" w:hAnsi="微軟正黑體" w:eastAsia="微軟正黑體"/>
                 <w:sz w:val="18"/>
               </w:rPr>
-              <w:t>武力與負重永久+1。須在行動結束後才能使用（所在房間無功能可做時不受限）：指定距離5以內有庫存的房間，派遣獵犬隨機抽1張道具（不可超過負重）；獵犬帶回的道具要到結算階段才能使用。整局限用4次。</w:t>
+              <w:t>武力與負重永久+1。（主動，整局限用4次）須在房間行動結束後才能使用（所在房間無功能可用時不受限）：指定距離5步以內、尚有庫存的房間，派遣獵犬隨機抽取1張道具（不可超過負重）。獵犬帶回的道具要到結算階段才能使用。</w:t>
             </w:r>
           </w:p>
         </w:tc>
@@ -4097,7 +4097,7 @@
                 <w:rFonts w:ascii="微軟正黑體" w:hAnsi="微軟正黑體" w:eastAsia="微軟正黑體"/>
                 <w:sz w:val="18"/>
               </w:rPr>
-              <w:t>發動後，本回合可直接上下移動樓層（仍消耗步數）。</w:t>
+              <w:t>發動後，本回合可直接移動到正上方或正下方一層、位置重疊的房間，每次消耗1步；與節食同一輪只能擇一發動。</w:t>
             </w:r>
           </w:p>
         </w:tc>
@@ -4144,7 +4144,7 @@
                 <w:rFonts w:ascii="微軟正黑體" w:hAnsi="微軟正黑體" w:eastAsia="微軟正黑體"/>
                 <w:sz w:val="18"/>
               </w:rPr>
-              <w:t>整局限用1次：本回合不需支付水/糧。</w:t>
+              <w:t>（主動，整局限用1次）本回合不需支付水與糧。</w:t>
             </w:r>
           </w:p>
         </w:tc>
@@ -4448,7 +4448,7 @@
                 <w:rFonts w:ascii="微軟正黑體" w:hAnsi="微軟正黑體" w:eastAsia="微軟正黑體"/>
                 <w:sz w:val="18"/>
               </w:rPr>
-              <w:t>不需持有循環回收裝置卡，每輪可直接使用1次回收功能，從棄牌堆取得1張道具。</w:t>
+              <w:t>不需持有循環回收裝置卡，每輪可直接使用1次回收功能：從棄牌堆隨機取得1張道具（需有背包空位；垃圾不會被回收）。</w:t>
             </w:r>
           </w:p>
         </w:tc>
@@ -4785,7 +4785,7 @@
                 <w:rFonts w:ascii="微軟正黑體" w:hAnsi="微軟正黑體" w:eastAsia="微軟正黑體"/>
                 <w:sz w:val="18"/>
               </w:rPr>
-              <w:t>槍械傷害永久-4；但你無法持有槍（手槍／霰彈槍）：抽到槍時放回房間，並補抽一張（不可獲得槍）。</w:t>
+              <w:t>受到持槍對手的戰鬥傷害時，傷害永久-4；但你無法持有槍（手槍／霰彈槍）：抽到槍時放回房間，並補抽一張（不會抽到槍）。</w:t>
             </w:r>
           </w:p>
         </w:tc>
@@ -4832,7 +4832,7 @@
                 <w:rFonts w:ascii="微軟正黑體" w:hAnsi="微軟正黑體" w:eastAsia="微軟正黑體"/>
                 <w:sz w:val="18"/>
               </w:rPr>
-              <w:t>無視火箭筒傷害。</w:t>
+              <w:t>不受火箭筒傷害。</w:t>
             </w:r>
           </w:p>
         </w:tc>
@@ -5136,7 +5136,7 @@
                 <w:rFonts w:ascii="微軟正黑體" w:hAnsi="微軟正黑體" w:eastAsia="微軟正黑體"/>
                 <w:sz w:val="18"/>
               </w:rPr>
-              <w:t>初始可分配基因點數12點，武力上限5點。</w:t>
+              <w:t>開局可分配12點基因點數（一般玩家10點），武力上限5點。</w:t>
             </w:r>
           </w:p>
         </w:tc>
@@ -5183,7 +5183,7 @@
                 <w:rFonts w:ascii="微軟正黑體" w:hAnsi="微軟正黑體" w:eastAsia="微軟正黑體"/>
                 <w:sz w:val="18"/>
               </w:rPr>
-              <w:t>技能使用階段可重新分配點數。整局限用2次。</w:t>
+              <w:t>（主動，整局限用2次）技能使用階段可重新分配目前的全部點數（武力上限5點）。</w:t>
             </w:r>
           </w:p>
         </w:tc>
@@ -5476,7 +5476,7 @@
                 <w:rFonts w:ascii="微軟正黑體" w:hAnsi="微軟正黑體" w:eastAsia="微軟正黑體"/>
                 <w:sz w:val="18"/>
               </w:rPr>
-              <w:t>垃圾不佔負重；在房間抽取物品時，50%機率額外獲得1個垃圾（由垃圾場扣除）。</w:t>
+              <w:t>垃圾不佔負重；在房間每抽到1件物品，有50%機率額外獲得1個垃圾（由垃圾場庫存扣除）。</w:t>
             </w:r>
           </w:p>
         </w:tc>
@@ -5523,7 +5523,7 @@
                 <w:rFonts w:ascii="微軟正黑體" w:hAnsi="微軟正黑體" w:eastAsia="微軟正黑體"/>
                 <w:sz w:val="18"/>
               </w:rPr>
-              <w:t>行動階段可使用：將背包內任意數量（自選）的垃圾隨機轉為水或糧。整局限用2次。</w:t>
+              <w:t>（主動，整局限用2次）行動階段可使用：選擇背包內任意數量的垃圾，每個隨機轉為1份水或1份糧（需有背包空位）。</w:t>
             </w:r>
           </w:p>
         </w:tc>
@@ -5849,7 +5849,7 @@
                 <w:rFonts w:ascii="微軟正黑體" w:hAnsi="微軟正黑體" w:eastAsia="微軟正黑體"/>
                 <w:sz w:val="18"/>
               </w:rPr>
-              <w:t>死亡成為暗影時，吸血所需總量降為1點即可復活（整局可發動兩次，復活後血量為3）。</w:t>
+              <w:t>死亡變成暗影後，只要吸取1點生命就能復活（一般暗影需2點）；整局可發動兩次，復活後生命為3。</w:t>
             </w:r>
           </w:p>
         </w:tc>
@@ -5896,7 +5896,7 @@
                 <w:rFonts w:ascii="微軟正黑體" w:hAnsi="微軟正黑體" w:eastAsia="微軟正黑體"/>
                 <w:sz w:val="18"/>
               </w:rPr>
-              <w:t>復活後速度永久+1。</w:t>
+              <w:t>每次復活後，速度永久+1。</w:t>
             </w:r>
           </w:p>
         </w:tc>
@@ -6244,7 +6244,7 @@
                 <w:rFonts w:ascii="微軟正黑體" w:hAnsi="微軟正黑體" w:eastAsia="微軟正黑體"/>
                 <w:sz w:val="18"/>
               </w:rPr>
-              <w:t>抽取道具時多看1張，選1張放回房間（實際獲得數量不變）。</w:t>
+              <w:t>搜索抽取道具時多抽1張，再自選1張放回房間；實際獲得的數量不變。</w:t>
             </w:r>
           </w:p>
         </w:tc>
@@ -6291,7 +6291,7 @@
                 <w:rFonts w:ascii="微軟正黑體" w:hAnsi="微軟正黑體" w:eastAsia="微軟正黑體"/>
                 <w:sz w:val="18"/>
               </w:rPr>
-              <w:t>可消耗1步直接跳到下一層樓（只能往下）。整局限用3次，用完後速度永久-2。</w:t>
+              <w:t>（主動，整局限用3次）消耗1步，直接跳到下一層樓的任一房間（只能往下，須在確定停留前使用）；用完第3次後，速度永久-2。</w:t>
             </w:r>
           </w:p>
         </w:tc>
@@ -6595,7 +6595,7 @@
                 <w:rFonts w:ascii="微軟正黑體" w:hAnsi="微軟正黑體" w:eastAsia="微軟正黑體"/>
                 <w:sz w:val="18"/>
               </w:rPr>
-              <w:t>每輪輪到自己行動時，先自動擲骰：擲到1：本回合免疫所有傷害（戰鬥、毒氣、火箭筒等；飢餓仍需繳交水/糧，暗影吸血也擋不住），且本回合在房間抽取道具時多抽1張；擲到4：本回合可以多移動兩步，且本回合在房間抽取道具時多抽1張；擲到6：立即恢復2點生命（不超過上限）；擲到2可重擲（見幸運重擲）；擲到3、5沒有效果。</w:t>
+              <w:t>每輪輪到自己行動時，先自動擲骰：擲到1：本回合免疫所有傷害（戰鬥、毒氣、火箭筒等；飢餓與暗影吸血除外），且房間搜索多抽1張；擲到4：本回合可多移動兩步，且房間搜索多抽1張；擲到6：立即恢復2點生命（不超過上限）；擲到2：重擲（見幸運重擲）；擲到3、5：沒有效果。</w:t>
             </w:r>
           </w:p>
         </w:tc>
@@ -6642,7 +6642,7 @@
                 <w:rFonts w:ascii="微軟正黑體" w:hAnsi="微軟正黑體" w:eastAsia="微軟正黑體"/>
                 <w:sz w:val="18"/>
               </w:rPr>
-              <w:t>吉星高照的骰子擲到2時，可以重擲，次數不限，以最後一次的結果為準。</w:t>
+              <w:t>吉星高照擲到2時，可以重擲，次數不限，以最後一次的結果為準。</w:t>
             </w:r>
           </w:p>
         </w:tc>
@@ -6968,7 +6968,7 @@
                 <w:rFonts w:ascii="微軟正黑體" w:hAnsi="微軟正黑體" w:eastAsia="微軟正黑體"/>
                 <w:sz w:val="18"/>
               </w:rPr>
-              <w:t>被火箭筒擊中時，最終傷害+1。</w:t>
+              <w:t>被火箭筒擊中時，傷害+1（共5點）。</w:t>
             </w:r>
           </w:p>
         </w:tc>
@@ -7015,7 +7015,7 @@
                 <w:rFonts w:ascii="微軟正黑體" w:hAnsi="微軟正黑體" w:eastAsia="微軟正黑體"/>
                 <w:sz w:val="18"/>
               </w:rPr>
-              <w:t>整局限用3次：丟棄背包中1張道具，恢復2點生命。</w:t>
+              <w:t>（主動，整局限用3次）丟棄背包中1張道具，立即恢復2點生命（不超過上限）。</w:t>
             </w:r>
           </w:p>
         </w:tc>
@@ -7062,7 +7062,7 @@
                 <w:rFonts w:ascii="微軟正黑體" w:hAnsi="微軟正黑體" w:eastAsia="微軟正黑體"/>
                 <w:sz w:val="18"/>
               </w:rPr>
-              <w:t>行動階段可使用：花1點生命，二選一：本輪負重+1，或本輪多1次抽卡機會（僅限本輪）。</w:t>
+              <w:t>行動階段可使用（生命需大於1）：花1點生命，二選一：本輪負重+1，或本輪搜索時多抽1張（僅限本輪）。</w:t>
             </w:r>
           </w:p>
         </w:tc>
@@ -7366,7 +7366,7 @@
                 <w:rFonts w:ascii="微軟正黑體" w:hAnsi="微軟正黑體" w:eastAsia="微軟正黑體"/>
                 <w:sz w:val="18"/>
               </w:rPr>
-              <w:t>每當有玩家變成暗影，你的負重永久+1。每位玩家死亡，其道具放入停屍間前，你都可隨機取走1張（不限每輪次數）；同一輪多人死亡，就從每位死者身上各取1張，負重也各+1。</w:t>
+              <w:t>每當有玩家死亡變成暗影，你的負重永久+1，並在其道具放入停屍間前，隨機取走其中1張（不限每輪次數）。同一輪多人死亡時逐一處理：每位死者各取1張、負重各+1。</w:t>
             </w:r>
           </w:p>
         </w:tc>
@@ -7413,7 +7413,7 @@
                 <w:rFonts w:ascii="微軟正黑體" w:hAnsi="微軟正黑體" w:eastAsia="微軟正黑體"/>
                 <w:sz w:val="18"/>
               </w:rPr>
-              <w:t>整局限用1次：道具放入停屍間前，可放棄隨機取得，改為自行指定1張。</w:t>
+              <w:t>（主動，整局限用1次）有道具的死者，在其道具放入停屍間前，可以啟動，隨機取得道具改為自行選擇一張。</w:t>
             </w:r>
           </w:p>
         </w:tc>
@@ -7447,7 +7447,7 @@
         <w:rPr>
           <w:rFonts w:ascii="微軟正黑體" w:hAnsi="微軟正黑體" w:eastAsia="微軟正黑體"/>
         </w:rPr>
-        <w:t>亡者遺贈需「事先」用一次主動技能啟動（占用當輪額度），之後第一個「有道具」的死者，他可改為自行指定1張；死者是空背包不會消耗。</w:t>
+        <w:t>亡者遺贈：死者有道具時，在其道具放入停屍間前，你可以選擇啟動（整局限1次），把隨機取得改為自行選擇其中1張；不啟動則照蠱耗感應隨機取得1張。這是死亡當下才決定，不需事先占用主動技能額度；同一輪多人死亡時，逐一詢問。</w:t>
       </w:r>
     </w:p>
     <w:p>
@@ -7591,7 +7591,7 @@
         <w:rPr>
           <w:rFonts w:ascii="微軟正黑體" w:hAnsi="微軟正黑體" w:eastAsia="微軟正黑體"/>
         </w:rPr>
-        <w:t>配點建議：武力2／速度4／負重4。第1~3輪以生存與補給為主；第4輪起靠近高風險房間；亡者遺贈留給持槍或持有多張藥片的死者；第6輪若有死者持有金條，用亡者遺贈指定金條最有價值（期末換血）。</w:t>
+        <w:t>配點建議：武力2／速度4／負重4。第1~3輪以生存與補給為主；第4輪起靠近高風險房間；亡者遺贈留給持槍或持有多張藥片的死者；第6輪若有死者持有金條，用亡者遺贈指定金條最有價值（期末換血）；死亡當下才決定要不要啟動，不用事先準備。</w:t>
       </w:r>
     </w:p>
     <w:p>
@@ -7728,7 +7728,7 @@
                 <w:rFonts w:ascii="微軟正黑體" w:hAnsi="微軟正黑體" w:eastAsia="微軟正黑體"/>
                 <w:sz w:val="18"/>
               </w:rPr>
-              <w:t>戰鬥中對其他玩家造成傷害時，恢復傷害值一半（無條件捨去）的生命，每輪最多2點。</w:t>
+              <w:t>戰鬥中對其他玩家造成傷害時，回復該傷害一半（捨去小數）的生命；每輪最多回復2點。</w:t>
             </w:r>
           </w:p>
         </w:tc>
@@ -7775,7 +7775,7 @@
                 <w:rFonts w:ascii="微軟正黑體" w:hAnsi="微軟正黑體" w:eastAsia="微軟正黑體"/>
                 <w:sz w:val="18"/>
               </w:rPr>
-              <w:t>結算時若停留在頂樓房間（基因庫／停機坪），生命-2。</w:t>
+              <w:t>結算時若停留在頂樓房間（基因庫、停機坪），生命-2。</w:t>
             </w:r>
           </w:p>
         </w:tc>
@@ -8079,7 +8079,7 @@
                 <w:rFonts w:ascii="微軟正黑體" w:hAnsi="微軟正黑體" w:eastAsia="微軟正黑體"/>
                 <w:sz w:val="18"/>
               </w:rPr>
-              <w:t>行動階段可放棄移動，指定1名行動順序比你靠前的存活玩家：你直接移動到其所在的房間，並可執行該房間的行動。整局限用3次，同一名玩家最多被跟蹤1次。</w:t>
+              <w:t>（主動，整局限用3次）移動前使用，放棄本輪移動：指定1名行動順序比你靠前的存活玩家，你直接移動到他所在的房間（不花步數，事先無法得知他在哪），並可執行該房間的行動。同一名玩家最多被跟蹤1次。</w:t>
             </w:r>
           </w:p>
         </w:tc>

</xml_diff>